<commit_message>
docs: deck rebuilt around the marking scheme, citation fix, project brief
The mid-term deck was a pitch deck for a review marked on literature (10),
gap (5), problem/objectives (5) and methodology (5). Rebuilt as three
literature-survey tables ending in a "limitation for our problem" column,
a comparison matrix, a gap -> evidence -> objective table, two methodology
slides including a dataset table, evaluation, and references. Presentation
script rewritten to match.

Fixes a misattribution in the synopsis: Pillai & Nair (2010) reports 2-6x
catch and 2-7x monetary benefit inside PFZ zones over 2006-2010; the
time-lag finding came from a different study and has been removed.

Adds a two-page plain-language project brief.

Deck passes validate.py but still needs a rendered visual check: PowerPoint
and Word are running unactivated and refuse COM automation.

Co-Authored-By: Claude Opus 5.5 <noreply@anthropic.com>
</commit_message>
<xml_diff>
--- a/docs/Sagar_Setu_Presentation_Script.docx
+++ b/docs/Sagar_Setu_Presentation_Script.docx
@@ -30,7 +30,7 @@
           <w:sz w:val="23"/>
           <w:szCs w:val="23"/>
         </w:rPr>
-        <w:t xml:space="preserve">Mid-term review  ·  13 October 2026  ·  10 slides  ·  ≈ 13 minutes</w:t>
+        <w:t xml:space="preserve">Mid-term review  ·  13 October 2026  ·  11 slides  ·  ≈ 13 minutes</w:t>
       </w:r>
     </w:p>
     <w:p>
@@ -78,7 +78,7 @@
           <w:sz w:val="22"/>
           <w:szCs w:val="22"/>
         </w:rPr>
-        <w:t xml:space="preserve">Open the deck in Presenter View — the speaker notes on every slide are a condensed version of this script.</w:t>
+        <w:t xml:space="preserve">Open the deck in Presenter View — every slide has speaker notes that condense this script.</w:t>
       </w:r>
     </w:p>
     <w:p>
@@ -98,7 +98,7 @@
           <w:sz w:val="22"/>
           <w:szCs w:val="22"/>
         </w:rPr>
-        <w:t xml:space="preserve">Have the web interface already running and a Tamil question already answered in a second tab, in case she asks to see it live. Do not start it cold in the room.</w:t>
+        <w:t xml:space="preserve">Have the web interface already running with a Tamil question already answered in a second tab, in case she asks to see it. Do not start it cold in the room.</w:t>
       </w:r>
     </w:p>
     <w:p>
@@ -118,7 +118,7 @@
           <w:sz w:val="22"/>
           <w:szCs w:val="22"/>
         </w:rPr>
-        <w:t xml:space="preserve">Have the synopsis open at the comparison table (Section 2.11) — that is the page she is most likely to want to look at.</w:t>
+        <w:t xml:space="preserve">Have the synopsis open at Section 2.11, the comparison table — the page she is most likely to ask about.</w:t>
       </w:r>
     </w:p>
     <w:p>
@@ -138,7 +138,7 @@
           <w:sz w:val="22"/>
           <w:szCs w:val="22"/>
         </w:rPr>
-        <w:t xml:space="preserve">If the wifi is unreliable, say so at the start and demo from the frozen snapshot. The system is built to do that. Degrading loudly is part of the design, not an excuse.</w:t>
+        <w:t xml:space="preserve">On the three literature slides, do not read the tables. Read the study name, one finding, then the red column. The red column is the point.</w:t>
       </w:r>
     </w:p>
     <w:p>
@@ -158,7 +158,7 @@
           <w:sz w:val="22"/>
           <w:szCs w:val="22"/>
         </w:rPr>
-        <w:t xml:space="preserve">Print this script. Do not read it word for word — read it twice tonight, then speak from the bold lines.</w:t>
+        <w:t xml:space="preserve">Print this script. Read it twice tonight, then speak from the bold lines.</w:t>
       </w:r>
     </w:p>
     <w:p>
@@ -189,7 +189,7 @@
           <w:sz w:val="22"/>
           <w:szCs w:val="22"/>
         </w:rPr>
-        <w:t xml:space="preserve">Four of six phases are done. It works today — a Tamil question answers in about eight seconds.</w:t>
+        <w:t xml:space="preserve">The talk follows the marking scheme: problem → literature survey → research gap → objectives → methodology.</w:t>
       </w:r>
     </w:p>
     <w:p>
@@ -209,7 +209,7 @@
           <w:sz w:val="22"/>
           <w:szCs w:val="22"/>
         </w:rPr>
-        <w:t xml:space="preserve">93.9 % hit rate, 3.1 % false alarms. It never said “go” on a dangerous morning.</w:t>
+        <w:t xml:space="preserve">The gap comes out of the literature: every survey row ends in a red “limitation for our problem”, and those limitations become G1–G6.</w:t>
       </w:r>
     </w:p>
     <w:p>
@@ -229,7 +229,7 @@
           <w:sz w:val="22"/>
           <w:szCs w:val="22"/>
         </w:rPr>
-        <w:t xml:space="preserve">The AI never decides safety. That is the research contribution, and the literature supports it.</w:t>
+        <w:t xml:space="preserve">The AI never decides safety. ClimSight's own finding — deterministic computation beats generation — supports that design.</w:t>
       </w:r>
     </w:p>
     <w:p>
@@ -249,7 +249,7 @@
           <w:sz w:val="22"/>
           <w:szCs w:val="22"/>
         </w:rPr>
-        <w:t xml:space="preserve">Three specific asks. Lead with the IMD letter.</w:t>
+        <w:t xml:space="preserve">93.9 % hit rate, 3.1 % false alarms, no dangerous morning ever graded “go”. Then the asks — lead with the IMD letter.</w:t>
       </w:r>
     </w:p>
     <w:p>
@@ -279,10 +279,10 @@
           <w:b/>
           <w:bCs/>
           <w:color w:val="FFFFFF"/>
-          <w:sz w:val="24"/>
-          <w:szCs w:val="24"/>
-        </w:rPr>
-        <w:t xml:space="preserve">  SLIDE 1  —  Title — Sagar Setu</w:t>
+          <w:sz w:val="23"/>
+          <w:szCs w:val="23"/>
+        </w:rPr>
+        <w:t xml:space="preserve">  SLIDE 1  —  Title</w:t>
       </w:r>
       <w:r>
         <w:rPr>
@@ -293,7 +293,7 @@
           <w:sz w:val="22"/>
           <w:szCs w:val="22"/>
         </w:rPr>
-        <w:t xml:space="preserve">          0:30  </w:t>
+        <w:t xml:space="preserve">        0:30  </w:t>
       </w:r>
     </w:p>
     <w:p>
@@ -308,7 +308,7 @@
           <w:sz w:val="23"/>
           <w:szCs w:val="23"/>
         </w:rPr>
-        <w:t xml:space="preserve">Good afternoon. My project is called </w:t>
+        <w:t xml:space="preserve">Good afternoon. My project is </w:t>
       </w:r>
       <w:r>
         <w:rPr>
@@ -328,7 +328,7 @@
           <w:sz w:val="23"/>
           <w:szCs w:val="23"/>
         </w:rPr>
-        <w:t xml:space="preserve"> — it means “bridge to the sea”.</w:t>
+        <w:t xml:space="preserve"> — “bridge to the sea” — a decision-support system for India's small-craft fishermen.</w:t>
       </w:r>
     </w:p>
     <w:p>
@@ -343,7 +343,17 @@
           <w:sz w:val="23"/>
           <w:szCs w:val="23"/>
         </w:rPr>
-        <w:t xml:space="preserve">It is a decision-support system for India's small-craft fishermen.</w:t>
+        <w:t xml:space="preserve">In one sentence: </w:t>
+      </w:r>
+      <w:r>
+        <w:rPr>
+          <w:rFonts w:ascii="Calibri" w:cs="Calibri" w:eastAsia="Calibri" w:hAnsi="Calibri"/>
+          <w:b/>
+          <w:bCs/>
+          <w:sz w:val="23"/>
+          <w:szCs w:val="23"/>
+        </w:rPr>
+        <w:t xml:space="preserve">a fisherman asks a question in his own language and gets back a safety decision built from official government data — where the AI explains the decision but never makes it.</w:t>
       </w:r>
     </w:p>
     <w:p>
@@ -358,32 +368,7 @@
           <w:sz w:val="23"/>
           <w:szCs w:val="23"/>
         </w:rPr>
-        <w:t xml:space="preserve">The one-sentence version: </w:t>
-      </w:r>
-      <w:r>
-        <w:rPr>
-          <w:rFonts w:ascii="Calibri" w:cs="Calibri" w:eastAsia="Calibri" w:hAnsi="Calibri"/>
-          <w:b/>
-          <w:bCs/>
-          <w:sz w:val="23"/>
-          <w:szCs w:val="23"/>
-        </w:rPr>
-        <w:t xml:space="preserve">a fisherman asks a question in his own language, and gets back a safety decision built from official government data — where the AI explains the decision but never makes it.</w:t>
-      </w:r>
-    </w:p>
-    <w:p>
-      <w:pPr>
-        <w:spacing w:after="140" w:line="300"/>
-      </w:pPr>
-      <w:r>
-        <w:rPr>
-          <w:rFonts w:ascii="Calibri" w:cs="Calibri" w:eastAsia="Calibri" w:hAnsi="Calibri"/>
-          <w:b w:val="false"/>
-          <w:bCs w:val="false"/>
-          <w:sz w:val="23"/>
-          <w:szCs w:val="23"/>
-        </w:rPr>
-        <w:t xml:space="preserve">That last part is the research contribution, and I will keep coming back to it.</w:t>
+        <w:t xml:space="preserve">I will follow the review structure: the problem, the literature survey, the research gap and objectives, and the proposed methodology.</w:t>
       </w:r>
     </w:p>
     <w:p>
@@ -403,7 +388,7 @@
           <w:sz w:val="20"/>
           <w:szCs w:val="20"/>
         </w:rPr>
-        <w:t xml:space="preserve">Do not read the subtitle aloud. Let the three coloured pills — GO, CAUTION, DO NOT SAIL — sit on screen while you say the one-sentence version.</w:t>
+        <w:t xml:space="preserve">Do not read the subtitle. Let the three coloured pills sit on screen while you say the one-sentence version.</w:t>
       </w:r>
     </w:p>
     <w:p>
@@ -430,7 +415,7 @@
           <w:sz w:val="21"/>
           <w:szCs w:val="21"/>
         </w:rPr>
-        <w:t xml:space="preserve">“Let me start with the person this is for.”</w:t>
+        <w:t xml:space="preserve">“Let me start with the problem.”</w:t>
       </w:r>
     </w:p>
     <w:p>
@@ -444,10 +429,10 @@
           <w:b/>
           <w:bCs/>
           <w:color w:val="FFFFFF"/>
-          <w:sz w:val="24"/>
-          <w:szCs w:val="24"/>
-        </w:rPr>
-        <w:t xml:space="preserve">  SLIDE 2  —  One decision, made in the dark</w:t>
+          <w:sz w:val="23"/>
+          <w:szCs w:val="23"/>
+        </w:rPr>
+        <w:t xml:space="preserve">  SLIDE 2  —  Introduction and problem definition</w:t>
       </w:r>
       <w:r>
         <w:rPr>
@@ -458,7 +443,7 @@
           <w:sz w:val="22"/>
           <w:szCs w:val="22"/>
         </w:rPr>
-        <w:t xml:space="preserve">          1:15  </w:t>
+        <w:t xml:space="preserve">        1:15  </w:t>
       </w:r>
     </w:p>
     <w:p>
@@ -473,7 +458,7 @@
           <w:sz w:val="23"/>
           <w:szCs w:val="23"/>
         </w:rPr>
-        <w:t xml:space="preserve">About </w:t>
+        <w:t xml:space="preserve">Context on the left. About </w:t>
       </w:r>
       <w:r>
         <w:rPr>
@@ -493,7 +478,7 @@
           <w:sz w:val="23"/>
           <w:szCs w:val="23"/>
         </w:rPr>
-        <w:t xml:space="preserve"> depend on marine fishing in India. Most work boats under twelve metres — open boats, no radar, no weather fax, often no signal once they are out.</w:t>
+        <w:t xml:space="preserve"> depend on marine fishing in India, most on boats under twelve metres — no radar, little signal offshore.</w:t>
       </w:r>
     </w:p>
     <w:p>
@@ -508,17 +493,27 @@
           <w:sz w:val="23"/>
           <w:szCs w:val="23"/>
         </w:rPr>
-        <w:t xml:space="preserve">They make one decision a day, and they make it in the dark, before the boat leaves. </w:t>
-      </w:r>
-      <w:r>
-        <w:rPr>
-          <w:rFonts w:ascii="Calibri" w:cs="Calibri" w:eastAsia="Calibri" w:hAnsi="Calibri"/>
-          <w:b/>
-          <w:bCs/>
-          <w:sz w:val="23"/>
-          <w:szCs w:val="23"/>
-        </w:rPr>
-        <w:t xml:space="preserve">Go, or stay.</w:t>
+        <w:t xml:space="preserve">Every morning, before dawn, they make one decision: </w:t>
+      </w:r>
+      <w:r>
+        <w:rPr>
+          <w:rFonts w:ascii="Calibri" w:cs="Calibri" w:eastAsia="Calibri" w:hAnsi="Calibri"/>
+          <w:b/>
+          <w:bCs/>
+          <w:sz w:val="23"/>
+          <w:szCs w:val="23"/>
+        </w:rPr>
+        <w:t xml:space="preserve">go, or stay</w:t>
+      </w:r>
+      <w:r>
+        <w:rPr>
+          <w:rFonts w:ascii="Calibri" w:cs="Calibri" w:eastAsia="Calibri" w:hAnsi="Calibri"/>
+          <w:b w:val="false"/>
+          <w:bCs w:val="false"/>
+          <w:sz w:val="23"/>
+          <w:szCs w:val="23"/>
+        </w:rPr>
+        <w:t xml:space="preserve">. And three questions arrive together — is it safe, where are the fish, where is the border.</w:t>
       </w:r>
     </w:p>
     <w:p>
@@ -533,7 +528,7 @@
           <w:sz w:val="23"/>
           <w:szCs w:val="23"/>
         </w:rPr>
-        <w:t xml:space="preserve">Wrong in one direction costs a day's income. Wrong in the other can cost the boat, and the crew.</w:t>
+        <w:t xml:space="preserve">India already publishes the answer to each. But in three separate products, as maps and bulletins.</w:t>
       </w:r>
     </w:p>
     <w:p>
@@ -548,7 +543,17 @@
           <w:sz w:val="23"/>
           <w:szCs w:val="23"/>
         </w:rPr>
-        <w:t xml:space="preserve">Two more questions ride along with it. *Where should I fish* — the difference between a full hold and a wasted tank of diesel. And in the Palk Bay, *where is the border* — because Indian fishermen are detained by the Sri Lankan Navy every year, and a maritime boundary is invisible from a boat.</w:t>
+        <w:t xml:space="preserve">So my problem statement, on the right: </w:t>
+      </w:r>
+      <w:r>
+        <w:rPr>
+          <w:rFonts w:ascii="Calibri" w:cs="Calibri" w:eastAsia="Calibri" w:hAnsi="Calibri"/>
+          <w:b/>
+          <w:bCs/>
+          <w:sz w:val="23"/>
+          <w:szCs w:val="23"/>
+        </w:rPr>
+        <w:t xml:space="preserve">given a free-form question in an Indian language, produce one trustworthy operational answer — safety, fishing and border together — derived verifiably from official data, fast enough to use before the boat leaves, and honest when sources fail.</w:t>
       </w:r>
     </w:p>
     <w:p>
@@ -563,27 +568,17 @@
           <w:sz w:val="23"/>
           <w:szCs w:val="23"/>
         </w:rPr>
-        <w:t xml:space="preserve">Here is the thing. </w:t>
-      </w:r>
-      <w:r>
-        <w:rPr>
-          <w:rFonts w:ascii="Calibri" w:cs="Calibri" w:eastAsia="Calibri" w:hAnsi="Calibri"/>
-          <w:b/>
-          <w:bCs/>
-          <w:sz w:val="23"/>
-          <w:szCs w:val="23"/>
-        </w:rPr>
-        <w:t xml:space="preserve">India already publishes the answers to all three.</w:t>
-      </w:r>
-      <w:r>
-        <w:rPr>
-          <w:rFonts w:ascii="Calibri" w:cs="Calibri" w:eastAsia="Calibri" w:hAnsi="Calibri"/>
-          <w:b w:val="false"/>
-          <w:bCs w:val="false"/>
-          <w:sz w:val="23"/>
-          <w:szCs w:val="23"/>
-        </w:rPr>
-        <w:t xml:space="preserve"> Three separate government products.</w:t>
+        <w:t xml:space="preserve">And one constraint that shapes everything: </w:t>
+      </w:r>
+      <w:r>
+        <w:rPr>
+          <w:rFonts w:ascii="Calibri" w:cs="Calibri" w:eastAsia="Calibri" w:hAnsi="Calibri"/>
+          <w:b/>
+          <w:bCs/>
+          <w:sz w:val="23"/>
+          <w:szCs w:val="23"/>
+        </w:rPr>
+        <w:t xml:space="preserve">the language model must never be the component that decides whether it is safe to go to sea.</w:t>
       </w:r>
     </w:p>
     <w:p>
@@ -603,7 +598,7 @@
           <w:sz w:val="20"/>
           <w:szCs w:val="20"/>
         </w:rPr>
-        <w:t xml:space="preserve">Point at the three stat cards on the right as you land the last line — four million, three products, zero that accept a question.</w:t>
+        <w:t xml:space="preserve">Read the red constraint box slowly. Every design decision in the methodology traces back to it.</w:t>
       </w:r>
     </w:p>
     <w:p>
@@ -630,7 +625,7 @@
           <w:sz w:val="21"/>
           <w:szCs w:val="21"/>
         </w:rPr>
-        <w:t xml:space="preserve">“So let me show you what already exists, because that is where my literature review starts.”</w:t>
+        <w:t xml:space="preserve">“To see what already exists, I surveyed the literature in three groups.”</w:t>
       </w:r>
     </w:p>
     <w:p>
@@ -644,10 +639,10 @@
           <w:b/>
           <w:bCs/>
           <w:color w:val="FFFFFF"/>
-          <w:sz w:val="24"/>
-          <w:szCs w:val="24"/>
-        </w:rPr>
-        <w:t xml:space="preserve">  SLIDE 3  —  What India already publishes</w:t>
+          <w:sz w:val="23"/>
+          <w:szCs w:val="23"/>
+        </w:rPr>
+        <w:t xml:space="preserve">  SLIDE 3  —  Literature survey I — Indian marine information services</w:t>
       </w:r>
       <w:r>
         <w:rPr>
@@ -658,7 +653,7 @@
           <w:sz w:val="22"/>
           <w:szCs w:val="22"/>
         </w:rPr>
-        <w:t xml:space="preserve">          1:30  </w:t>
+        <w:t xml:space="preserve">        1:45  </w:t>
       </w:r>
     </w:p>
     <w:p>
@@ -673,27 +668,27 @@
           <w:sz w:val="23"/>
           <w:szCs w:val="23"/>
         </w:rPr>
-        <w:t xml:space="preserve">INCOIS — the Indian National Centre for Ocean Information Services — runs the </w:t>
-      </w:r>
-      <w:r>
-        <w:rPr>
-          <w:rFonts w:ascii="Calibri" w:cs="Calibri" w:eastAsia="Calibri" w:hAnsi="Calibri"/>
-          <w:b/>
-          <w:bCs/>
-          <w:sz w:val="23"/>
-          <w:szCs w:val="23"/>
-        </w:rPr>
-        <w:t xml:space="preserve">Ocean State Forecast</w:t>
-      </w:r>
-      <w:r>
-        <w:rPr>
-          <w:rFonts w:ascii="Calibri" w:cs="Calibri" w:eastAsia="Calibri" w:hAnsi="Calibri"/>
-          <w:b w:val="false"/>
-          <w:bCs w:val="false"/>
-          <w:sz w:val="23"/>
-          <w:szCs w:val="23"/>
-        </w:rPr>
-        <w:t xml:space="preserve">. Waves, wind, currents, sea temperature. Nair and colleagues published its validation in *Current Science* in 2013, checked against buoys, ship-mounted wave meters and satellite altimeters. Scatter index under fifteen percent. It is good.</w:t>
+        <w:t xml:space="preserve">The first group is India's own marine information services. Each row reads left to right — the study, what it did, its method and data, the finding, and in red, </w:t>
+      </w:r>
+      <w:r>
+        <w:rPr>
+          <w:rFonts w:ascii="Calibri" w:cs="Calibri" w:eastAsia="Calibri" w:hAnsi="Calibri"/>
+          <w:b/>
+          <w:bCs/>
+          <w:sz w:val="23"/>
+          <w:szCs w:val="23"/>
+        </w:rPr>
+        <w:t xml:space="preserve">its limitation for my problem</w:t>
+      </w:r>
+      <w:r>
+        <w:rPr>
+          <w:rFonts w:ascii="Calibri" w:cs="Calibri" w:eastAsia="Calibri" w:hAnsi="Calibri"/>
+          <w:b w:val="false"/>
+          <w:bCs w:val="false"/>
+          <w:sz w:val="23"/>
+          <w:szCs w:val="23"/>
+        </w:rPr>
+        <w:t xml:space="preserve">.</w:t>
       </w:r>
     </w:p>
     <w:p>
@@ -703,52 +698,22 @@
       <w:r>
         <w:rPr>
           <w:rFonts w:ascii="Calibri" w:cs="Calibri" w:eastAsia="Calibri" w:hAnsi="Calibri"/>
-          <w:b w:val="false"/>
-          <w:bCs w:val="false"/>
-          <w:sz w:val="23"/>
-          <w:szCs w:val="23"/>
-        </w:rPr>
-        <w:t xml:space="preserve">Second — and I only found this while writing the literature review — INCOIS also publishes a </w:t>
-      </w:r>
-      <w:r>
-        <w:rPr>
-          <w:rFonts w:ascii="Calibri" w:cs="Calibri" w:eastAsia="Calibri" w:hAnsi="Calibri"/>
-          <w:b/>
-          <w:bCs/>
-          <w:sz w:val="23"/>
-          <w:szCs w:val="23"/>
-        </w:rPr>
-        <w:t xml:space="preserve">Small Vessel Advisory</w:t>
-      </w:r>
-      <w:r>
-        <w:rPr>
-          <w:rFonts w:ascii="Calibri" w:cs="Calibri" w:eastAsia="Calibri" w:hAnsi="Calibri"/>
-          <w:b w:val="false"/>
-          <w:bCs w:val="false"/>
-          <w:sz w:val="23"/>
-          <w:szCs w:val="23"/>
-        </w:rPr>
-        <w:t xml:space="preserve">. It gives a *Boat Safety Index*: where small boats risk overturning, ten days ahead. Built from wave height, wave </w:t>
-      </w:r>
-      <w:r>
-        <w:rPr>
-          <w:rFonts w:ascii="Calibri" w:cs="Calibri" w:eastAsia="Calibri" w:hAnsi="Calibri"/>
-          <w:b/>
-          <w:bCs/>
-          <w:sz w:val="23"/>
-          <w:szCs w:val="23"/>
-        </w:rPr>
-        <w:t xml:space="preserve">steepness</w:t>
-      </w:r>
-      <w:r>
-        <w:rPr>
-          <w:rFonts w:ascii="Calibri" w:cs="Calibri" w:eastAsia="Calibri" w:hAnsi="Calibri"/>
-          <w:b w:val="false"/>
-          <w:bCs w:val="false"/>
-          <w:sz w:val="23"/>
-          <w:szCs w:val="23"/>
-        </w:rPr>
-        <w:t xml:space="preserve">, directional spread, and how fast the wind sea is building. Issued per boat width.</w:t>
+          <w:b/>
+          <w:bCs/>
+          <w:sz w:val="23"/>
+          <w:szCs w:val="23"/>
+        </w:rPr>
+        <w:t xml:space="preserve">Nair et al., 2013, in Current Science</w:t>
+      </w:r>
+      <w:r>
+        <w:rPr>
+          <w:rFonts w:ascii="Calibri" w:cs="Calibri" w:eastAsia="Calibri" w:hAnsi="Calibri"/>
+          <w:b w:val="false"/>
+          <w:bCs w:val="false"/>
+          <w:sz w:val="23"/>
+          <w:szCs w:val="23"/>
+        </w:rPr>
+        <w:t xml:space="preserve">, validated INCOIS's Ocean State Forecast against wave-rider buoys, ship-borne meters and satellite altimeters — scatter index under fifteen percent. An excellent forecast. But it validates the forecast field, not any decision.</w:t>
       </w:r>
     </w:p>
     <w:p>
@@ -758,32 +723,22 @@
       <w:r>
         <w:rPr>
           <w:rFonts w:ascii="Calibri" w:cs="Calibri" w:eastAsia="Calibri" w:hAnsi="Calibri"/>
-          <w:b w:val="false"/>
-          <w:bCs w:val="false"/>
-          <w:sz w:val="23"/>
-          <w:szCs w:val="23"/>
-        </w:rPr>
-        <w:t xml:space="preserve">Third, the </w:t>
-      </w:r>
-      <w:r>
-        <w:rPr>
-          <w:rFonts w:ascii="Calibri" w:cs="Calibri" w:eastAsia="Calibri" w:hAnsi="Calibri"/>
-          <w:b/>
-          <w:bCs/>
-          <w:sz w:val="23"/>
-          <w:szCs w:val="23"/>
-        </w:rPr>
-        <w:t xml:space="preserve">Potential Fishing Zone</w:t>
-      </w:r>
-      <w:r>
-        <w:rPr>
-          <w:rFonts w:ascii="Calibri" w:cs="Calibri" w:eastAsia="Calibri" w:hAnsi="Calibri"/>
-          <w:b w:val="false"/>
-          <w:bCs w:val="false"/>
-          <w:sz w:val="23"/>
-          <w:szCs w:val="23"/>
-        </w:rPr>
-        <w:t xml:space="preserve"> advisories. Pillai and Nair validated these along the Kerala coast in 2010 — catch and profit both measurably higher inside the notified zones.</w:t>
+          <w:b/>
+          <w:bCs/>
+          <w:sz w:val="23"/>
+          <w:szCs w:val="23"/>
+        </w:rPr>
+        <w:t xml:space="preserve">INCOIS's Small Vessel Advisory</w:t>
+      </w:r>
+      <w:r>
+        <w:rPr>
+          <w:rFonts w:ascii="Calibri" w:cs="Calibri" w:eastAsia="Calibri" w:hAnsi="Calibri"/>
+          <w:b w:val="false"/>
+          <w:bCs w:val="false"/>
+          <w:sz w:val="23"/>
+          <w:szCs w:val="23"/>
+        </w:rPr>
+        <w:t xml:space="preserve"> is the closest product to my safety work. It computes a Boat Safety Index from wave height, steepness, directional spread and wind-sea growth, per boat width. It independently confirms that steepness and vessel size matter. But it is a colour map, in English, its thresholds are not published, and it knows nothing about fishing zones or borders.</w:t>
       </w:r>
     </w:p>
     <w:p>
@@ -793,22 +748,22 @@
       <w:r>
         <w:rPr>
           <w:rFonts w:ascii="Calibri" w:cs="Calibri" w:eastAsia="Calibri" w:hAnsi="Calibri"/>
-          <w:b w:val="false"/>
-          <w:bCs w:val="false"/>
-          <w:sz w:val="23"/>
-          <w:szCs w:val="23"/>
-        </w:rPr>
-        <w:t xml:space="preserve">So the data is excellent. </w:t>
-      </w:r>
-      <w:r>
-        <w:rPr>
-          <w:rFonts w:ascii="Calibri" w:cs="Calibri" w:eastAsia="Calibri" w:hAnsi="Calibri"/>
-          <w:b/>
-          <w:bCs/>
-          <w:sz w:val="23"/>
-          <w:szCs w:val="23"/>
-        </w:rPr>
-        <w:t xml:space="preserve">I want to be clear that I am not trying to improve on any of this.</w:t>
+          <w:b/>
+          <w:bCs/>
+          <w:sz w:val="23"/>
+          <w:szCs w:val="23"/>
+        </w:rPr>
+        <w:t xml:space="preserve">Pillai and Nair, 2010</w:t>
+      </w:r>
+      <w:r>
+        <w:rPr>
+          <w:rFonts w:ascii="Calibri" w:cs="Calibri" w:eastAsia="Calibri" w:hAnsi="Calibri"/>
+          <w:b w:val="false"/>
+          <w:bCs w:val="false"/>
+          <w:sz w:val="23"/>
+          <w:szCs w:val="23"/>
+        </w:rPr>
+        <w:t xml:space="preserve">, validated the fishing-zone advisories on the Kerala coast from 2006 to 2010 — roughly two to six times the catch inside the zones. A real benefit. But it is a bulletin.</w:t>
       </w:r>
     </w:p>
     <w:p>
@@ -823,17 +778,42 @@
           <w:sz w:val="23"/>
           <w:szCs w:val="23"/>
         </w:rPr>
-        <w:t xml:space="preserve">But all three are maps and bulletins. </w:t>
-      </w:r>
-      <w:r>
-        <w:rPr>
-          <w:rFonts w:ascii="Calibri" w:cs="Calibri" w:eastAsia="Calibri" w:hAnsi="Calibri"/>
-          <w:b/>
-          <w:bCs/>
-          <w:sz w:val="23"/>
-          <w:szCs w:val="23"/>
-        </w:rPr>
-        <w:t xml:space="preserve">None of them answers a question, and none of them knows the other two exist.</w:t>
+        <w:t xml:space="preserve">And dissemination — the </w:t>
+      </w:r>
+      <w:r>
+        <w:rPr>
+          <w:rFonts w:ascii="Calibri" w:cs="Calibri" w:eastAsia="Calibri" w:hAnsi="Calibri"/>
+          <w:b/>
+          <w:bCs/>
+          <w:sz w:val="23"/>
+          <w:szCs w:val="23"/>
+        </w:rPr>
+        <w:t xml:space="preserve">Fisher Friend app</w:t>
+      </w:r>
+      <w:r>
+        <w:rPr>
+          <w:rFonts w:ascii="Calibri" w:cs="Calibri" w:eastAsia="Calibri" w:hAnsi="Calibri"/>
+          <w:b w:val="false"/>
+          <w:bCs w:val="false"/>
+          <w:sz w:val="23"/>
+          <w:szCs w:val="23"/>
+        </w:rPr>
+        <w:t xml:space="preserve">, INCOIS's SMS and helplines — reaches nine languages, but it is broadcast. None of it accepts a question.</w:t>
+      </w:r>
+    </w:p>
+    <w:p>
+      <w:pPr>
+        <w:spacing w:after="140" w:line="300"/>
+      </w:pPr>
+      <w:r>
+        <w:rPr>
+          <w:rFonts w:ascii="Calibri" w:cs="Calibri" w:eastAsia="Calibri" w:hAnsi="Calibri"/>
+          <w:b/>
+          <w:bCs/>
+          <w:sz w:val="23"/>
+          <w:szCs w:val="23"/>
+        </w:rPr>
+        <w:t xml:space="preserve">So India's marine data is validated and excellent. What no product does is reason across all three and answer a question.</w:t>
       </w:r>
     </w:p>
     <w:p>
@@ -853,7 +833,7 @@
           <w:sz w:val="20"/>
           <w:szCs w:val="20"/>
         </w:rPr>
-        <w:t xml:space="preserve">Point at the red bar along the bottom for the last line. If she looks interested in the Small Vessel Advisory, that is a good sign — it is the strongest thing in your literature review and it comes back on slide 8.</w:t>
+        <w:t xml:space="preserve">Do not read every cell. For each row: bold study name, one finding, then point at the red column. The Small Vessel Advisory row deserves the most time — it is the strongest item in the review.</w:t>
       </w:r>
     </w:p>
     <w:p>
@@ -880,7 +860,7 @@
           <w:sz w:val="21"/>
           <w:szCs w:val="21"/>
         </w:rPr>
-        <w:t xml:space="preserve">“The other half of the literature is the AI side.”</w:t>
+        <w:t xml:space="preserve">“The second group is the techniques I could build with.”</w:t>
       </w:r>
     </w:p>
     <w:p>
@@ -894,10 +874,10 @@
           <w:b/>
           <w:bCs/>
           <w:color w:val="FFFFFF"/>
-          <w:sz w:val="24"/>
-          <w:szCs w:val="24"/>
-        </w:rPr>
-        <w:t xml:space="preserve">  SLIDE 4  —  What the AI literature says</w:t>
+          <w:sz w:val="23"/>
+          <w:szCs w:val="23"/>
+        </w:rPr>
+        <w:t xml:space="preserve">  SLIDE 4  —  Literature survey II — forecasting and AI reasoning techniques</w:t>
       </w:r>
       <w:r>
         <w:rPr>
@@ -908,7 +888,7 @@
           <w:sz w:val="22"/>
           <w:szCs w:val="22"/>
         </w:rPr>
-        <w:t xml:space="preserve">          1:30  </w:t>
+        <w:t xml:space="preserve">        1:15  </w:t>
       </w:r>
     </w:p>
     <w:p>
@@ -923,27 +903,47 @@
           <w:sz w:val="23"/>
           <w:szCs w:val="23"/>
         </w:rPr>
-        <w:t xml:space="preserve">On the left: </w:t>
-      </w:r>
-      <w:r>
-        <w:rPr>
-          <w:rFonts w:ascii="Calibri" w:cs="Calibri" w:eastAsia="Calibri" w:hAnsi="Calibri"/>
-          <w:b/>
-          <w:bCs/>
-          <w:sz w:val="23"/>
-          <w:szCs w:val="23"/>
-        </w:rPr>
-        <w:t xml:space="preserve">grounding a model in tools works.</w:t>
-      </w:r>
-      <w:r>
-        <w:rPr>
-          <w:rFonts w:ascii="Calibri" w:cs="Calibri" w:eastAsia="Calibri" w:hAnsi="Calibri"/>
-          <w:b w:val="false"/>
-          <w:bCs w:val="false"/>
-          <w:sz w:val="23"/>
-          <w:szCs w:val="23"/>
-        </w:rPr>
-        <w:t xml:space="preserve"> ReAct and Toolformer showed models can plan and call external tools instead of recalling facts. Retrieval-augmented generation established grounding an answer in retrieved evidence. And two systems are close relatives of mine — ClimSight for climate advice, WildfireGPT for wildfire decisions. Both multi-agent, both grounded.</w:t>
+        <w:t xml:space="preserve">Two halves. </w:t>
+      </w:r>
+      <w:r>
+        <w:rPr>
+          <w:rFonts w:ascii="Calibri" w:cs="Calibri" w:eastAsia="Calibri" w:hAnsi="Calibri"/>
+          <w:b/>
+          <w:bCs/>
+          <w:sz w:val="23"/>
+          <w:szCs w:val="23"/>
+        </w:rPr>
+        <w:t xml:space="preserve">GraphCast and Pangu-Weather</w:t>
+      </w:r>
+      <w:r>
+        <w:rPr>
+          <w:rFonts w:ascii="Calibri" w:cs="Calibri" w:eastAsia="Calibri" w:hAnsi="Calibri"/>
+          <w:b w:val="false"/>
+          <w:bCs w:val="false"/>
+          <w:sz w:val="23"/>
+          <w:szCs w:val="23"/>
+        </w:rPr>
+        <w:t xml:space="preserve"> — Science and Nature, 2023 — are machine-learned forecasting models that now rival operational prediction. They are in my review as </w:t>
+      </w:r>
+      <w:r>
+        <w:rPr>
+          <w:rFonts w:ascii="Calibri" w:cs="Calibri" w:eastAsia="Calibri" w:hAnsi="Calibri"/>
+          <w:b/>
+          <w:bCs/>
+          <w:sz w:val="23"/>
+          <w:szCs w:val="23"/>
+        </w:rPr>
+        <w:t xml:space="preserve">the road not taken</w:t>
+      </w:r>
+      <w:r>
+        <w:rPr>
+          <w:rFonts w:ascii="Calibri" w:cs="Calibri" w:eastAsia="Calibri" w:hAnsi="Calibri"/>
+          <w:b w:val="false"/>
+          <w:bCs w:val="false"/>
+          <w:sz w:val="23"/>
+          <w:szCs w:val="23"/>
+        </w:rPr>
+        <w:t xml:space="preserve">: they need decades of reanalysis and heavy compute, and they would replace a forecast INCOIS already provides, validated and free.</w:t>
       </w:r>
     </w:p>
     <w:p>
@@ -958,27 +958,67 @@
           <w:sz w:val="23"/>
           <w:szCs w:val="23"/>
         </w:rPr>
-        <w:t xml:space="preserve">One finding I want to flag, because it supports my design independently: </w:t>
-      </w:r>
-      <w:r>
-        <w:rPr>
-          <w:rFonts w:ascii="Calibri" w:cs="Calibri" w:eastAsia="Calibri" w:hAnsi="Calibri"/>
-          <w:b/>
-          <w:bCs/>
-          <w:sz w:val="23"/>
-          <w:szCs w:val="23"/>
-        </w:rPr>
-        <w:t xml:space="preserve">ClimSight's extension reports its biggest gains when the indicators are computed deterministically rather than generated by the model.</w:t>
-      </w:r>
-      <w:r>
-        <w:rPr>
-          <w:rFonts w:ascii="Calibri" w:cs="Calibri" w:eastAsia="Calibri" w:hAnsi="Calibri"/>
-          <w:b w:val="false"/>
-          <w:bCs w:val="false"/>
-          <w:sz w:val="23"/>
-          <w:szCs w:val="23"/>
-        </w:rPr>
-        <w:t xml:space="preserve"> They arrived at that separately from me.</w:t>
+        <w:t xml:space="preserve">The other three make my system possible. </w:t>
+      </w:r>
+      <w:r>
+        <w:rPr>
+          <w:rFonts w:ascii="Calibri" w:cs="Calibri" w:eastAsia="Calibri" w:hAnsi="Calibri"/>
+          <w:b/>
+          <w:bCs/>
+          <w:sz w:val="23"/>
+          <w:szCs w:val="23"/>
+        </w:rPr>
+        <w:t xml:space="preserve">Retrieval-augmented generation</w:t>
+      </w:r>
+      <w:r>
+        <w:rPr>
+          <w:rFonts w:ascii="Calibri" w:cs="Calibri" w:eastAsia="Calibri" w:hAnsi="Calibri"/>
+          <w:b w:val="false"/>
+          <w:bCs w:val="false"/>
+          <w:sz w:val="23"/>
+          <w:szCs w:val="23"/>
+        </w:rPr>
+        <w:t xml:space="preserve"> grounds answers in retrieved evidence. </w:t>
+      </w:r>
+      <w:r>
+        <w:rPr>
+          <w:rFonts w:ascii="Calibri" w:cs="Calibri" w:eastAsia="Calibri" w:hAnsi="Calibri"/>
+          <w:b/>
+          <w:bCs/>
+          <w:sz w:val="23"/>
+          <w:szCs w:val="23"/>
+        </w:rPr>
+        <w:t xml:space="preserve">ReAct</w:t>
+      </w:r>
+      <w:r>
+        <w:rPr>
+          <w:rFonts w:ascii="Calibri" w:cs="Calibri" w:eastAsia="Calibri" w:hAnsi="Calibri"/>
+          <w:b w:val="false"/>
+          <w:bCs w:val="false"/>
+          <w:sz w:val="23"/>
+          <w:szCs w:val="23"/>
+        </w:rPr>
+        <w:t xml:space="preserve"> interleaves reasoning with tool calls. </w:t>
+      </w:r>
+      <w:r>
+        <w:rPr>
+          <w:rFonts w:ascii="Calibri" w:cs="Calibri" w:eastAsia="Calibri" w:hAnsi="Calibri"/>
+          <w:b/>
+          <w:bCs/>
+          <w:sz w:val="23"/>
+          <w:szCs w:val="23"/>
+        </w:rPr>
+        <w:t xml:space="preserve">Toolformer</w:t>
+      </w:r>
+      <w:r>
+        <w:rPr>
+          <w:rFonts w:ascii="Calibri" w:cs="Calibri" w:eastAsia="Calibri" w:hAnsi="Calibri"/>
+          <w:b w:val="false"/>
+          <w:bCs w:val="false"/>
+          <w:sz w:val="23"/>
+          <w:szCs w:val="23"/>
+        </w:rPr>
+        <w:t xml:space="preserve"> shows models learning when to call an API.</w:t>
       </w:r>
     </w:p>
     <w:p>
@@ -993,82 +1033,17 @@
           <w:sz w:val="23"/>
           <w:szCs w:val="23"/>
         </w:rPr>
-        <w:t xml:space="preserve">On the right is the problem. </w:t>
-      </w:r>
-      <w:r>
-        <w:rPr>
-          <w:rFonts w:ascii="Calibri" w:cs="Calibri" w:eastAsia="Calibri" w:hAnsi="Calibri"/>
-          <w:b/>
-          <w:bCs/>
-          <w:sz w:val="23"/>
-          <w:szCs w:val="23"/>
-        </w:rPr>
-        <w:t xml:space="preserve">Lin and colleagues surveyed hallucination in AI agents</w:t>
-      </w:r>
-      <w:r>
-        <w:rPr>
-          <w:rFonts w:ascii="Calibri" w:cs="Calibri" w:eastAsia="Calibri" w:hAnsi="Calibri"/>
-          <w:b w:val="false"/>
-          <w:bCs w:val="false"/>
-          <w:sz w:val="23"/>
-          <w:szCs w:val="23"/>
-        </w:rPr>
-        <w:t xml:space="preserve"> — five failure types, eighteen causes. They warn that agent errors can be, their phrase, “physically consequential”. And there is a failure mode called </w:t>
-      </w:r>
-      <w:r>
-        <w:rPr>
-          <w:rFonts w:ascii="Calibri" w:cs="Calibri" w:eastAsia="Calibri" w:hAnsi="Calibri"/>
-          <w:b/>
-          <w:bCs/>
-          <w:sz w:val="23"/>
-          <w:szCs w:val="23"/>
-        </w:rPr>
-        <w:t xml:space="preserve">tool bypass</w:t>
-      </w:r>
-      <w:r>
-        <w:rPr>
-          <w:rFonts w:ascii="Calibri" w:cs="Calibri" w:eastAsia="Calibri" w:hAnsi="Calibri"/>
-          <w:b w:val="false"/>
-          <w:bCs w:val="false"/>
-          <w:sz w:val="23"/>
-          <w:szCs w:val="23"/>
-        </w:rPr>
-        <w:t xml:space="preserve">, where the model simulates a tool's output instead of actually calling it — which defeats auditing exactly when auditing matters most.</w:t>
-      </w:r>
-    </w:p>
-    <w:p>
-      <w:pPr>
-        <w:spacing w:after="140" w:line="300"/>
-      </w:pPr>
-      <w:r>
-        <w:rPr>
-          <w:rFonts w:ascii="Calibri" w:cs="Calibri" w:eastAsia="Calibri" w:hAnsi="Calibri"/>
-          <w:b w:val="false"/>
-          <w:bCs w:val="false"/>
-          <w:sz w:val="23"/>
-          <w:szCs w:val="23"/>
-        </w:rPr>
-        <w:t xml:space="preserve">So telling a model “only use the data provided” is </w:t>
-      </w:r>
-      <w:r>
-        <w:rPr>
-          <w:rFonts w:ascii="Calibri" w:cs="Calibri" w:eastAsia="Calibri" w:hAnsi="Calibri"/>
-          <w:b/>
-          <w:bCs/>
-          <w:sz w:val="23"/>
-          <w:szCs w:val="23"/>
-        </w:rPr>
-        <w:t xml:space="preserve">not a guarantee</w:t>
-      </w:r>
-      <w:r>
-        <w:rPr>
-          <w:rFonts w:ascii="Calibri" w:cs="Calibri" w:eastAsia="Calibri" w:hAnsi="Calibri"/>
-          <w:b w:val="false"/>
-          <w:bCs w:val="false"/>
-          <w:sz w:val="23"/>
-          <w:szCs w:val="23"/>
-        </w:rPr>
-        <w:t xml:space="preserve">. If I am making a safety claim, an unsupported number has to be removed mechanically. Not discouraged.</w:t>
+        <w:t xml:space="preserve">Their shared limitation, in red: </w:t>
+      </w:r>
+      <w:r>
+        <w:rPr>
+          <w:rFonts w:ascii="Calibri" w:cs="Calibri" w:eastAsia="Calibri" w:hAnsi="Calibri"/>
+          <w:b/>
+          <w:bCs/>
+          <w:sz w:val="23"/>
+          <w:szCs w:val="23"/>
+        </w:rPr>
+        <w:t xml:space="preserve">grounding is encouraged, not enforced. The model still writes the answer and decides what to trust.</w:t>
       </w:r>
     </w:p>
     <w:p>
@@ -1088,7 +1063,7 @@
           <w:sz w:val="20"/>
           <w:szCs w:val="20"/>
         </w:rPr>
-        <w:t xml:space="preserve">This slide is doing the heavy lifting for the 10-mark literature criterion. Do not rush it. The left card is why the approach is possible; the right card is why the approach has to be careful.</w:t>
+        <w:t xml:space="preserve">Move briskly. The one idea to land is the red column of the last three rows.</w:t>
       </w:r>
     </w:p>
     <w:p>
@@ -1115,7 +1090,7 @@
           <w:sz w:val="21"/>
           <w:szCs w:val="21"/>
         </w:rPr>
-        <w:t xml:space="preserve">“Which brings me to the gap.”</w:t>
+        <w:t xml:space="preserve">“The third group is the closest systems to mine — and why that limitation matters.”</w:t>
       </w:r>
     </w:p>
     <w:p>
@@ -1129,10 +1104,10 @@
           <w:b/>
           <w:bCs/>
           <w:color w:val="FFFFFF"/>
-          <w:sz w:val="24"/>
-          <w:szCs w:val="24"/>
-        </w:rPr>
-        <w:t xml:space="preserve">  SLIDE 5  —  The gap</w:t>
+          <w:sz w:val="23"/>
+          <w:szCs w:val="23"/>
+        </w:rPr>
+        <w:t xml:space="preserve">  SLIDE 5  —  Literature survey III — LLM decision support, reliability, evaluation</w:t>
       </w:r>
       <w:r>
         <w:rPr>
@@ -1143,7 +1118,7 @@
           <w:sz w:val="22"/>
           <w:szCs w:val="22"/>
         </w:rPr>
-        <w:t xml:space="preserve">          2:00  </w:t>
+        <w:t xml:space="preserve">        1:30  </w:t>
       </w:r>
     </w:p>
     <w:p>
@@ -1158,17 +1133,37 @@
           <w:sz w:val="23"/>
           <w:szCs w:val="23"/>
         </w:rPr>
-        <w:t xml:space="preserve">This table is my research gap.</w:t>
-      </w:r>
-      <w:r>
-        <w:rPr>
-          <w:rFonts w:ascii="Calibri" w:cs="Calibri" w:eastAsia="Calibri" w:hAnsi="Calibri"/>
-          <w:b w:val="false"/>
-          <w:bCs w:val="false"/>
-          <w:sz w:val="23"/>
-          <w:szCs w:val="23"/>
-        </w:rPr>
-        <w:t xml:space="preserve"> Down the left, the systems I reviewed. Across the top, five properties.</w:t>
+        <w:t xml:space="preserve">ClimSight</w:t>
+      </w:r>
+      <w:r>
+        <w:rPr>
+          <w:rFonts w:ascii="Calibri" w:cs="Calibri" w:eastAsia="Calibri" w:hAnsi="Calibri"/>
+          <w:b w:val="false"/>
+          <w:bCs w:val="false"/>
+          <w:sz w:val="23"/>
+          <w:szCs w:val="23"/>
+        </w:rPr>
+        <w:t xml:space="preserve">, in npj Climate Action 2025, and </w:t>
+      </w:r>
+      <w:r>
+        <w:rPr>
+          <w:rFonts w:ascii="Calibri" w:cs="Calibri" w:eastAsia="Calibri" w:hAnsi="Calibri"/>
+          <w:b/>
+          <w:bCs/>
+          <w:sz w:val="23"/>
+          <w:szCs w:val="23"/>
+        </w:rPr>
+        <w:t xml:space="preserve">WildfireGPT</w:t>
+      </w:r>
+      <w:r>
+        <w:rPr>
+          <w:rFonts w:ascii="Calibri" w:cs="Calibri" w:eastAsia="Calibri" w:hAnsi="Calibri"/>
+          <w:b w:val="false"/>
+          <w:bCs w:val="false"/>
+          <w:sz w:val="23"/>
+          <w:szCs w:val="23"/>
+        </w:rPr>
+        <w:t xml:space="preserve">, 2025, are the closest relatives: multi-agent LLM systems for climate and wildfire decision support, grounded by retrieval. But they answer analytical questions for planners, ground in documents, and still let the model write the conclusion.</w:t>
       </w:r>
     </w:p>
     <w:p>
@@ -1183,27 +1178,27 @@
           <w:sz w:val="23"/>
           <w:szCs w:val="23"/>
         </w:rPr>
-        <w:t xml:space="preserve">The Ocean State Forecast — not conversational, produces no verdict. The </w:t>
-      </w:r>
-      <w:r>
-        <w:rPr>
-          <w:rFonts w:ascii="Calibri" w:cs="Calibri" w:eastAsia="Calibri" w:hAnsi="Calibri"/>
-          <w:b/>
-          <w:bCs/>
-          <w:sz w:val="23"/>
-          <w:szCs w:val="23"/>
-        </w:rPr>
-        <w:t xml:space="preserve">Small Vessel Advisory does</w:t>
-      </w:r>
-      <w:r>
-        <w:rPr>
-          <w:rFonts w:ascii="Calibri" w:cs="Calibri" w:eastAsia="Calibri" w:hAnsi="Calibri"/>
-          <w:b w:val="false"/>
-          <w:bCs w:val="false"/>
-          <w:sz w:val="23"/>
-          <w:szCs w:val="23"/>
-        </w:rPr>
-        <w:t xml:space="preserve"> produce a deterministic safety verdict, the only one here that does — but it is a colour-coded map, in English, and it knows nothing about fishing zones or borders.</w:t>
+        <w:t xml:space="preserve">One finding matters a lot to me. ClimSight's extension, XCLIM-AI, reports its </w:t>
+      </w:r>
+      <w:r>
+        <w:rPr>
+          <w:rFonts w:ascii="Calibri" w:cs="Calibri" w:eastAsia="Calibri" w:hAnsi="Calibri"/>
+          <w:b/>
+          <w:bCs/>
+          <w:sz w:val="23"/>
+          <w:szCs w:val="23"/>
+        </w:rPr>
+        <w:t xml:space="preserve">largest gains when indicators are computed deterministically rather than generated.</w:t>
+      </w:r>
+      <w:r>
+        <w:rPr>
+          <w:rFonts w:ascii="Calibri" w:cs="Calibri" w:eastAsia="Calibri" w:hAnsi="Calibri"/>
+          <w:b w:val="false"/>
+          <w:bCs w:val="false"/>
+          <w:sz w:val="23"/>
+          <w:szCs w:val="23"/>
+        </w:rPr>
+        <w:t xml:space="preserve"> That is independent support for my design.</w:t>
       </w:r>
     </w:p>
     <w:p>
@@ -1213,12 +1208,22 @@
       <w:r>
         <w:rPr>
           <w:rFonts w:ascii="Calibri" w:cs="Calibri" w:eastAsia="Calibri" w:hAnsi="Calibri"/>
-          <w:b w:val="false"/>
-          <w:bCs w:val="false"/>
-          <w:sz w:val="23"/>
-          <w:szCs w:val="23"/>
-        </w:rPr>
-        <w:t xml:space="preserve">The fishing zone advisories reach ten languages, but they are bulletins. The Fisher Friend app reaches nine languages — but it is broadcast. It pushes. It does not listen.</w:t>
+          <w:b/>
+          <w:bCs/>
+          <w:sz w:val="23"/>
+          <w:szCs w:val="23"/>
+        </w:rPr>
+        <w:t xml:space="preserve">Lin et al., 2025</w:t>
+      </w:r>
+      <w:r>
+        <w:rPr>
+          <w:rFonts w:ascii="Calibri" w:cs="Calibri" w:eastAsia="Calibri" w:hAnsi="Calibri"/>
+          <w:b w:val="false"/>
+          <w:bCs w:val="false"/>
+          <w:sz w:val="23"/>
+          <w:szCs w:val="23"/>
+        </w:rPr>
+        <w:t xml:space="preserve">, surveyed hallucination in AI agents — five workflow stages, eighteen causes — and warn that errors can be physically consequential. That is why my verification is mechanical, not a prompt instruction.</w:t>
       </w:r>
     </w:p>
     <w:p>
@@ -1228,107 +1233,42 @@
       <w:r>
         <w:rPr>
           <w:rFonts w:ascii="Calibri" w:cs="Calibri" w:eastAsia="Calibri" w:hAnsi="Calibri"/>
-          <w:b w:val="false"/>
-          <w:bCs w:val="false"/>
-          <w:sz w:val="23"/>
-          <w:szCs w:val="23"/>
-        </w:rPr>
-        <w:t xml:space="preserve">Then the AI systems. ClimSight and WildfireGPT are conversational — but they ground in </w:t>
-      </w:r>
-      <w:r>
-        <w:rPr>
-          <w:rFonts w:ascii="Calibri" w:cs="Calibri" w:eastAsia="Calibri" w:hAnsi="Calibri"/>
-          <w:b/>
-          <w:bCs/>
-          <w:sz w:val="23"/>
-          <w:szCs w:val="23"/>
-        </w:rPr>
-        <w:t xml:space="preserve">documents</w:t>
-      </w:r>
-      <w:r>
-        <w:rPr>
-          <w:rFonts w:ascii="Calibri" w:cs="Calibri" w:eastAsia="Calibri" w:hAnsi="Calibri"/>
-          <w:b w:val="false"/>
-          <w:bCs w:val="false"/>
-          <w:sz w:val="23"/>
-          <w:szCs w:val="23"/>
-        </w:rPr>
-        <w:t xml:space="preserve">, not live numbers, they are English-only, and crucially </w:t>
-      </w:r>
-      <w:r>
-        <w:rPr>
-          <w:rFonts w:ascii="Calibri" w:cs="Calibri" w:eastAsia="Calibri" w:hAnsi="Calibri"/>
-          <w:b/>
-          <w:bCs/>
-          <w:sz w:val="23"/>
-          <w:szCs w:val="23"/>
-        </w:rPr>
-        <w:t xml:space="preserve">they still let the model write the conclusion</w:t>
-      </w:r>
-      <w:r>
-        <w:rPr>
-          <w:rFonts w:ascii="Calibri" w:cs="Calibri" w:eastAsia="Calibri" w:hAnsi="Calibri"/>
-          <w:b w:val="false"/>
-          <w:bCs w:val="false"/>
-          <w:sz w:val="23"/>
-          <w:szCs w:val="23"/>
-        </w:rPr>
-        <w:t xml:space="preserve">.</w:t>
-      </w:r>
-    </w:p>
-    <w:p>
-      <w:pPr>
-        <w:spacing w:after="140" w:line="300"/>
-      </w:pPr>
-      <w:r>
-        <w:rPr>
-          <w:rFonts w:ascii="Calibri" w:cs="Calibri" w:eastAsia="Calibri" w:hAnsi="Calibri"/>
-          <w:b w:val="false"/>
-          <w:bCs w:val="false"/>
-          <w:sz w:val="23"/>
-          <w:szCs w:val="23"/>
-        </w:rPr>
-        <w:t xml:space="preserve">Nobody has the bottom row.</w:t>
-      </w:r>
-    </w:p>
-    <w:p>
-      <w:pPr>
-        <w:spacing w:after="140" w:line="300"/>
-      </w:pPr>
-      <w:r>
-        <w:rPr>
-          <w:rFonts w:ascii="Calibri" w:cs="Calibri" w:eastAsia="Calibri" w:hAnsi="Calibri"/>
-          <w:b w:val="false"/>
-          <w:bCs w:val="false"/>
-          <w:sz w:val="23"/>
-          <w:szCs w:val="23"/>
-        </w:rPr>
-        <w:t xml:space="preserve">So the gap in one sentence: </w:t>
-      </w:r>
-      <w:r>
-        <w:rPr>
-          <w:rFonts w:ascii="Calibri" w:cs="Calibri" w:eastAsia="Calibri" w:hAnsi="Calibri"/>
-          <w:b/>
-          <w:bCs/>
-          <w:sz w:val="23"/>
-          <w:szCs w:val="23"/>
-        </w:rPr>
-        <w:t xml:space="preserve">no published system lets a fisherman ask one question in his own language and receive a single operational decision — safety, fishing and border together — that is provably derived from official products rather than generated by a model.</w:t>
-      </w:r>
-    </w:p>
-    <w:p>
-      <w:pPr>
-        <w:spacing w:after="140" w:line="300"/>
-      </w:pPr>
-      <w:r>
-        <w:rPr>
-          <w:rFonts w:ascii="Calibri" w:cs="Calibri" w:eastAsia="Calibri" w:hAnsi="Calibri"/>
-          <w:b w:val="false"/>
-          <w:bCs w:val="false"/>
-          <w:sz w:val="23"/>
-          <w:szCs w:val="23"/>
-        </w:rPr>
-        <w:t xml:space="preserve">In the synopsis I break that into six specific gaps, G1 to G6, and each one maps to an objective.</w:t>
+          <w:b/>
+          <w:bCs/>
+          <w:sz w:val="23"/>
+          <w:szCs w:val="23"/>
+        </w:rPr>
+        <w:t xml:space="preserve">IndicTrans2</w:t>
+      </w:r>
+      <w:r>
+        <w:rPr>
+          <w:rFonts w:ascii="Calibri" w:cs="Calibri" w:eastAsia="Calibri" w:hAnsi="Calibri"/>
+          <w:b w:val="false"/>
+          <w:bCs w:val="false"/>
+          <w:sz w:val="23"/>
+          <w:szCs w:val="23"/>
+        </w:rPr>
+        <w:t xml:space="preserve"> covers all 22 scheduled languages — translation is solved, but nobody has attached it to a marine system. And </w:t>
+      </w:r>
+      <w:r>
+        <w:rPr>
+          <w:rFonts w:ascii="Calibri" w:cs="Calibri" w:eastAsia="Calibri" w:hAnsi="Calibri"/>
+          <w:b/>
+          <w:bCs/>
+          <w:sz w:val="23"/>
+          <w:szCs w:val="23"/>
+        </w:rPr>
+        <w:t xml:space="preserve">Jolliffe and Stephenson</w:t>
+      </w:r>
+      <w:r>
+        <w:rPr>
+          <w:rFonts w:ascii="Calibri" w:cs="Calibri" w:eastAsia="Calibri" w:hAnsi="Calibri"/>
+          <w:b w:val="false"/>
+          <w:bCs w:val="false"/>
+          <w:sz w:val="23"/>
+          <w:szCs w:val="23"/>
+        </w:rPr>
+        <w:t xml:space="preserve"> give the standard way to score warnings, POD and FAR — which nobody in this domain has applied to the verdict itself.</w:t>
       </w:r>
     </w:p>
     <w:p>
@@ -1348,7 +1288,7 @@
           <w:sz w:val="20"/>
           <w:szCs w:val="20"/>
         </w:rPr>
-        <w:t xml:space="preserve">Slow down. This is the 5-mark research-gap criterion and the single most important slide in the deck. Walk the table row by row with your hand. Pause after “Nobody has the bottom row.”</w:t>
+        <w:t xml:space="preserve">Pause on the ClimSight finding. It is the single strongest piece of external support for the whole architecture.</w:t>
       </w:r>
     </w:p>
     <w:p>
@@ -1375,7 +1315,7 @@
           <w:sz w:val="21"/>
           <w:szCs w:val="21"/>
         </w:rPr>
-        <w:t xml:space="preserve">“So those gaps turn into six objectives.”</w:t>
+        <w:t xml:space="preserve">“Putting the three groups side by side gives the research gap.”</w:t>
       </w:r>
     </w:p>
     <w:p>
@@ -1389,10 +1329,10 @@
           <w:b/>
           <w:bCs/>
           <w:color w:val="FFFFFF"/>
-          <w:sz w:val="24"/>
-          <w:szCs w:val="24"/>
-        </w:rPr>
-        <w:t xml:space="preserve">  SLIDE 6  —  Objectives</w:t>
+          <w:sz w:val="23"/>
+          <w:szCs w:val="23"/>
+        </w:rPr>
+        <w:t xml:space="preserve">  SLIDE 6  —  Research gap — comparative analysis</w:t>
       </w:r>
       <w:r>
         <w:rPr>
@@ -1403,7 +1343,7 @@
           <w:sz w:val="22"/>
           <w:szCs w:val="22"/>
         </w:rPr>
-        <w:t xml:space="preserve">          1:00  </w:t>
+        <w:t xml:space="preserve">        1:45  </w:t>
       </w:r>
     </w:p>
     <w:p>
@@ -1413,22 +1353,12 @@
       <w:r>
         <w:rPr>
           <w:rFonts w:ascii="Calibri" w:cs="Calibri" w:eastAsia="Calibri" w:hAnsi="Calibri"/>
-          <w:b/>
-          <w:bCs/>
-          <w:sz w:val="23"/>
-          <w:szCs w:val="23"/>
-        </w:rPr>
-        <w:t xml:space="preserve">O1</w:t>
-      </w:r>
-      <w:r>
-        <w:rPr>
-          <w:rFonts w:ascii="Calibri" w:cs="Calibri" w:eastAsia="Calibri" w:hAnsi="Calibri"/>
-          <w:b w:val="false"/>
-          <w:bCs w:val="false"/>
-          <w:sz w:val="23"/>
-          <w:szCs w:val="23"/>
-        </w:rPr>
-        <w:t xml:space="preserve"> — integrate the three products behind one conversation.</w:t>
+          <w:b w:val="false"/>
+          <w:bCs w:val="false"/>
+          <w:sz w:val="23"/>
+          <w:szCs w:val="23"/>
+        </w:rPr>
+        <w:t xml:space="preserve">Every row here is a study from the survey. Across the top, the properties my problem needs.</w:t>
       </w:r>
     </w:p>
     <w:p>
@@ -1438,22 +1368,52 @@
       <w:r>
         <w:rPr>
           <w:rFonts w:ascii="Calibri" w:cs="Calibri" w:eastAsia="Calibri" w:hAnsi="Calibri"/>
-          <w:b/>
-          <w:bCs/>
-          <w:sz w:val="23"/>
-          <w:szCs w:val="23"/>
-        </w:rPr>
-        <w:t xml:space="preserve">O2</w:t>
-      </w:r>
-      <w:r>
-        <w:rPr>
-          <w:rFonts w:ascii="Calibri" w:cs="Calibri" w:eastAsia="Calibri" w:hAnsi="Calibri"/>
-          <w:b w:val="false"/>
-          <w:bCs w:val="false"/>
-          <w:sz w:val="23"/>
-          <w:szCs w:val="23"/>
-        </w:rPr>
-        <w:t xml:space="preserve">, and this is a research objective — make the safety verdict come from deterministic, tested rules that sit structurally outside the model's reach.</w:t>
+          <w:b w:val="false"/>
+          <w:bCs w:val="false"/>
+          <w:sz w:val="23"/>
+          <w:szCs w:val="23"/>
+        </w:rPr>
+        <w:t xml:space="preserve">The </w:t>
+      </w:r>
+      <w:r>
+        <w:rPr>
+          <w:rFonts w:ascii="Calibri" w:cs="Calibri" w:eastAsia="Calibri" w:hAnsi="Calibri"/>
+          <w:b/>
+          <w:bCs/>
+          <w:sz w:val="23"/>
+          <w:szCs w:val="23"/>
+        </w:rPr>
+        <w:t xml:space="preserve">Small Vessel Advisory</w:t>
+      </w:r>
+      <w:r>
+        <w:rPr>
+          <w:rFonts w:ascii="Calibri" w:cs="Calibri" w:eastAsia="Calibri" w:hAnsi="Calibri"/>
+          <w:b w:val="false"/>
+          <w:bCs w:val="false"/>
+          <w:sz w:val="23"/>
+          <w:szCs w:val="23"/>
+        </w:rPr>
+        <w:t xml:space="preserve"> is the only one with a deterministic safety verdict — and it fails every other column. The fishing-zone advisories and Fisher Friend reach many languages, but they are broadcast. </w:t>
+      </w:r>
+      <w:r>
+        <w:rPr>
+          <w:rFonts w:ascii="Calibri" w:cs="Calibri" w:eastAsia="Calibri" w:hAnsi="Calibri"/>
+          <w:b/>
+          <w:bCs/>
+          <w:sz w:val="23"/>
+          <w:szCs w:val="23"/>
+        </w:rPr>
+        <w:t xml:space="preserve">ClimSight and WildfireGPT</w:t>
+      </w:r>
+      <w:r>
+        <w:rPr>
+          <w:rFonts w:ascii="Calibri" w:cs="Calibri" w:eastAsia="Calibri" w:hAnsi="Calibri"/>
+          <w:b w:val="false"/>
+          <w:bCs w:val="false"/>
+          <w:sz w:val="23"/>
+          <w:szCs w:val="23"/>
+        </w:rPr>
+        <w:t xml:space="preserve"> are conversational, but they ground in documents and let the model conclude.</w:t>
       </w:r>
     </w:p>
     <w:p>
@@ -1463,22 +1423,12 @@
       <w:r>
         <w:rPr>
           <w:rFonts w:ascii="Calibri" w:cs="Calibri" w:eastAsia="Calibri" w:hAnsi="Calibri"/>
-          <w:b/>
-          <w:bCs/>
-          <w:sz w:val="23"/>
-          <w:szCs w:val="23"/>
-        </w:rPr>
-        <w:t xml:space="preserve">O3</w:t>
-      </w:r>
-      <w:r>
-        <w:rPr>
-          <w:rFonts w:ascii="Calibri" w:cs="Calibri" w:eastAsia="Calibri" w:hAnsi="Calibri"/>
-          <w:b w:val="false"/>
-          <w:bCs w:val="false"/>
-          <w:sz w:val="23"/>
-          <w:szCs w:val="23"/>
-        </w:rPr>
-        <w:t xml:space="preserve">, the other research one — record every number with its source before it is used, and mechanically delete any number in the answer that is not in that record.</w:t>
+          <w:b w:val="false"/>
+          <w:bCs w:val="false"/>
+          <w:sz w:val="23"/>
+          <w:szCs w:val="23"/>
+        </w:rPr>
+        <w:t xml:space="preserve">Nobody has the bottom row.</w:t>
       </w:r>
     </w:p>
     <w:p>
@@ -1488,77 +1438,22 @@
       <w:r>
         <w:rPr>
           <w:rFonts w:ascii="Calibri" w:cs="Calibri" w:eastAsia="Calibri" w:hAnsi="Calibri"/>
-          <w:b/>
-          <w:bCs/>
-          <w:sz w:val="23"/>
-          <w:szCs w:val="23"/>
-        </w:rPr>
-        <w:t xml:space="preserve">O4</w:t>
-      </w:r>
-      <w:r>
-        <w:rPr>
-          <w:rFonts w:ascii="Calibri" w:cs="Calibri" w:eastAsia="Calibri" w:hAnsi="Calibri"/>
-          <w:b w:val="false"/>
-          <w:bCs w:val="false"/>
-          <w:sz w:val="23"/>
-          <w:szCs w:val="23"/>
-        </w:rPr>
-        <w:t xml:space="preserve">, work end to end in Indian languages. </w:t>
-      </w:r>
-      <w:r>
-        <w:rPr>
-          <w:rFonts w:ascii="Calibri" w:cs="Calibri" w:eastAsia="Calibri" w:hAnsi="Calibri"/>
-          <w:b/>
-          <w:bCs/>
-          <w:sz w:val="23"/>
-          <w:szCs w:val="23"/>
-        </w:rPr>
-        <w:t xml:space="preserve">O5</w:t>
-      </w:r>
-      <w:r>
-        <w:rPr>
-          <w:rFonts w:ascii="Calibri" w:cs="Calibri" w:eastAsia="Calibri" w:hAnsi="Calibri"/>
-          <w:b w:val="false"/>
-          <w:bCs w:val="false"/>
-          <w:sz w:val="23"/>
-          <w:szCs w:val="23"/>
-        </w:rPr>
-        <w:t xml:space="preserve">, always answer honestly when sources fail, and say when the answer is degraded. </w:t>
-      </w:r>
-      <w:r>
-        <w:rPr>
-          <w:rFonts w:ascii="Calibri" w:cs="Calibri" w:eastAsia="Calibri" w:hAnsi="Calibri"/>
-          <w:b/>
-          <w:bCs/>
-          <w:sz w:val="23"/>
-          <w:szCs w:val="23"/>
-        </w:rPr>
-        <w:t xml:space="preserve">O6</w:t>
-      </w:r>
-      <w:r>
-        <w:rPr>
-          <w:rFonts w:ascii="Calibri" w:cs="Calibri" w:eastAsia="Calibri" w:hAnsi="Calibri"/>
-          <w:b w:val="false"/>
-          <w:bCs w:val="false"/>
-          <w:sz w:val="23"/>
-          <w:szCs w:val="23"/>
-        </w:rPr>
-        <w:t xml:space="preserve">, evaluate at the level the user acts on — the verdict.</w:t>
-      </w:r>
-    </w:p>
-    <w:p>
-      <w:pPr>
-        <w:spacing w:after="140" w:line="300"/>
-      </w:pPr>
-      <w:r>
-        <w:rPr>
-          <w:rFonts w:ascii="Calibri" w:cs="Calibri" w:eastAsia="Calibri" w:hAnsi="Calibri"/>
-          <w:b/>
-          <w:bCs/>
-          <w:sz w:val="23"/>
-          <w:szCs w:val="23"/>
-        </w:rPr>
-        <w:t xml:space="preserve">O2 and O3 are the contribution. The rest is good engineering.</w:t>
+          <w:b w:val="false"/>
+          <w:bCs w:val="false"/>
+          <w:sz w:val="23"/>
+          <w:szCs w:val="23"/>
+        </w:rPr>
+        <w:t xml:space="preserve">So the gap: </w:t>
+      </w:r>
+      <w:r>
+        <w:rPr>
+          <w:rFonts w:ascii="Calibri" w:cs="Calibri" w:eastAsia="Calibri" w:hAnsi="Calibri"/>
+          <w:b/>
+          <w:bCs/>
+          <w:sz w:val="23"/>
+          <w:szCs w:val="23"/>
+        </w:rPr>
+        <w:t xml:space="preserve">no published system lets a fisherman ask one question in his own language and receive a single operational decision — safety, fishing and border together — that is provably derived from official products rather than generated by a model.</w:t>
       </w:r>
     </w:p>
     <w:p>
@@ -1578,7 +1473,7 @@
           <w:sz w:val="20"/>
           <w:szCs w:val="20"/>
         </w:rPr>
-        <w:t xml:space="preserve">Go fast here. Six items, one line each. The last line is the one that matters — it tells her where to look for novelty.</w:t>
+        <w:t xml:space="preserve">Walk the table row by row with your hand. Pause after “Nobody has the bottom row.” This is the 5-mark research-gap slide.</w:t>
       </w:r>
     </w:p>
     <w:p>
@@ -1605,7 +1500,7 @@
           <w:sz w:val="21"/>
           <w:szCs w:val="21"/>
         </w:rPr>
-        <w:t xml:space="preserve">“Here is how it is built.”</w:t>
+        <w:t xml:space="preserve">“That breaks down into six specific gaps, and each one becomes an objective.”</w:t>
       </w:r>
     </w:p>
     <w:p>
@@ -1619,10 +1514,10 @@
           <w:b/>
           <w:bCs/>
           <w:color w:val="FFFFFF"/>
-          <w:sz w:val="24"/>
-          <w:szCs w:val="24"/>
-        </w:rPr>
-        <w:t xml:space="preserve">  SLIDE 7  —  Architecture</w:t>
+          <w:sz w:val="23"/>
+          <w:szCs w:val="23"/>
+        </w:rPr>
+        <w:t xml:space="preserve">  SLIDE 7  —  Research gaps and objectives</w:t>
       </w:r>
       <w:r>
         <w:rPr>
@@ -1633,7 +1528,7 @@
           <w:sz w:val="22"/>
           <w:szCs w:val="22"/>
         </w:rPr>
-        <w:t xml:space="preserve">          1:30  </w:t>
+        <w:t xml:space="preserve">        1:15  </w:t>
       </w:r>
     </w:p>
     <w:p>
@@ -1648,17 +1543,7 @@
           <w:sz w:val="23"/>
           <w:szCs w:val="23"/>
         </w:rPr>
-        <w:t xml:space="preserve">Five steps, top to bottom. </w:t>
-      </w:r>
-      <w:r>
-        <w:rPr>
-          <w:rFonts w:ascii="Calibri" w:cs="Calibri" w:eastAsia="Calibri" w:hAnsi="Calibri"/>
-          <w:b/>
-          <w:bCs/>
-          <w:sz w:val="23"/>
-          <w:szCs w:val="23"/>
-        </w:rPr>
-        <w:t xml:space="preserve">Blue means AI. Red means no AI.</w:t>
+        <w:t xml:space="preserve">On the left, each gap with its evidence from the survey. On the right, the objective that answers it.</w:t>
       </w:r>
     </w:p>
     <w:p>
@@ -1673,27 +1558,67 @@
           <w:sz w:val="23"/>
           <w:szCs w:val="23"/>
         </w:rPr>
-        <w:t xml:space="preserve">Step one, the model reads the question — language, place, day, boat size. Step two, three collectors fetch data </w:t>
-      </w:r>
-      <w:r>
-        <w:rPr>
-          <w:rFonts w:ascii="Calibri" w:cs="Calibri" w:eastAsia="Calibri" w:hAnsi="Calibri"/>
-          <w:b/>
-          <w:bCs/>
-          <w:sz w:val="23"/>
-          <w:szCs w:val="23"/>
-        </w:rPr>
-        <w:t xml:space="preserve">at the same time</w:t>
-      </w:r>
-      <w:r>
-        <w:rPr>
-          <w:rFonts w:ascii="Calibri" w:cs="Calibri" w:eastAsia="Calibri" w:hAnsi="Calibri"/>
-          <w:b w:val="false"/>
-          <w:bCs w:val="false"/>
-          <w:sz w:val="23"/>
-          <w:szCs w:val="23"/>
-        </w:rPr>
-        <w:t xml:space="preserve">: sea conditions, maps and borders, fish data. Running them in parallel is what keeps it fast.</w:t>
+        <w:t xml:space="preserve">Fragmentation and broadcast-only, </w:t>
+      </w:r>
+      <w:r>
+        <w:rPr>
+          <w:rFonts w:ascii="Calibri" w:cs="Calibri" w:eastAsia="Calibri" w:hAnsi="Calibri"/>
+          <w:b/>
+          <w:bCs/>
+          <w:sz w:val="23"/>
+          <w:szCs w:val="23"/>
+        </w:rPr>
+        <w:t xml:space="preserve">G1 and G2</w:t>
+      </w:r>
+      <w:r>
+        <w:rPr>
+          <w:rFonts w:ascii="Calibri" w:cs="Calibri" w:eastAsia="Calibri" w:hAnsi="Calibri"/>
+          <w:b w:val="false"/>
+          <w:bCs w:val="false"/>
+          <w:sz w:val="23"/>
+          <w:szCs w:val="23"/>
+        </w:rPr>
+        <w:t xml:space="preserve">, become </w:t>
+      </w:r>
+      <w:r>
+        <w:rPr>
+          <w:rFonts w:ascii="Calibri" w:cs="Calibri" w:eastAsia="Calibri" w:hAnsi="Calibri"/>
+          <w:b/>
+          <w:bCs/>
+          <w:sz w:val="23"/>
+          <w:szCs w:val="23"/>
+        </w:rPr>
+        <w:t xml:space="preserve">O1</w:t>
+      </w:r>
+      <w:r>
+        <w:rPr>
+          <w:rFonts w:ascii="Calibri" w:cs="Calibri" w:eastAsia="Calibri" w:hAnsi="Calibri"/>
+          <w:b w:val="false"/>
+          <w:bCs w:val="false"/>
+          <w:sz w:val="23"/>
+          <w:szCs w:val="23"/>
+        </w:rPr>
+        <w:t xml:space="preserve">: one conversational interface across all three products. Language depth becomes </w:t>
+      </w:r>
+      <w:r>
+        <w:rPr>
+          <w:rFonts w:ascii="Calibri" w:cs="Calibri" w:eastAsia="Calibri" w:hAnsi="Calibri"/>
+          <w:b/>
+          <w:bCs/>
+          <w:sz w:val="23"/>
+          <w:szCs w:val="23"/>
+        </w:rPr>
+        <w:t xml:space="preserve">O4</w:t>
+      </w:r>
+      <w:r>
+        <w:rPr>
+          <w:rFonts w:ascii="Calibri" w:cs="Calibri" w:eastAsia="Calibri" w:hAnsi="Calibri"/>
+          <w:b w:val="false"/>
+          <w:bCs w:val="false"/>
+          <w:sz w:val="23"/>
+          <w:szCs w:val="23"/>
+        </w:rPr>
+        <w:t xml:space="preserve">.</w:t>
       </w:r>
     </w:p>
     <w:p>
@@ -1703,22 +1628,62 @@
       <w:r>
         <w:rPr>
           <w:rFonts w:ascii="Calibri" w:cs="Calibri" w:eastAsia="Calibri" w:hAnsi="Calibri"/>
-          <w:b w:val="false"/>
-          <w:bCs w:val="false"/>
-          <w:sz w:val="23"/>
-          <w:szCs w:val="23"/>
-        </w:rPr>
-        <w:t xml:space="preserve">This red line is the design. </w:t>
-      </w:r>
-      <w:r>
-        <w:rPr>
-          <w:rFonts w:ascii="Calibri" w:cs="Calibri" w:eastAsia="Calibri" w:hAnsi="Calibri"/>
-          <w:b/>
-          <w:bCs/>
-          <w:sz w:val="23"/>
-          <w:szCs w:val="23"/>
-        </w:rPr>
-        <w:t xml:space="preserve">Below it there is no AI at all.</w:t>
+          <w:b/>
+          <w:bCs/>
+          <w:sz w:val="23"/>
+          <w:szCs w:val="23"/>
+        </w:rPr>
+        <w:t xml:space="preserve">G4 and G5 are the important ones.</w:t>
+      </w:r>
+      <w:r>
+        <w:rPr>
+          <w:rFonts w:ascii="Calibri" w:cs="Calibri" w:eastAsia="Calibri" w:hAnsi="Calibri"/>
+          <w:b w:val="false"/>
+          <w:bCs w:val="false"/>
+          <w:sz w:val="23"/>
+          <w:szCs w:val="23"/>
+        </w:rPr>
+        <w:t xml:space="preserve"> Grounding is only at document level and hallucination is unsolved — so </w:t>
+      </w:r>
+      <w:r>
+        <w:rPr>
+          <w:rFonts w:ascii="Calibri" w:cs="Calibri" w:eastAsia="Calibri" w:hAnsi="Calibri"/>
+          <w:b/>
+          <w:bCs/>
+          <w:sz w:val="23"/>
+          <w:szCs w:val="23"/>
+        </w:rPr>
+        <w:t xml:space="preserve">O3</w:t>
+      </w:r>
+      <w:r>
+        <w:rPr>
+          <w:rFonts w:ascii="Calibri" w:cs="Calibri" w:eastAsia="Calibri" w:hAnsi="Calibri"/>
+          <w:b w:val="false"/>
+          <w:bCs w:val="false"/>
+          <w:sz w:val="23"/>
+          <w:szCs w:val="23"/>
+        </w:rPr>
+        <w:t xml:space="preserve">, an evidence ledger and a verifier that deletes any unsupported number. And no architecture keeps safety out of the model — so </w:t>
+      </w:r>
+      <w:r>
+        <w:rPr>
+          <w:rFonts w:ascii="Calibri" w:cs="Calibri" w:eastAsia="Calibri" w:hAnsi="Calibri"/>
+          <w:b/>
+          <w:bCs/>
+          <w:sz w:val="23"/>
+          <w:szCs w:val="23"/>
+        </w:rPr>
+        <w:t xml:space="preserve">O2</w:t>
+      </w:r>
+      <w:r>
+        <w:rPr>
+          <w:rFonts w:ascii="Calibri" w:cs="Calibri" w:eastAsia="Calibri" w:hAnsi="Calibri"/>
+          <w:b w:val="false"/>
+          <w:bCs w:val="false"/>
+          <w:sz w:val="23"/>
+          <w:szCs w:val="23"/>
+        </w:rPr>
+        <w:t xml:space="preserve">, a deterministic, tested safety verdict that sits structurally outside it.</w:t>
       </w:r>
     </w:p>
     <w:p>
@@ -1728,12 +1693,62 @@
       <w:r>
         <w:rPr>
           <w:rFonts w:ascii="Calibri" w:cs="Calibri" w:eastAsia="Calibri" w:hAnsi="Calibri"/>
-          <w:b w:val="false"/>
-          <w:bCs w:val="false"/>
-          <w:sz w:val="23"/>
-          <w:szCs w:val="23"/>
-        </w:rPr>
-        <w:t xml:space="preserve">Step three is the safety decision — seven checks against a threshold table for that size of boat. Pure Python. A hundred and fifteen unit tests. Under fifty milliseconds.</w:t>
+          <w:b/>
+          <w:bCs/>
+          <w:sz w:val="23"/>
+          <w:szCs w:val="23"/>
+        </w:rPr>
+        <w:t xml:space="preserve">G6</w:t>
+      </w:r>
+      <w:r>
+        <w:rPr>
+          <w:rFonts w:ascii="Calibri" w:cs="Calibri" w:eastAsia="Calibri" w:hAnsi="Calibri"/>
+          <w:b w:val="false"/>
+          <w:bCs w:val="false"/>
+          <w:sz w:val="23"/>
+          <w:szCs w:val="23"/>
+        </w:rPr>
+        <w:t xml:space="preserve">, evaluation that stops at RMSE, becomes </w:t>
+      </w:r>
+      <w:r>
+        <w:rPr>
+          <w:rFonts w:ascii="Calibri" w:cs="Calibri" w:eastAsia="Calibri" w:hAnsi="Calibri"/>
+          <w:b/>
+          <w:bCs/>
+          <w:sz w:val="23"/>
+          <w:szCs w:val="23"/>
+        </w:rPr>
+        <w:t xml:space="preserve">O6</w:t>
+      </w:r>
+      <w:r>
+        <w:rPr>
+          <w:rFonts w:ascii="Calibri" w:cs="Calibri" w:eastAsia="Calibri" w:hAnsi="Calibri"/>
+          <w:b w:val="false"/>
+          <w:bCs w:val="false"/>
+          <w:sz w:val="23"/>
+          <w:szCs w:val="23"/>
+        </w:rPr>
+        <w:t xml:space="preserve">: evaluate the verdict. And because connectivity at sea is unreliable, </w:t>
+      </w:r>
+      <w:r>
+        <w:rPr>
+          <w:rFonts w:ascii="Calibri" w:cs="Calibri" w:eastAsia="Calibri" w:hAnsi="Calibri"/>
+          <w:b/>
+          <w:bCs/>
+          <w:sz w:val="23"/>
+          <w:szCs w:val="23"/>
+        </w:rPr>
+        <w:t xml:space="preserve">O5</w:t>
+      </w:r>
+      <w:r>
+        <w:rPr>
+          <w:rFonts w:ascii="Calibri" w:cs="Calibri" w:eastAsia="Calibri" w:hAnsi="Calibri"/>
+          <w:b w:val="false"/>
+          <w:bCs w:val="false"/>
+          <w:sz w:val="23"/>
+          <w:szCs w:val="23"/>
+        </w:rPr>
+        <w:t xml:space="preserve">: always answer, and say when the answer is degraded.</w:t>
       </w:r>
     </w:p>
     <w:p>
@@ -1743,82 +1758,12 @@
       <w:r>
         <w:rPr>
           <w:rFonts w:ascii="Calibri" w:cs="Calibri" w:eastAsia="Calibri" w:hAnsi="Calibri"/>
-          <w:b w:val="false"/>
-          <w:bCs w:val="false"/>
-          <w:sz w:val="23"/>
-          <w:szCs w:val="23"/>
-        </w:rPr>
-        <w:t xml:space="preserve">Step four, the model writes the answer in the user's language. Step five, </w:t>
-      </w:r>
-      <w:r>
-        <w:rPr>
-          <w:rFonts w:ascii="Calibri" w:cs="Calibri" w:eastAsia="Calibri" w:hAnsi="Calibri"/>
-          <w:b/>
-          <w:bCs/>
-          <w:sz w:val="23"/>
-          <w:szCs w:val="23"/>
-        </w:rPr>
-        <w:t xml:space="preserve">every number in that answer is traced back to the ledger</w:t>
-      </w:r>
-      <w:r>
-        <w:rPr>
-          <w:rFonts w:ascii="Calibri" w:cs="Calibri" w:eastAsia="Calibri" w:hAnsi="Calibri"/>
-          <w:b w:val="false"/>
-          <w:bCs w:val="false"/>
-          <w:sz w:val="23"/>
-          <w:szCs w:val="23"/>
-        </w:rPr>
-        <w:t xml:space="preserve"> — anything unsupported is removed and the answer rewritten.</w:t>
-      </w:r>
-    </w:p>
-    <w:p>
-      <w:pPr>
-        <w:spacing w:after="140" w:line="300"/>
-      </w:pPr>
-      <w:r>
-        <w:rPr>
-          <w:rFonts w:ascii="Calibri" w:cs="Calibri" w:eastAsia="Calibri" w:hAnsi="Calibri"/>
-          <w:b w:val="false"/>
-          <w:bCs w:val="false"/>
-          <w:sz w:val="23"/>
-          <w:szCs w:val="23"/>
-        </w:rPr>
-        <w:t xml:space="preserve">On the right is the </w:t>
-      </w:r>
-      <w:r>
-        <w:rPr>
-          <w:rFonts w:ascii="Calibri" w:cs="Calibri" w:eastAsia="Calibri" w:hAnsi="Calibri"/>
-          <w:b/>
-          <w:bCs/>
-          <w:sz w:val="23"/>
-          <w:szCs w:val="23"/>
-        </w:rPr>
-        <w:t xml:space="preserve">evidence ledger</w:t>
-      </w:r>
-      <w:r>
-        <w:rPr>
-          <w:rFonts w:ascii="Calibri" w:cs="Calibri" w:eastAsia="Calibri" w:hAnsi="Calibri"/>
-          <w:b w:val="false"/>
-          <w:bCs w:val="false"/>
-          <w:sz w:val="23"/>
-          <w:szCs w:val="23"/>
-        </w:rPr>
-        <w:t xml:space="preserve"> — every number the system finds, with where it came from and how fresh it is. A typical question records about a hundred and thirty numbers, and the user sees them under every answer.</w:t>
-      </w:r>
-    </w:p>
-    <w:p>
-      <w:pPr>
-        <w:spacing w:after="140" w:line="300"/>
-      </w:pPr>
-      <w:r>
-        <w:rPr>
-          <w:rFonts w:ascii="Calibri" w:cs="Calibri" w:eastAsia="Calibri" w:hAnsi="Calibri"/>
-          <w:b/>
-          <w:bCs/>
-          <w:sz w:val="23"/>
-          <w:szCs w:val="23"/>
-        </w:rPr>
-        <w:t xml:space="preserve">The model never computes the verdict, never adjusts it, never softens it.</w:t>
+          <w:b/>
+          <w:bCs/>
+          <w:sz w:val="23"/>
+          <w:szCs w:val="23"/>
+        </w:rPr>
+        <w:t xml:space="preserve">O2 and O3 are my research contribution.</w:t>
       </w:r>
     </w:p>
     <w:p>
@@ -1838,7 +1783,7 @@
           <w:sz w:val="20"/>
           <w:szCs w:val="20"/>
         </w:rPr>
-        <w:t xml:space="preserve">Trace the figure with your finger as you go down it. Stop and tap the red dashed line when you say “below it there is no AI at all.”</w:t>
+        <w:t xml:space="preserve">Trace one or two rows across the table with your hand so the gap → evidence → objective link is visible.</w:t>
       </w:r>
     </w:p>
     <w:p>
@@ -1865,7 +1810,7 @@
           <w:sz w:val="21"/>
           <w:szCs w:val="21"/>
         </w:rPr>
-        <w:t xml:space="preserve">“One rule shapes that whole safety engine.”</w:t>
+        <w:t xml:space="preserve">“Here is how the methodology delivers them.”</w:t>
       </w:r>
     </w:p>
     <w:p>
@@ -1879,10 +1824,10 @@
           <w:b/>
           <w:bCs/>
           <w:color w:val="FFFFFF"/>
-          <w:sz w:val="24"/>
-          <w:szCs w:val="24"/>
-        </w:rPr>
-        <w:t xml:space="preserve">  SLIDE 8  —  The rule that shapes everything</w:t>
+          <w:sz w:val="23"/>
+          <w:szCs w:val="23"/>
+        </w:rPr>
+        <w:t xml:space="preserve">  SLIDE 8  —  Proposed methodology I — architecture and techniques</w:t>
       </w:r>
       <w:r>
         <w:rPr>
@@ -1893,7 +1838,7 @@
           <w:sz w:val="22"/>
           <w:szCs w:val="22"/>
         </w:rPr>
-        <w:t xml:space="preserve">          1:00  </w:t>
+        <w:t xml:space="preserve">        1:15  </w:t>
       </w:r>
     </w:p>
     <w:p>
@@ -1903,12 +1848,22 @@
       <w:r>
         <w:rPr>
           <w:rFonts w:ascii="Calibri" w:cs="Calibri" w:eastAsia="Calibri" w:hAnsi="Calibri"/>
-          <w:b/>
-          <w:bCs/>
-          <w:sz w:val="23"/>
-          <w:szCs w:val="23"/>
-        </w:rPr>
-        <w:t xml:space="preserve">The worst parameter decides. Never an average.</w:t>
+          <w:b w:val="false"/>
+          <w:bCs w:val="false"/>
+          <w:sz w:val="23"/>
+          <w:szCs w:val="23"/>
+        </w:rPr>
+        <w:t xml:space="preserve">Five steps. The diagram on the right is the same pipeline — </w:t>
+      </w:r>
+      <w:r>
+        <w:rPr>
+          <w:rFonts w:ascii="Calibri" w:cs="Calibri" w:eastAsia="Calibri" w:hAnsi="Calibri"/>
+          <w:b/>
+          <w:bCs/>
+          <w:sz w:val="23"/>
+          <w:szCs w:val="23"/>
+        </w:rPr>
+        <w:t xml:space="preserve">blue is AI, red is no AI.</w:t>
       </w:r>
     </w:p>
     <w:p>
@@ -1923,7 +1878,7 @@
           <w:sz w:val="23"/>
           <w:szCs w:val="23"/>
         </w:rPr>
-        <w:t xml:space="preserve">Seven checks — wave height, wind, steepness, lightning, cyclone, visibility. If any one of them says do not sail, the verdict is do not sail, however calm the rest look.</w:t>
+        <w:t xml:space="preserve">Step one, an LLM planner turns the question into a typed task graph, validated against a schema. Step two, three specialists fetch data in parallel through LangGraph, with a cache, live, stale, snapshot fallback chain.</w:t>
       </w:r>
     </w:p>
     <w:p>
@@ -1938,7 +1893,17 @@
           <w:sz w:val="23"/>
           <w:szCs w:val="23"/>
         </w:rPr>
-        <w:t xml:space="preserve">Averaging six parameters is how you build a system that sends a boat out under a thunderstorm because the waves happened to be flat.</w:t>
+        <w:t xml:space="preserve">Below the red line there is no model.</w:t>
+      </w:r>
+      <w:r>
+        <w:rPr>
+          <w:rFonts w:ascii="Calibri" w:cs="Calibri" w:eastAsia="Calibri" w:hAnsi="Calibri"/>
+          <w:b w:val="false"/>
+          <w:bCs w:val="false"/>
+          <w:sz w:val="23"/>
+          <w:szCs w:val="23"/>
+        </w:rPr>
+        <w:t xml:space="preserve"> Step three is the decision: seven parameters, three vessel classes, the worst parameter wins — never an average. Under fifty milliseconds, 115 unit tests.</w:t>
       </w:r>
     </w:p>
     <w:p>
@@ -1953,7 +1918,27 @@
           <w:sz w:val="23"/>
           <w:szCs w:val="23"/>
         </w:rPr>
-        <w:t xml:space="preserve">And missing data can never produce a “go”. If I do not have wind, I do not say go.</w:t>
+        <w:t xml:space="preserve">Step four, the model explains the verdict in the user's language. Step five, every number in that answer, in Latin or Indic digits, is matched against the </w:t>
+      </w:r>
+      <w:r>
+        <w:rPr>
+          <w:rFonts w:ascii="Calibri" w:cs="Calibri" w:eastAsia="Calibri" w:hAnsi="Calibri"/>
+          <w:b/>
+          <w:bCs/>
+          <w:sz w:val="23"/>
+          <w:szCs w:val="23"/>
+        </w:rPr>
+        <w:t xml:space="preserve">evidence ledger</w:t>
+      </w:r>
+      <w:r>
+        <w:rPr>
+          <w:rFonts w:ascii="Calibri" w:cs="Calibri" w:eastAsia="Calibri" w:hAnsi="Calibri"/>
+          <w:b w:val="false"/>
+          <w:bCs w:val="false"/>
+          <w:sz w:val="23"/>
+          <w:szCs w:val="23"/>
+        </w:rPr>
+        <w:t xml:space="preserve">; anything unsupported is stripped and the answer regenerated.</w:t>
       </w:r>
     </w:p>
     <w:p>
@@ -1968,27 +1953,27 @@
           <w:sz w:val="23"/>
           <w:szCs w:val="23"/>
         </w:rPr>
-        <w:t xml:space="preserve">One honest caveat. </w:t>
-      </w:r>
-      <w:r>
-        <w:rPr>
-          <w:rFonts w:ascii="Calibri" w:cs="Calibri" w:eastAsia="Calibri" w:hAnsi="Calibri"/>
-          <w:b/>
-          <w:bCs/>
-          <w:sz w:val="23"/>
-          <w:szCs w:val="23"/>
-        </w:rPr>
-        <w:t xml:space="preserve">These numbers are provisional.</w:t>
-      </w:r>
-      <w:r>
-        <w:rPr>
-          <w:rFonts w:ascii="Calibri" w:cs="Calibri" w:eastAsia="Calibri" w:hAnsi="Calibri"/>
-          <w:b w:val="false"/>
-          <w:bCs w:val="false"/>
-          <w:sz w:val="23"/>
-          <w:szCs w:val="23"/>
-        </w:rPr>
-        <w:t xml:space="preserve"> They are sensible starting values, not INCOIS's published criteria. I know the calibration target now — the Boat Safety Index I mentioned earlier — but INCOIS does not publish the numbers behind it. That is one of my three asks at the end.</w:t>
+        <w:t xml:space="preserve">The ledger is what makes that possible: </w:t>
+      </w:r>
+      <w:r>
+        <w:rPr>
+          <w:rFonts w:ascii="Calibri" w:cs="Calibri" w:eastAsia="Calibri" w:hAnsi="Calibri"/>
+          <w:b/>
+          <w:bCs/>
+          <w:sz w:val="23"/>
+          <w:szCs w:val="23"/>
+        </w:rPr>
+        <w:t xml:space="preserve">no tool returns a bare number</w:t>
+      </w:r>
+      <w:r>
+        <w:rPr>
+          <w:rFonts w:ascii="Calibri" w:cs="Calibri" w:eastAsia="Calibri" w:hAnsi="Calibri"/>
+          <w:b w:val="false"/>
+          <w:bCs w:val="false"/>
+          <w:sz w:val="23"/>
+          <w:szCs w:val="23"/>
+        </w:rPr>
+        <w:t xml:space="preserve"> — every value carries its source, time, distance and confidence.</w:t>
       </w:r>
     </w:p>
     <w:p>
@@ -2008,7 +1993,7 @@
           <w:sz w:val="20"/>
           <w:szCs w:val="20"/>
         </w:rPr>
-        <w:t xml:space="preserve">Raising the caveat yourself is worth more than being caught by it. Say it plainly and move on — do not apologise for it.</w:t>
+        <w:t xml:space="preserve">Tap the red dashed line in the diagram when you say “below the red line there is no model.”</w:t>
       </w:r>
     </w:p>
     <w:p>
@@ -2035,7 +2020,7 @@
           <w:sz w:val="21"/>
           <w:szCs w:val="21"/>
         </w:rPr>
-        <w:t xml:space="preserve">“Last review, the question was: how often are you right. Here is the answer.”</w:t>
+        <w:t xml:space="preserve">“And the dataset behind it.”</w:t>
       </w:r>
     </w:p>
     <w:p>
@@ -2049,10 +2034,10 @@
           <w:b/>
           <w:bCs/>
           <w:color w:val="FFFFFF"/>
-          <w:sz w:val="24"/>
-          <w:szCs w:val="24"/>
-        </w:rPr>
-        <w:t xml:space="preserve">  SLIDE 9  —  How often is it right?</w:t>
+          <w:sz w:val="23"/>
+          <w:szCs w:val="23"/>
+        </w:rPr>
+        <w:t xml:space="preserve">  SLIDE 9  —  Proposed methodology II — dataset and tools</w:t>
       </w:r>
       <w:r>
         <w:rPr>
@@ -2063,7 +2048,7 @@
           <w:sz w:val="22"/>
           <w:szCs w:val="22"/>
         </w:rPr>
-        <w:t xml:space="preserve">          1:30  </w:t>
+        <w:t xml:space="preserve">        1:30  </w:t>
       </w:r>
     </w:p>
     <w:p>
@@ -2073,32 +2058,12 @@
       <w:r>
         <w:rPr>
           <w:rFonts w:ascii="Calibri" w:cs="Calibri" w:eastAsia="Calibri" w:hAnsi="Calibri"/>
-          <w:b w:val="false"/>
-          <w:bCs w:val="false"/>
-          <w:sz w:val="23"/>
-          <w:szCs w:val="23"/>
-        </w:rPr>
-        <w:t xml:space="preserve">I ran the system over </w:t>
-      </w:r>
-      <w:r>
-        <w:rPr>
-          <w:rFonts w:ascii="Calibri" w:cs="Calibri" w:eastAsia="Calibri" w:hAnsi="Calibri"/>
-          <w:b/>
-          <w:bCs/>
-          <w:sz w:val="23"/>
-          <w:szCs w:val="23"/>
-        </w:rPr>
-        <w:t xml:space="preserve">92 mornings across five harbours</w:t>
-      </w:r>
-      <w:r>
-        <w:rPr>
-          <w:rFonts w:ascii="Calibri" w:cs="Calibri" w:eastAsia="Calibri" w:hAnsi="Calibri"/>
-          <w:b w:val="false"/>
-          <w:bCs w:val="false"/>
-          <w:sz w:val="23"/>
-          <w:szCs w:val="23"/>
-        </w:rPr>
-        <w:t xml:space="preserve"> — 460 harbour-mornings — through this year's south-west monsoon.</w:t>
+          <w:b/>
+          <w:bCs/>
+          <w:sz w:val="23"/>
+          <w:szCs w:val="23"/>
+        </w:rPr>
+        <w:t xml:space="preserve">Every source here was tested live before I wrote any code against it.</w:t>
       </w:r>
     </w:p>
     <w:p>
@@ -2108,52 +2073,102 @@
       <w:r>
         <w:rPr>
           <w:rFonts w:ascii="Calibri" w:cs="Calibri" w:eastAsia="Calibri" w:hAnsi="Calibri"/>
-          <w:b w:val="false"/>
-          <w:bCs w:val="false"/>
-          <w:sz w:val="23"/>
-          <w:szCs w:val="23"/>
-        </w:rPr>
-        <w:t xml:space="preserve">When it said “do not sail” the day before, it was right </w:t>
-      </w:r>
-      <w:r>
-        <w:rPr>
-          <w:rFonts w:ascii="Calibri" w:cs="Calibri" w:eastAsia="Calibri" w:hAnsi="Calibri"/>
-          <w:b/>
-          <w:bCs/>
-          <w:sz w:val="23"/>
-          <w:szCs w:val="23"/>
-        </w:rPr>
-        <w:t xml:space="preserve">93.9 %</w:t>
-      </w:r>
-      <w:r>
-        <w:rPr>
-          <w:rFonts w:ascii="Calibri" w:cs="Calibri" w:eastAsia="Calibri" w:hAnsi="Calibri"/>
-          <w:b w:val="false"/>
-          <w:bCs w:val="false"/>
-          <w:sz w:val="23"/>
-          <w:szCs w:val="23"/>
-        </w:rPr>
-        <w:t xml:space="preserve"> of the time. And only </w:t>
-      </w:r>
-      <w:r>
-        <w:rPr>
-          <w:rFonts w:ascii="Calibri" w:cs="Calibri" w:eastAsia="Calibri" w:hAnsi="Calibri"/>
-          <w:b/>
-          <w:bCs/>
-          <w:sz w:val="23"/>
-          <w:szCs w:val="23"/>
-        </w:rPr>
-        <w:t xml:space="preserve">3.1 %</w:t>
-      </w:r>
-      <w:r>
-        <w:rPr>
-          <w:rFonts w:ascii="Calibri" w:cs="Calibri" w:eastAsia="Calibri" w:hAnsi="Calibri"/>
-          <w:b w:val="false"/>
-          <w:bCs w:val="false"/>
-          <w:sz w:val="23"/>
-          <w:szCs w:val="23"/>
-        </w:rPr>
-        <w:t xml:space="preserve"> of its warnings wasted a good day. That second number matters as much as the first — you cannot keep telling a man not to work.</w:t>
+          <w:b/>
+          <w:bCs/>
+          <w:sz w:val="23"/>
+          <w:szCs w:val="23"/>
+        </w:rPr>
+        <w:t xml:space="preserve">Open-Meteo</w:t>
+      </w:r>
+      <w:r>
+        <w:rPr>
+          <w:rFonts w:ascii="Calibri" w:cs="Calibri" w:eastAsia="Calibri" w:hAnsi="Calibri"/>
+          <w:b w:val="false"/>
+          <w:bCs w:val="false"/>
+          <w:sz w:val="23"/>
+          <w:szCs w:val="23"/>
+        </w:rPr>
+        <w:t xml:space="preserve"> marine and weather is the primary source for waves, wind and visibility — hourly, free, no key. </w:t>
+      </w:r>
+      <w:r>
+        <w:rPr>
+          <w:rFonts w:ascii="Calibri" w:cs="Calibri" w:eastAsia="Calibri" w:hAnsi="Calibri"/>
+          <w:b/>
+          <w:bCs/>
+          <w:sz w:val="23"/>
+          <w:szCs w:val="23"/>
+        </w:rPr>
+        <w:t xml:space="preserve">INCOIS</w:t>
+      </w:r>
+      <w:r>
+        <w:rPr>
+          <w:rFonts w:ascii="Calibri" w:cs="Calibri" w:eastAsia="Calibri" w:hAnsi="Calibri"/>
+          <w:b w:val="false"/>
+          <w:bCs w:val="false"/>
+          <w:sz w:val="23"/>
+          <w:szCs w:val="23"/>
+        </w:rPr>
+        <w:t xml:space="preserve"> provides the daily fishing-zone advisories, plus 14 sectors and 1,223 named landing centres. </w:t>
+      </w:r>
+      <w:r>
+        <w:rPr>
+          <w:rFonts w:ascii="Calibri" w:cs="Calibri" w:eastAsia="Calibri" w:hAnsi="Calibri"/>
+          <w:b/>
+          <w:bCs/>
+          <w:sz w:val="23"/>
+          <w:szCs w:val="23"/>
+        </w:rPr>
+        <w:t xml:space="preserve">Marine Regions</w:t>
+      </w:r>
+      <w:r>
+        <w:rPr>
+          <w:rFonts w:ascii="Calibri" w:cs="Calibri" w:eastAsia="Calibri" w:hAnsi="Calibri"/>
+          <w:b w:val="false"/>
+          <w:bCs w:val="false"/>
+          <w:sz w:val="23"/>
+          <w:szCs w:val="23"/>
+        </w:rPr>
+        <w:t xml:space="preserve"> provides India's EEZ and the IMBL. Chlorophyll comes from </w:t>
+      </w:r>
+      <w:r>
+        <w:rPr>
+          <w:rFonts w:ascii="Calibri" w:cs="Calibri" w:eastAsia="Calibri" w:hAnsi="Calibri"/>
+          <w:b/>
+          <w:bCs/>
+          <w:sz w:val="23"/>
+          <w:szCs w:val="23"/>
+        </w:rPr>
+        <w:t xml:space="preserve">NOAA</w:t>
+      </w:r>
+      <w:r>
+        <w:rPr>
+          <w:rFonts w:ascii="Calibri" w:cs="Calibri" w:eastAsia="Calibri" w:hAnsi="Calibri"/>
+          <w:b w:val="false"/>
+          <w:bCs w:val="false"/>
+          <w:sz w:val="23"/>
+          <w:szCs w:val="23"/>
+        </w:rPr>
+        <w:t xml:space="preserve"> and </w:t>
+      </w:r>
+      <w:r>
+        <w:rPr>
+          <w:rFonts w:ascii="Calibri" w:cs="Calibri" w:eastAsia="Calibri" w:hAnsi="Calibri"/>
+          <w:b/>
+          <w:bCs/>
+          <w:sz w:val="23"/>
+          <w:szCs w:val="23"/>
+        </w:rPr>
+        <w:t xml:space="preserve">Copernicus</w:t>
+      </w:r>
+      <w:r>
+        <w:rPr>
+          <w:rFonts w:ascii="Calibri" w:cs="Calibri" w:eastAsia="Calibri" w:hAnsi="Calibri"/>
+          <w:b w:val="false"/>
+          <w:bCs w:val="false"/>
+          <w:sz w:val="23"/>
+          <w:szCs w:val="23"/>
+        </w:rPr>
+        <w:t xml:space="preserve">, where I have an account.</w:t>
       </w:r>
     </w:p>
     <w:p>
@@ -2168,37 +2183,47 @@
           <w:sz w:val="23"/>
           <w:szCs w:val="23"/>
         </w:rPr>
-        <w:t xml:space="preserve">And this is the part I am most pleased with. There were </w:t>
-      </w:r>
-      <w:r>
-        <w:rPr>
-          <w:rFonts w:ascii="Calibri" w:cs="Calibri" w:eastAsia="Calibri" w:hAnsi="Calibri"/>
-          <w:b/>
-          <w:bCs/>
-          <w:sz w:val="23"/>
-          <w:szCs w:val="23"/>
-        </w:rPr>
-        <w:t xml:space="preserve">two misses. Both were graded caution.</w:t>
-      </w:r>
-      <w:r>
-        <w:rPr>
-          <w:rFonts w:ascii="Calibri" w:cs="Calibri" w:eastAsia="Calibri" w:hAnsi="Calibri"/>
-          <w:b w:val="false"/>
-          <w:bCs w:val="false"/>
-          <w:sz w:val="23"/>
-          <w:szCs w:val="23"/>
-        </w:rPr>
-        <w:t xml:space="preserve"> Not one dangerous morning was ever graded “go”. That is exactly the asymmetry the worst-of rule is designed to produce — </w:t>
-      </w:r>
-      <w:r>
-        <w:rPr>
-          <w:rFonts w:ascii="Calibri" w:cs="Calibri" w:eastAsia="Calibri" w:hAnsi="Calibri"/>
-          <w:b/>
-          <w:bCs/>
-          <w:sz w:val="23"/>
-          <w:szCs w:val="23"/>
-        </w:rPr>
-        <w:t xml:space="preserve">it fails toward safety.</w:t>
+        <w:t xml:space="preserve">Two red rows, honestly. </w:t>
+      </w:r>
+      <w:r>
+        <w:rPr>
+          <w:rFonts w:ascii="Calibri" w:cs="Calibri" w:eastAsia="Calibri" w:hAnsi="Calibri"/>
+          <w:b/>
+          <w:bCs/>
+          <w:sz w:val="23"/>
+          <w:szCs w:val="23"/>
+        </w:rPr>
+        <w:t xml:space="preserve">IMD</w:t>
+      </w:r>
+      <w:r>
+        <w:rPr>
+          <w:rFonts w:ascii="Calibri" w:cs="Calibri" w:eastAsia="Calibri" w:hAnsi="Calibri"/>
+          <w:b w:val="false"/>
+          <w:bCs w:val="false"/>
+          <w:sz w:val="23"/>
+          <w:szCs w:val="23"/>
+        </w:rPr>
+        <w:t xml:space="preserve"> — cyclone and lightning — needs an API key; without it, two of the seven safety checks have no data. And </w:t>
+      </w:r>
+      <w:r>
+        <w:rPr>
+          <w:rFonts w:ascii="Calibri" w:cs="Calibri" w:eastAsia="Calibri" w:hAnsi="Calibri"/>
+          <w:b/>
+          <w:bCs/>
+          <w:sz w:val="23"/>
+          <w:szCs w:val="23"/>
+        </w:rPr>
+        <w:t xml:space="preserve">INCOIS's open ERDDAP archive is stale</w:t>
+      </w:r>
+      <w:r>
+        <w:rPr>
+          <w:rFonts w:ascii="Calibri" w:cs="Calibri" w:eastAsia="Calibri" w:hAnsi="Calibri"/>
+          <w:b w:val="false"/>
+          <w:bCs w:val="false"/>
+          <w:sz w:val="23"/>
+          <w:szCs w:val="23"/>
+        </w:rPr>
+        <w:t xml:space="preserve"> — its sea temperature series stops in 2011 — so it is not used.</w:t>
       </w:r>
     </w:p>
     <w:p>
@@ -2213,62 +2238,17 @@
           <w:sz w:val="23"/>
           <w:szCs w:val="23"/>
         </w:rPr>
-        <w:t xml:space="preserve">Skill drops as you forecast further out, mostly through false alarms — which is why the interface presents the day-ahead verdict as the decision and longer leads as outlook.</w:t>
-      </w:r>
-    </w:p>
-    <w:p>
-      <w:pPr>
-        <w:spacing w:after="140" w:line="300"/>
-      </w:pPr>
-      <w:r>
-        <w:rPr>
-          <w:rFonts w:ascii="Calibri" w:cs="Calibri" w:eastAsia="Calibri" w:hAnsi="Calibri"/>
-          <w:b w:val="false"/>
-          <w:bCs w:val="false"/>
-          <w:sz w:val="23"/>
-          <w:szCs w:val="23"/>
-        </w:rPr>
-        <w:t xml:space="preserve">Now the honest limit, before you ask it. My “truth” here is the same weather model's </w:t>
-      </w:r>
-      <w:r>
-        <w:rPr>
-          <w:rFonts w:ascii="Calibri" w:cs="Calibri" w:eastAsia="Calibri" w:hAnsi="Calibri"/>
-          <w:b/>
-          <w:bCs/>
-          <w:sz w:val="23"/>
-          <w:szCs w:val="23"/>
-        </w:rPr>
-        <w:t xml:space="preserve">final analysis — not a buoy measurement.</w:t>
-      </w:r>
-      <w:r>
-        <w:rPr>
-          <w:rFonts w:ascii="Calibri" w:cs="Calibri" w:eastAsia="Calibri" w:hAnsi="Calibri"/>
-          <w:b w:val="false"/>
-          <w:bCs w:val="false"/>
-          <w:sz w:val="23"/>
-          <w:szCs w:val="23"/>
-        </w:rPr>
-        <w:t xml:space="preserve"> There is no public INCOIS or NIOT buoy feed I can reach. So this is an </w:t>
-      </w:r>
-      <w:r>
-        <w:rPr>
-          <w:rFonts w:ascii="Calibri" w:cs="Calibri" w:eastAsia="Calibri" w:hAnsi="Calibri"/>
-          <w:b/>
-          <w:bCs/>
-          <w:sz w:val="23"/>
-          <w:szCs w:val="23"/>
-        </w:rPr>
-        <w:t xml:space="preserve">upper bound</w:t>
-      </w:r>
-      <w:r>
-        <w:rPr>
-          <w:rFonts w:ascii="Calibri" w:cs="Calibri" w:eastAsia="Calibri" w:hAnsi="Calibri"/>
-          <w:b w:val="false"/>
-          <w:bCs w:val="false"/>
-          <w:sz w:val="23"/>
-          <w:szCs w:val="23"/>
-        </w:rPr>
-        <w:t xml:space="preserve"> on real skill. The harness runs unchanged the moment I get buoy data — and that is my third ask.</w:t>
+        <w:t xml:space="preserve">Two derived datasets: a frozen seven-day snapshot for five harbours and the Gulf of Mannar, so it runs offline; and a 92-day evaluation set. Tools are along the bottom. </w:t>
+      </w:r>
+      <w:r>
+        <w:rPr>
+          <w:rFonts w:ascii="Calibri" w:cs="Calibri" w:eastAsia="Calibri" w:hAnsi="Calibri"/>
+          <w:b/>
+          <w:bCs/>
+          <w:sz w:val="23"/>
+          <w:szCs w:val="23"/>
+        </w:rPr>
+        <w:t xml:space="preserve">Total data cost: zero.</w:t>
       </w:r>
     </w:p>
     <w:p>
@@ -2288,7 +2268,7 @@
           <w:sz w:val="20"/>
           <w:szCs w:val="20"/>
         </w:rPr>
-        <w:t xml:space="preserve">This is the slide she asked for last time. Deliver the two big numbers slowly. Then point at the green card on the right — that is the safety argument, not just an accuracy figure.</w:t>
+        <w:t xml:space="preserve">She cares most about datasets — slow down here. Raise the two red rows yourself before she asks.</w:t>
       </w:r>
     </w:p>
     <w:p>
@@ -2315,7 +2295,7 @@
           <w:sz w:val="21"/>
           <w:szCs w:val="21"/>
         </w:rPr>
-        <w:t xml:space="preserve">“So where am I.”</w:t>
+        <w:t xml:space="preserve">“Finally, how well it works so far.”</w:t>
       </w:r>
     </w:p>
     <w:p>
@@ -2329,10 +2309,10 @@
           <w:b/>
           <w:bCs/>
           <w:color w:val="FFFFFF"/>
-          <w:sz w:val="24"/>
-          <w:szCs w:val="24"/>
-        </w:rPr>
-        <w:t xml:space="preserve">  SLIDE 10  —  Where we are, and what we need</w:t>
+          <w:sz w:val="23"/>
+          <w:szCs w:val="23"/>
+        </w:rPr>
+        <w:t xml:space="preserve">  SLIDE 10  —  Evaluation method and preliminary results</w:t>
       </w:r>
       <w:r>
         <w:rPr>
@@ -2343,7 +2323,7 @@
           <w:sz w:val="22"/>
           <w:szCs w:val="22"/>
         </w:rPr>
-        <w:t xml:space="preserve">          1:30  </w:t>
+        <w:t xml:space="preserve">        1:15  </w:t>
       </w:r>
     </w:p>
     <w:p>
@@ -2353,22 +2333,32 @@
       <w:r>
         <w:rPr>
           <w:rFonts w:ascii="Calibri" w:cs="Calibri" w:eastAsia="Calibri" w:hAnsi="Calibri"/>
-          <w:b/>
-          <w:bCs/>
-          <w:sz w:val="23"/>
-          <w:szCs w:val="23"/>
-        </w:rPr>
-        <w:t xml:space="preserve">Four of six phases complete</w:t>
-      </w:r>
-      <w:r>
-        <w:rPr>
-          <w:rFonts w:ascii="Calibri" w:cs="Calibri" w:eastAsia="Calibri" w:hAnsi="Calibri"/>
-          <w:b w:val="false"/>
-          <w:bCs w:val="false"/>
-          <w:sz w:val="23"/>
-          <w:szCs w:val="23"/>
-        </w:rPr>
-        <w:t xml:space="preserve"> — data sources verified and frozen for offline use; the tool belt and safety engine with 115 tests; the agent system; and the web interface with the map and the ledger visible.</w:t>
+          <w:b w:val="false"/>
+          <w:bCs w:val="false"/>
+          <w:sz w:val="23"/>
+          <w:szCs w:val="23"/>
+        </w:rPr>
+        <w:t xml:space="preserve">Last review, you asked how often we are right. Prediction is the verdict from the evening-before forecast; truth is the verdict from the model's analysis of that morning; </w:t>
+      </w:r>
+      <w:r>
+        <w:rPr>
+          <w:rFonts w:ascii="Calibri" w:cs="Calibri" w:eastAsia="Calibri" w:hAnsi="Calibri"/>
+          <w:b/>
+          <w:bCs/>
+          <w:sz w:val="23"/>
+          <w:szCs w:val="23"/>
+        </w:rPr>
+        <w:t xml:space="preserve">460 harbour-mornings</w:t>
+      </w:r>
+      <w:r>
+        <w:rPr>
+          <w:rFonts w:ascii="Calibri" w:cs="Calibri" w:eastAsia="Calibri" w:hAnsi="Calibri"/>
+          <w:b w:val="false"/>
+          <w:bCs w:val="false"/>
+          <w:sz w:val="23"/>
+          <w:szCs w:val="23"/>
+        </w:rPr>
+        <w:t xml:space="preserve"> through the monsoon.</w:t>
       </w:r>
     </w:p>
     <w:p>
@@ -2383,7 +2373,67 @@
           <w:sz w:val="23"/>
           <w:szCs w:val="23"/>
         </w:rPr>
-        <w:t xml:space="preserve">Phases five and six remain: the official Bhashini translation path, route optimisation, and offline hardening with rehearsals.</w:t>
+        <w:t xml:space="preserve">Day ahead, </w:t>
+      </w:r>
+      <w:r>
+        <w:rPr>
+          <w:rFonts w:ascii="Calibri" w:cs="Calibri" w:eastAsia="Calibri" w:hAnsi="Calibri"/>
+          <w:b/>
+          <w:bCs/>
+          <w:sz w:val="23"/>
+          <w:szCs w:val="23"/>
+        </w:rPr>
+        <w:t xml:space="preserve">93.9 %</w:t>
+      </w:r>
+      <w:r>
+        <w:rPr>
+          <w:rFonts w:ascii="Calibri" w:cs="Calibri" w:eastAsia="Calibri" w:hAnsi="Calibri"/>
+          <w:b w:val="false"/>
+          <w:bCs w:val="false"/>
+          <w:sz w:val="23"/>
+          <w:szCs w:val="23"/>
+        </w:rPr>
+        <w:t xml:space="preserve"> of dangerous mornings were warned, and only </w:t>
+      </w:r>
+      <w:r>
+        <w:rPr>
+          <w:rFonts w:ascii="Calibri" w:cs="Calibri" w:eastAsia="Calibri" w:hAnsi="Calibri"/>
+          <w:b/>
+          <w:bCs/>
+          <w:sz w:val="23"/>
+          <w:szCs w:val="23"/>
+        </w:rPr>
+        <w:t xml:space="preserve">3.1 %</w:t>
+      </w:r>
+      <w:r>
+        <w:rPr>
+          <w:rFonts w:ascii="Calibri" w:cs="Calibri" w:eastAsia="Calibri" w:hAnsi="Calibri"/>
+          <w:b w:val="false"/>
+          <w:bCs w:val="false"/>
+          <w:sz w:val="23"/>
+          <w:szCs w:val="23"/>
+        </w:rPr>
+        <w:t xml:space="preserve"> of warnings wasted a good day. </w:t>
+      </w:r>
+      <w:r>
+        <w:rPr>
+          <w:rFonts w:ascii="Calibri" w:cs="Calibri" w:eastAsia="Calibri" w:hAnsi="Calibri"/>
+          <w:b/>
+          <w:bCs/>
+          <w:sz w:val="23"/>
+          <w:szCs w:val="23"/>
+        </w:rPr>
+        <w:t xml:space="preserve">Both misses were graded caution — none were graded go.</w:t>
+      </w:r>
+      <w:r>
+        <w:rPr>
+          <w:rFonts w:ascii="Calibri" w:cs="Calibri" w:eastAsia="Calibri" w:hAnsi="Calibri"/>
+          <w:b w:val="false"/>
+          <w:bCs w:val="false"/>
+          <w:sz w:val="23"/>
+          <w:szCs w:val="23"/>
+        </w:rPr>
+        <w:t xml:space="preserve"> It fails toward safety.</w:t>
       </w:r>
     </w:p>
     <w:p>
@@ -2393,22 +2443,32 @@
       <w:r>
         <w:rPr>
           <w:rFonts w:ascii="Calibri" w:cs="Calibri" w:eastAsia="Calibri" w:hAnsi="Calibri"/>
-          <w:b/>
-          <w:bCs/>
-          <w:sz w:val="23"/>
-          <w:szCs w:val="23"/>
-        </w:rPr>
-        <w:t xml:space="preserve">Total external cost of this project so far: zero rupees.</w:t>
-      </w:r>
-      <w:r>
-        <w:rPr>
-          <w:rFonts w:ascii="Calibri" w:cs="Calibri" w:eastAsia="Calibri" w:hAnsi="Calibri"/>
-          <w:b w:val="false"/>
-          <w:bCs w:val="false"/>
-          <w:sz w:val="23"/>
-          <w:szCs w:val="23"/>
-        </w:rPr>
-        <w:t xml:space="preserve"> Every data source is free, the AI runs on a free tier, and it is hosted on this laptop.</w:t>
+          <w:b w:val="false"/>
+          <w:bCs w:val="false"/>
+          <w:sz w:val="23"/>
+          <w:szCs w:val="23"/>
+        </w:rPr>
+        <w:t xml:space="preserve">The limitation: truth here is model analysis, not a buoy, so this is an </w:t>
+      </w:r>
+      <w:r>
+        <w:rPr>
+          <w:rFonts w:ascii="Calibri" w:cs="Calibri" w:eastAsia="Calibri" w:hAnsi="Calibri"/>
+          <w:b/>
+          <w:bCs/>
+          <w:sz w:val="23"/>
+          <w:szCs w:val="23"/>
+        </w:rPr>
+        <w:t xml:space="preserve">upper bound</w:t>
+      </w:r>
+      <w:r>
+        <w:rPr>
+          <w:rFonts w:ascii="Calibri" w:cs="Calibri" w:eastAsia="Calibri" w:hAnsi="Calibri"/>
+          <w:b w:val="false"/>
+          <w:bCs w:val="false"/>
+          <w:sz w:val="23"/>
+          <w:szCs w:val="23"/>
+        </w:rPr>
+        <w:t xml:space="preserve">.</w:t>
       </w:r>
     </w:p>
     <w:p>
@@ -2423,82 +2483,27 @@
           <w:sz w:val="23"/>
           <w:szCs w:val="23"/>
         </w:rPr>
-        <w:t xml:space="preserve">Three things would materially improve it, and I would appreciate help with them.</w:t>
-      </w:r>
-    </w:p>
-    <w:p>
-      <w:pPr>
-        <w:spacing w:after="140" w:line="300"/>
-      </w:pPr>
-      <w:r>
-        <w:rPr>
-          <w:rFonts w:ascii="Calibri" w:cs="Calibri" w:eastAsia="Calibri" w:hAnsi="Calibri"/>
-          <w:b/>
-          <w:bCs/>
-          <w:sz w:val="23"/>
-          <w:szCs w:val="23"/>
-        </w:rPr>
-        <w:t xml:space="preserve">One, an IMD API key.</w:t>
-      </w:r>
-      <w:r>
-        <w:rPr>
-          <w:rFonts w:ascii="Calibri" w:cs="Calibri" w:eastAsia="Calibri" w:hAnsi="Calibri"/>
-          <w:b w:val="false"/>
-          <w:bCs w:val="false"/>
-          <w:sz w:val="23"/>
-          <w:szCs w:val="23"/>
-        </w:rPr>
-        <w:t xml:space="preserve"> It needs a request letter on college letterhead. Without it I have no lightning and no cyclone data — two of my seven safety checks are coded and tested but inactive.</w:t>
-      </w:r>
-    </w:p>
-    <w:p>
-      <w:pPr>
-        <w:spacing w:after="140" w:line="300"/>
-      </w:pPr>
-      <w:r>
-        <w:rPr>
-          <w:rFonts w:ascii="Calibri" w:cs="Calibri" w:eastAsia="Calibri" w:hAnsi="Calibri"/>
-          <w:b/>
-          <w:bCs/>
-          <w:sz w:val="23"/>
-          <w:szCs w:val="23"/>
-        </w:rPr>
-        <w:t xml:space="preserve">Two, INCOIS's published small-craft criteria</w:t>
-      </w:r>
-      <w:r>
-        <w:rPr>
-          <w:rFonts w:ascii="Calibri" w:cs="Calibri" w:eastAsia="Calibri" w:hAnsi="Calibri"/>
-          <w:b w:val="false"/>
-          <w:bCs w:val="false"/>
-          <w:sz w:val="23"/>
-          <w:szCs w:val="23"/>
-        </w:rPr>
-        <w:t xml:space="preserve"> — the numbers behind the Boat Safety Index — so I can replace my provisional table with a sourced one.</w:t>
-      </w:r>
-    </w:p>
-    <w:p>
-      <w:pPr>
-        <w:spacing w:after="140" w:line="300"/>
-      </w:pPr>
-      <w:r>
-        <w:rPr>
-          <w:rFonts w:ascii="Calibri" w:cs="Calibri" w:eastAsia="Calibri" w:hAnsi="Calibri"/>
-          <w:b/>
-          <w:bCs/>
-          <w:sz w:val="23"/>
-          <w:szCs w:val="23"/>
-        </w:rPr>
-        <w:t xml:space="preserve">Three, buoy observations</w:t>
-      </w:r>
-      <w:r>
-        <w:rPr>
-          <w:rFonts w:ascii="Calibri" w:cs="Calibri" w:eastAsia="Calibri" w:hAnsi="Calibri"/>
-          <w:b w:val="false"/>
-          <w:bCs w:val="false"/>
-          <w:sz w:val="23"/>
-          <w:szCs w:val="23"/>
-        </w:rPr>
-        <w:t xml:space="preserve"> from INCOIS or NIOT. That turns my evaluation from model-against-model into model-against-the-sea.</w:t>
+        <w:t xml:space="preserve">Four of six phases are complete. Three things would materially improve it: </w:t>
+      </w:r>
+      <w:r>
+        <w:rPr>
+          <w:rFonts w:ascii="Calibri" w:cs="Calibri" w:eastAsia="Calibri" w:hAnsi="Calibri"/>
+          <w:b/>
+          <w:bCs/>
+          <w:sz w:val="23"/>
+          <w:szCs w:val="23"/>
+        </w:rPr>
+        <w:t xml:space="preserve">an IMD API key, which needs a letter on college letterhead</w:t>
+      </w:r>
+      <w:r>
+        <w:rPr>
+          <w:rFonts w:ascii="Calibri" w:cs="Calibri" w:eastAsia="Calibri" w:hAnsi="Calibri"/>
+          <w:b w:val="false"/>
+          <w:bCs w:val="false"/>
+          <w:sz w:val="23"/>
+          <w:szCs w:val="23"/>
+        </w:rPr>
+        <w:t xml:space="preserve">; INCOIS's small-craft criteria; and buoy data from INCOIS or NIOT.</w:t>
       </w:r>
     </w:p>
     <w:p>
@@ -2533,7 +2538,7 @@
           <w:sz w:val="20"/>
           <w:szCs w:val="20"/>
         </w:rPr>
-        <w:t xml:space="preserve">Do not rush the three asks — they are the point of ending here. Say each one, then stop. The IMD letter is the one you actually want; ask for it first and most clearly.</w:t>
+        <w:t xml:space="preserve">Say each of the three needs, then stop talking. Advance to the references slide and leave it on screen during questions.</w:t>
       </w:r>
     </w:p>
     <w:p>
@@ -2565,8 +2570,8 @@
         </w:tblBorders>
       </w:tblPr>
       <w:tblGrid>
-        <w:gridCol w:w="2100"/>
-        <w:gridCol w:w="5400"/>
+        <w:gridCol w:w="1600"/>
+        <w:gridCol w:w="5900"/>
         <w:gridCol w:w="1526"/>
       </w:tblGrid>
       <w:tr>
@@ -2575,7 +2580,7 @@
         </w:trPr>
         <w:tc>
           <w:tcPr>
-            <w:tcW w:type="dxa" w:w="2100"/>
+            <w:tcW w:type="dxa" w:w="1600"/>
             <w:shd w:fill="DCE6F1" w:color="auto" w:val="clear"/>
             <w:tcMar>
               <w:top w:type="dxa" w:w="75"/>
@@ -2602,7 +2607,7 @@
         </w:tc>
         <w:tc>
           <w:tcPr>
-            <w:tcW w:type="dxa" w:w="5400"/>
+            <w:tcW w:type="dxa" w:w="5900"/>
             <w:shd w:fill="DCE6F1" w:color="auto" w:val="clear"/>
             <w:tcMar>
               <w:top w:type="dxa" w:w="75"/>
@@ -2661,7 +2666,7 @@
         </w:trPr>
         <w:tc>
           <w:tcPr>
-            <w:tcW w:type="dxa" w:w="2100"/>
+            <w:tcW w:type="dxa" w:w="1600"/>
             <w:tcMar>
               <w:top w:type="dxa" w:w="75"/>
               <w:left w:type="dxa" w:w="115"/>
@@ -2687,7 +2692,7 @@
         </w:tc>
         <w:tc>
           <w:tcPr>
-            <w:tcW w:type="dxa" w:w="5400"/>
+            <w:tcW w:type="dxa" w:w="5900"/>
             <w:tcMar>
               <w:top w:type="dxa" w:w="75"/>
               <w:left w:type="dxa" w:w="115"/>
@@ -2707,7 +2712,7 @@
                 <w:sz w:val="19"/>
                 <w:szCs w:val="19"/>
               </w:rPr>
-              <w:t xml:space="preserve">Opening and the problem</w:t>
+              <w:t xml:space="preserve">Opening and problem definition</w:t>
             </w:r>
           </w:p>
         </w:tc>
@@ -2744,7 +2749,7 @@
         </w:trPr>
         <w:tc>
           <w:tcPr>
-            <w:tcW w:type="dxa" w:w="2100"/>
+            <w:tcW w:type="dxa" w:w="1600"/>
             <w:tcMar>
               <w:top w:type="dxa" w:w="75"/>
               <w:left w:type="dxa" w:w="115"/>
@@ -2764,13 +2769,13 @@
                 <w:sz w:val="19"/>
                 <w:szCs w:val="19"/>
               </w:rPr>
-              <w:t xml:space="preserve">3 – 4</w:t>
-            </w:r>
-          </w:p>
-        </w:tc>
-        <w:tc>
-          <w:tcPr>
-            <w:tcW w:type="dxa" w:w="5400"/>
+              <w:t xml:space="preserve">3 – 5</w:t>
+            </w:r>
+          </w:p>
+        </w:tc>
+        <w:tc>
+          <w:tcPr>
+            <w:tcW w:type="dxa" w:w="5900"/>
             <w:tcMar>
               <w:top w:type="dxa" w:w="75"/>
               <w:left w:type="dxa" w:w="115"/>
@@ -2790,7 +2795,7 @@
                 <w:sz w:val="19"/>
                 <w:szCs w:val="19"/>
               </w:rPr>
-              <w:t xml:space="preserve">Literature review</w:t>
+              <w:t xml:space="preserve">Literature survey (three slides)</w:t>
             </w:r>
           </w:p>
         </w:tc>
@@ -2816,7 +2821,7 @@
                 <w:sz w:val="19"/>
                 <w:szCs w:val="19"/>
               </w:rPr>
-              <w:t xml:space="preserve">3:00</w:t>
+              <w:t xml:space="preserve">4:30</w:t>
             </w:r>
           </w:p>
         </w:tc>
@@ -2827,7 +2832,7 @@
         </w:trPr>
         <w:tc>
           <w:tcPr>
-            <w:tcW w:type="dxa" w:w="2100"/>
+            <w:tcW w:type="dxa" w:w="1600"/>
             <w:tcMar>
               <w:top w:type="dxa" w:w="75"/>
               <w:left w:type="dxa" w:w="115"/>
@@ -2847,13 +2852,13 @@
                 <w:sz w:val="19"/>
                 <w:szCs w:val="19"/>
               </w:rPr>
-              <w:t xml:space="preserve">5</w:t>
-            </w:r>
-          </w:p>
-        </w:tc>
-        <w:tc>
-          <w:tcPr>
-            <w:tcW w:type="dxa" w:w="5400"/>
+              <w:t xml:space="preserve">6 – 7</w:t>
+            </w:r>
+          </w:p>
+        </w:tc>
+        <w:tc>
+          <w:tcPr>
+            <w:tcW w:type="dxa" w:w="5900"/>
             <w:tcMar>
               <w:top w:type="dxa" w:w="75"/>
               <w:left w:type="dxa" w:w="115"/>
@@ -2873,7 +2878,7 @@
                 <w:sz w:val="19"/>
                 <w:szCs w:val="19"/>
               </w:rPr>
-              <w:t xml:space="preserve">The research gap</w:t>
+              <w:t xml:space="preserve">Research gap and objectives</w:t>
             </w:r>
           </w:p>
         </w:tc>
@@ -2899,7 +2904,7 @@
                 <w:sz w:val="19"/>
                 <w:szCs w:val="19"/>
               </w:rPr>
-              <w:t xml:space="preserve">2:00</w:t>
+              <w:t xml:space="preserve">3:00</w:t>
             </w:r>
           </w:p>
         </w:tc>
@@ -2910,7 +2915,7 @@
         </w:trPr>
         <w:tc>
           <w:tcPr>
-            <w:tcW w:type="dxa" w:w="2100"/>
+            <w:tcW w:type="dxa" w:w="1600"/>
             <w:tcMar>
               <w:top w:type="dxa" w:w="75"/>
               <w:left w:type="dxa" w:w="115"/>
@@ -2930,13 +2935,13 @@
                 <w:sz w:val="19"/>
                 <w:szCs w:val="19"/>
               </w:rPr>
-              <w:t xml:space="preserve">6 – 8</w:t>
-            </w:r>
-          </w:p>
-        </w:tc>
-        <w:tc>
-          <w:tcPr>
-            <w:tcW w:type="dxa" w:w="5400"/>
+              <w:t xml:space="preserve">8 – 9</w:t>
+            </w:r>
+          </w:p>
+        </w:tc>
+        <w:tc>
+          <w:tcPr>
+            <w:tcW w:type="dxa" w:w="5900"/>
             <w:tcMar>
               <w:top w:type="dxa" w:w="75"/>
               <w:left w:type="dxa" w:w="115"/>
@@ -2956,7 +2961,7 @@
                 <w:sz w:val="19"/>
                 <w:szCs w:val="19"/>
               </w:rPr>
-              <w:t xml:space="preserve">Objectives, architecture, the rule</w:t>
+              <w:t xml:space="preserve">Methodology: architecture, dataset, tools</w:t>
             </w:r>
           </w:p>
         </w:tc>
@@ -2982,7 +2987,7 @@
                 <w:sz w:val="19"/>
                 <w:szCs w:val="19"/>
               </w:rPr>
-              <w:t xml:space="preserve">3:30</w:t>
+              <w:t xml:space="preserve">2:45</w:t>
             </w:r>
           </w:p>
         </w:tc>
@@ -2993,7 +2998,7 @@
         </w:trPr>
         <w:tc>
           <w:tcPr>
-            <w:tcW w:type="dxa" w:w="2100"/>
+            <w:tcW w:type="dxa" w:w="1600"/>
             <w:tcMar>
               <w:top w:type="dxa" w:w="75"/>
               <w:left w:type="dxa" w:w="115"/>
@@ -3013,13 +3018,13 @@
                 <w:sz w:val="19"/>
                 <w:szCs w:val="19"/>
               </w:rPr>
-              <w:t xml:space="preserve">9 – 10</w:t>
-            </w:r>
-          </w:p>
-        </w:tc>
-        <w:tc>
-          <w:tcPr>
-            <w:tcW w:type="dxa" w:w="5400"/>
+              <w:t xml:space="preserve">10</w:t>
+            </w:r>
+          </w:p>
+        </w:tc>
+        <w:tc>
+          <w:tcPr>
+            <w:tcW w:type="dxa" w:w="5900"/>
             <w:tcMar>
               <w:top w:type="dxa" w:w="75"/>
               <w:left w:type="dxa" w:w="115"/>
@@ -3039,7 +3044,7 @@
                 <w:sz w:val="19"/>
                 <w:szCs w:val="19"/>
               </w:rPr>
-              <w:t xml:space="preserve">Results and status</w:t>
+              <w:t xml:space="preserve">Evaluation and status</w:t>
             </w:r>
           </w:p>
         </w:tc>
@@ -3065,7 +3070,7 @@
                 <w:sz w:val="19"/>
                 <w:szCs w:val="19"/>
               </w:rPr>
-              <w:t xml:space="preserve">3:00</w:t>
+              <w:t xml:space="preserve">1:15</w:t>
             </w:r>
           </w:p>
         </w:tc>
@@ -3076,7 +3081,90 @@
         </w:trPr>
         <w:tc>
           <w:tcPr>
-            <w:tcW w:type="dxa" w:w="2100"/>
+            <w:tcW w:type="dxa" w:w="1600"/>
+            <w:tcMar>
+              <w:top w:type="dxa" w:w="75"/>
+              <w:left w:type="dxa" w:w="115"/>
+              <w:bottom w:type="dxa" w:w="75"/>
+              <w:right w:type="dxa" w:w="115"/>
+            </w:tcMar>
+          </w:tcPr>
+          <w:p>
+            <w:pPr>
+              <w:spacing w:after="0"/>
+            </w:pPr>
+            <w:r>
+              <w:rPr>
+                <w:rFonts w:ascii="Calibri" w:cs="Calibri" w:eastAsia="Calibri" w:hAnsi="Calibri"/>
+                <w:b w:val="false"/>
+                <w:bCs w:val="false"/>
+                <w:sz w:val="19"/>
+                <w:szCs w:val="19"/>
+              </w:rPr>
+              <w:t xml:space="preserve">11</w:t>
+            </w:r>
+          </w:p>
+        </w:tc>
+        <w:tc>
+          <w:tcPr>
+            <w:tcW w:type="dxa" w:w="5900"/>
+            <w:tcMar>
+              <w:top w:type="dxa" w:w="75"/>
+              <w:left w:type="dxa" w:w="115"/>
+              <w:bottom w:type="dxa" w:w="75"/>
+              <w:right w:type="dxa" w:w="115"/>
+            </w:tcMar>
+          </w:tcPr>
+          <w:p>
+            <w:pPr>
+              <w:spacing w:after="0"/>
+            </w:pPr>
+            <w:r>
+              <w:rPr>
+                <w:rFonts w:ascii="Calibri" w:cs="Calibri" w:eastAsia="Calibri" w:hAnsi="Calibri"/>
+                <w:b w:val="false"/>
+                <w:bCs w:val="false"/>
+                <w:sz w:val="19"/>
+                <w:szCs w:val="19"/>
+              </w:rPr>
+              <w:t xml:space="preserve">References — leave on screen for questions</w:t>
+            </w:r>
+          </w:p>
+        </w:tc>
+        <w:tc>
+          <w:tcPr>
+            <w:tcW w:type="dxa" w:w="1526"/>
+            <w:tcMar>
+              <w:top w:type="dxa" w:w="75"/>
+              <w:left w:type="dxa" w:w="115"/>
+              <w:bottom w:type="dxa" w:w="75"/>
+              <w:right w:type="dxa" w:w="115"/>
+            </w:tcMar>
+          </w:tcPr>
+          <w:p>
+            <w:pPr>
+              <w:spacing w:after="0"/>
+            </w:pPr>
+            <w:r>
+              <w:rPr>
+                <w:rFonts w:ascii="Calibri" w:cs="Calibri" w:eastAsia="Calibri" w:hAnsi="Calibri"/>
+                <w:b w:val="false"/>
+                <w:bCs w:val="false"/>
+                <w:sz w:val="19"/>
+                <w:szCs w:val="19"/>
+              </w:rPr>
+              <w:t xml:space="preserve">—</w:t>
+            </w:r>
+          </w:p>
+        </w:tc>
+      </w:tr>
+      <w:tr>
+        <w:trPr>
+          <w:tblHeader w:val="false"/>
+        </w:trPr>
+        <w:tc>
+          <w:tcPr>
+            <w:tcW w:type="dxa" w:w="1600"/>
             <w:tcMar>
               <w:top w:type="dxa" w:w="75"/>
               <w:left w:type="dxa" w:w="115"/>
@@ -3102,7 +3190,7 @@
         </w:tc>
         <w:tc>
           <w:tcPr>
-            <w:tcW w:type="dxa" w:w="5400"/>
+            <w:tcW w:type="dxa" w:w="5900"/>
             <w:tcMar>
               <w:top w:type="dxa" w:w="75"/>
               <w:left w:type="dxa" w:w="115"/>
@@ -3166,36 +3254,82 @@
           <w:sz w:val="22"/>
           <w:szCs w:val="22"/>
         </w:rPr>
-        <w:t xml:space="preserve">If you are told to cut to eight minutes: </w:t>
-      </w:r>
-      <w:r>
-        <w:rPr>
-          <w:rFonts w:ascii="Calibri" w:cs="Calibri" w:eastAsia="Calibri" w:hAnsi="Calibri"/>
+        <w:t xml:space="preserve">If you are told to cut to eight minutes: on slide 4 say only the red-column line; on slide 7 cover only G4/G5 → O2/O3; on slide 9 cover only the two red rows. Never cut slides 3, 5 or 6 — they carry the 15 literature-and-gap marks.</w:t>
+      </w:r>
+    </w:p>
+    <w:p>
+      <w:pPr>
+        <w:pStyle w:val="Heading1"/>
+      </w:pPr>
+      <w:r>
+        <w:rPr>
+          <w:rFonts w:ascii="Calibri" w:cs="Calibri" w:eastAsia="Calibri" w:hAnsi="Calibri"/>
+        </w:rPr>
+        <w:t xml:space="preserve">Questions she is likely to ask</w:t>
+      </w:r>
+    </w:p>
+    <w:p>
+      <w:pPr>
+        <w:spacing w:after="70" w:before="200"/>
+      </w:pPr>
+      <w:r>
+        <w:rPr>
+          <w:rFonts w:ascii="Calibri" w:cs="Calibri" w:eastAsia="Calibri" w:hAnsi="Calibri"/>
+          <w:b/>
+          <w:bCs/>
+          <w:color w:val="1F3864"/>
+          <w:sz w:val="23"/>
+          <w:szCs w:val="23"/>
+        </w:rPr>
+        <w:t xml:space="preserve">Q.  How did you choose the literature?</w:t>
+      </w:r>
+    </w:p>
+    <w:p>
+      <w:pPr>
+        <w:spacing w:after="110" w:line="288"/>
+        <w:ind w:left="290"/>
+      </w:pPr>
+      <w:r>
+        <w:rPr>
+          <w:rFonts w:ascii="Calibri" w:cs="Calibri" w:eastAsia="Calibri" w:hAnsi="Calibri"/>
+          <w:b w:val="false"/>
+          <w:bCs w:val="false"/>
           <w:sz w:val="22"/>
           <w:szCs w:val="22"/>
         </w:rPr>
-        <w:t xml:space="preserve">compress slide 4 to the two bold lines, drop the per-objective detail on slide 6, and cut the lead-time paragraph on slide 9. </w:t>
-      </w:r>
-      <w:r>
-        <w:rPr>
-          <w:rFonts w:ascii="Calibri" w:cs="Calibri" w:eastAsia="Calibri" w:hAnsi="Calibri"/>
-          <w:b/>
-          <w:bCs/>
+        <w:t xml:space="preserve">Three groups, matching the three parts of the problem. First, the domain: India's own marine information services, because that is what a fisherman uses today. Second, the techniques I could build with: machine-learned forecasting as the alternative I rejected, and tool-using language models as the approach I took. Third, the closest systems to mine, plus reliability and evaluation. Every reference was checked against its publisher or repository record.</w:t>
+      </w:r>
+    </w:p>
+    <w:p>
+      <w:pPr>
+        <w:spacing w:after="70" w:before="200"/>
+      </w:pPr>
+      <w:r>
+        <w:rPr>
+          <w:rFonts w:ascii="Calibri" w:cs="Calibri" w:eastAsia="Calibri" w:hAnsi="Calibri"/>
+          <w:b/>
+          <w:bCs/>
+          <w:color w:val="1F3864"/>
+          <w:sz w:val="23"/>
+          <w:szCs w:val="23"/>
+        </w:rPr>
+        <w:t xml:space="preserve">Q.  Why not just let the AI decide? The models are very good now.</w:t>
+      </w:r>
+    </w:p>
+    <w:p>
+      <w:pPr>
+        <w:spacing w:after="110" w:line="288"/>
+        <w:ind w:left="290"/>
+      </w:pPr>
+      <w:r>
+        <w:rPr>
+          <w:rFonts w:ascii="Calibri" w:cs="Calibri" w:eastAsia="Calibri" w:hAnsi="Calibri"/>
+          <w:b w:val="false"/>
+          <w:bCs w:val="false"/>
           <w:sz w:val="22"/>
           <w:szCs w:val="22"/>
         </w:rPr>
-        <w:t xml:space="preserve">Never cut slide 5, or the asks on slide 10.</w:t>
-      </w:r>
-    </w:p>
-    <w:p>
-      <w:pPr>
-        <w:pStyle w:val="Heading1"/>
-      </w:pPr>
-      <w:r>
-        <w:rPr>
-          <w:rFonts w:ascii="Calibri" w:cs="Calibri" w:eastAsia="Calibri" w:hAnsi="Calibri"/>
-        </w:rPr>
-        <w:t xml:space="preserve">Questions she is likely to ask</w:t>
+        <w:t xml:space="preserve">Three reasons. I cannot test it — a rule table can be unit-tested and audited by anyone; a model's judgement cannot. There is no training data for it — no dataset of boats that did and did not come back. And Lin et al. show agent errors can be physically consequential. If someone drowns, “the model decided” is not an acceptable answer. The model is very good at language, so I use it for language.</w:t>
       </w:r>
     </w:p>
     <w:p>
@@ -3211,7 +3345,7 @@
           <w:sz w:val="23"/>
           <w:szCs w:val="23"/>
         </w:rPr>
-        <w:t xml:space="preserve">Q.  Why not just let the AI decide? The models are very good now.</w:t>
+        <w:t xml:space="preserve">Q.  Isn't this just a wrapper around some APIs? Where is the novelty?</w:t>
       </w:r>
     </w:p>
     <w:p>
@@ -3227,7 +3361,7 @@
           <w:sz w:val="22"/>
           <w:szCs w:val="22"/>
         </w:rPr>
-        <w:t xml:space="preserve">Three reasons. First, I cannot test it — a rule table can be unit-tested and audited by anyone; a model's judgement cannot. Second, there is no training data for it: there is no dataset of boats that did and did not come back. Third, the literature says agent errors can be physically consequential and that models sometimes fake tool calls. If someone drowns, “the model decided” is not an acceptable answer. The model is very good at language, so I use it for language.</w:t>
+        <w:t xml:space="preserve">The fetching is ordinary engineering. The contribution is O2 and O3: an architecture where the safety verdict is structurally outside the model, not just prompted to be; and an evidence ledger with a verifier that mechanically deletes any number the model produced that is not in it. ClimSight and WildfireGPT ground in documents and still let the model write the conclusion.</w:t>
       </w:r>
     </w:p>
     <w:p>
@@ -3243,7 +3377,7 @@
           <w:sz w:val="23"/>
           <w:szCs w:val="23"/>
         </w:rPr>
-        <w:t xml:space="preserve">Q.  Isn't this just a wrapper around some APIs? Where is the novelty?</w:t>
+        <w:t xml:space="preserve">Q.  How is your work different from INCOIS's Small Vessel Advisory?</w:t>
       </w:r>
     </w:p>
     <w:p>
@@ -3259,7 +3393,7 @@
           <w:sz w:val="22"/>
           <w:szCs w:val="22"/>
         </w:rPr>
-        <w:t xml:space="preserve">The fetching is ordinary engineering, yes. The contribution is two things. One, an architecture where the safety verdict is structurally outside the model — not prompted to be, but unable to be. Two, the evidence ledger plus a verifier that mechanically deletes any number the model produced that is not in it. ClimSight and WildfireGPT ground in documents and still let the model write the conclusion. Nobody in this domain has done per-number provenance with a mechanical check.</w:t>
+        <w:t xml:space="preserve">SVAS is the closest existing product and I build on it rather than compete with it. It gives a boat safety index as a colour map, in English, with unpublished thresholds, and separately from fishing zones and borders. My system takes a question in the user's language, combines safety, fishing zones and boundary warnings for one boat, place and time, and shows the source of every number. SVAS is also my calibration target — it independently uses steepness and vessel size, as I do.</w:t>
       </w:r>
     </w:p>
     <w:p>
@@ -3291,7 +3425,7 @@
           <w:sz w:val="22"/>
           <w:szCs w:val="22"/>
         </w:rPr>
-        <w:t xml:space="preserve">It is a backtest over 92 mornings at five harbours through this monsoon — 460 harbour-mornings. For each one I take the forecast that was available the evening before, run it through my safety engine, and compare that verdict with the verdict computed from the same model's final analysis of what actually happened. It is standard warning verification — hit rate and false-alarm ratio, from Jolliffe and Stephenson. The numbers regenerate with one command.</w:t>
+        <w:t xml:space="preserve">It is a backtest over 92 mornings at five harbours through this monsoon — 460 harbour-mornings. For each, I take the forecast available the evening before, run it through my safety engine, and compare that verdict with the verdict from the same model's final analysis. That is standard warning verification from Jolliffe and Stephenson. It regenerates with one command.</w:t>
       </w:r>
     </w:p>
     <w:p>
@@ -3307,7 +3441,7 @@
           <w:sz w:val="23"/>
           <w:szCs w:val="23"/>
         </w:rPr>
-        <w:t xml:space="preserve">Q.  But you said you have no buoy data. So how do you know you are right?</w:t>
+        <w:t xml:space="preserve">Q.  But you have no buoy data. So how do you know you are right?</w:t>
       </w:r>
     </w:p>
     <w:p>
@@ -3323,7 +3457,7 @@
           <w:sz w:val="22"/>
           <w:szCs w:val="22"/>
         </w:rPr>
-        <w:t xml:space="preserve">I do not, fully, and I say so in the synopsis. My truth is the weather model's own final analysis, not a physical measurement. That means my numbers are an upper bound — against real buoys they would be lower. The harness is written so that if I obtain buoy observations I change the truth source and rerun. That is my third ask.</w:t>
+        <w:t xml:space="preserve">I do not, fully, and the synopsis says so. My truth is the model's analysis, not a physical measurement, so my figures are an upper bound. The harness is written so that with buoy observations I change the truth source and rerun. That is one of my three asks.</w:t>
       </w:r>
     </w:p>
     <w:p>
@@ -3339,7 +3473,7 @@
           <w:sz w:val="23"/>
           <w:szCs w:val="23"/>
         </w:rPr>
-        <w:t xml:space="preserve">Q.  This is an ISRO/INCOIS problem statement, but your main data source is Open-Meteo, which is European. Why?</w:t>
+        <w:t xml:space="preserve">Q.  This is an ISRO/INCOIS problem statement, but your primary source is Open-Meteo. Why?</w:t>
       </w:r>
     </w:p>
     <w:p>
@@ -3355,7 +3489,7 @@
           <w:sz w:val="22"/>
           <w:szCs w:val="22"/>
         </w:rPr>
-        <w:t xml:space="preserve">Honest answer: because INCOIS's own open data archive is largely stale — their public sea-temperature series stops in 2011, chlorophyll in 2006. I tested all of it before writing any code. I use INCOIS for what is live and excellent: the fishing zone advisories, the sector and landing-centre layers, and the boundary lines. Open-Meteo is the reliability floor for waves and wind because it answers in about 300 ms on a bad connection. If I get IMD and deeper INCOIS access, the Indian sources move up the chain — the fallback chain is built for exactly that substitution.</w:t>
+        <w:t xml:space="preserve">Because INCOIS's own open data archive is largely stale — their public sea-temperature series stops in 2011 and chlorophyll in 2006. I tested all of it before writing any code. I use INCOIS for what is live and excellent: fishing-zone advisories, sector and landing-centre layers, boundary lines. Open-Meteo is the reliability floor for waves and wind. With IMD and deeper INCOIS access, Indian sources move up the fallback chain — it is built for that substitution.</w:t>
       </w:r>
     </w:p>
     <w:p>
@@ -3371,7 +3505,7 @@
           <w:sz w:val="23"/>
           <w:szCs w:val="23"/>
         </w:rPr>
-        <w:t xml:space="preserve">Q.  What datasets are you actually using?</w:t>
+        <w:t xml:space="preserve">Q.  Did you train a model?</w:t>
       </w:r>
     </w:p>
     <w:p>
@@ -3387,7 +3521,7 @@
           <w:sz w:val="22"/>
           <w:szCs w:val="22"/>
         </w:rPr>
-        <w:t xml:space="preserve">Live: Open-Meteo marine and weather; INCOIS Potential Fishing Zone advisories over their GeoServer; NOAA chlorophyll; Copernicus Marine, for which I have an account. Static and committed: India's EEZ polygon and boundary lines from Marine Regions, INCOIS's 14 sector polygons and 1,223 named landing centres. Plus a frozen week of real data for five harbours so the whole thing runs offline. Every endpoint was tested live before any code was written against it — that is documented in docs/data-sources.md.</w:t>
+        <w:t xml:space="preserve">No, deliberately. GraphCast and Pangu-Weather are in my survey as the road not taken: training a competitive forecaster needs decades of reanalysis and compute, and would replace a product INCOIS already provides, validated and free. My contribution is reasoning over official forecasts, not replacing them.</w:t>
       </w:r>
     </w:p>
     <w:p>
@@ -3403,7 +3537,7 @@
           <w:sz w:val="23"/>
           <w:szCs w:val="23"/>
         </w:rPr>
-        <w:t xml:space="preserve">Q.  Did you train a model?</w:t>
+        <w:t xml:space="preserve">Q.  What if the translation is wrong in Tamil?</w:t>
       </w:r>
     </w:p>
     <w:p>
@@ -3419,7 +3553,7 @@
           <w:sz w:val="22"/>
           <w:szCs w:val="22"/>
         </w:rPr>
-        <w:t xml:space="preserve">No, deliberately. Training a competitive forecast model needs decades of reanalysis and compute I do not have, and the product it would compete with — INCOIS's — is already validated and free. GraphCast and Pangu-Weather are in my literature review precisely as the road not taken. My contribution is reasoning over official forecasts, not replacing them.</w:t>
+        <w:t xml:space="preserve">The verdict is computed before any translation, so translation cannot change it. And the verifier checks numbers in both Latin and Indic digits, so a fabricated figure is caught in Tamil too. The remaining risk is tone, which is why the target path is Bhashini, the government service — Phase 5, waiting on keys.</w:t>
       </w:r>
     </w:p>
     <w:p>
@@ -3435,7 +3569,7 @@
           <w:sz w:val="23"/>
           <w:szCs w:val="23"/>
         </w:rPr>
-        <w:t xml:space="preserve">Q.  What if the translation is wrong in Tamil?</w:t>
+        <w:t xml:space="preserve">Q.  Have you validated your safety thresholds?</w:t>
       </w:r>
     </w:p>
     <w:p>
@@ -3451,7 +3585,7 @@
           <w:sz w:val="22"/>
           <w:szCs w:val="22"/>
         </w:rPr>
-        <w:t xml:space="preserve">Two safeguards. The verdict is computed before any translation happens, so a translation error cannot change it. And the verifier checks numbers in both Latin and Indic digits, so a fabricated figure is caught in Tamil as well as English. The remaining risk is tone or nuance, which is why the proper path is Bhashini, the government translation service, rather than a general model — that is Phase 5, blocked on keys.</w:t>
+        <w:t xml:space="preserve">Not yet, and I say so in the report and in the code. They are sensible starting values. INCOIS's Boat Safety Index is the right calibration target, but its numeric criteria are not published. Getting them is one of my asks.</w:t>
       </w:r>
     </w:p>
     <w:p>
@@ -3467,7 +3601,7 @@
           <w:sz w:val="23"/>
           <w:szCs w:val="23"/>
         </w:rPr>
-        <w:t xml:space="preserve">Q.  Have you validated your safety thresholds?</w:t>
+        <w:t xml:space="preserve">Q.  What happens when there is no internet at sea?</w:t>
       </w:r>
     </w:p>
     <w:p>
@@ -3483,7 +3617,7 @@
           <w:sz w:val="22"/>
           <w:szCs w:val="22"/>
         </w:rPr>
-        <w:t xml:space="preserve">No, and I say so in the report and in the code. They are sensible starting values. I now know the right calibration target — INCOIS's Boat Safety Index, which independently selects wave steepness just as I did — but INCOIS does not publish the numeric criteria behind it. Getting those is one of my three asks.</w:t>
+        <w:t xml:space="preserve">Four-step fallback: fresh cache, live fetch with a two-second budget, stale cache, then a frozen snapshot committed in the repository. It always gives a complete answer, always says which source answered, and lowers its stated confidence.</w:t>
       </w:r>
     </w:p>
     <w:p>
@@ -3499,7 +3633,7 @@
           <w:sz w:val="23"/>
           <w:szCs w:val="23"/>
         </w:rPr>
-        <w:t xml:space="preserve">Q.  What happens when there is no internet, out at sea?</w:t>
+        <w:t xml:space="preserve">Q.  Will you finish it?</w:t>
       </w:r>
     </w:p>
     <w:p>
@@ -3515,71 +3649,7 @@
           <w:sz w:val="22"/>
           <w:szCs w:val="22"/>
         </w:rPr>
-        <w:t xml:space="preserve">The system falls back in four steps: fresh cache, then live fetch with a two-second budget, then stale cache, then a frozen snapshot committed in the repository. It always produces a complete answer, and it always says which one answered and lowers its stated confidence. I can demonstrate it with the wifi switched off.</w:t>
-      </w:r>
-    </w:p>
-    <w:p>
-      <w:pPr>
-        <w:spacing w:after="70" w:before="200"/>
-      </w:pPr>
-      <w:r>
-        <w:rPr>
-          <w:rFonts w:ascii="Calibri" w:cs="Calibri" w:eastAsia="Calibri" w:hAnsi="Calibri"/>
-          <w:b/>
-          <w:bCs/>
-          <w:color w:val="1F3864"/>
-          <w:sz w:val="23"/>
-          <w:szCs w:val="23"/>
-        </w:rPr>
-        <w:t xml:space="preserve">Q.  Why four agents? The problem statement lists nine roles.</w:t>
-      </w:r>
-    </w:p>
-    <w:p>
-      <w:pPr>
-        <w:spacing w:after="110" w:line="288"/>
-        <w:ind w:left="290"/>
-      </w:pPr>
-      <w:r>
-        <w:rPr>
-          <w:rFonts w:ascii="Calibri" w:cs="Calibri" w:eastAsia="Calibri" w:hAnsi="Calibri"/>
-          <w:b w:val="false"/>
-          <w:bCs w:val="false"/>
-          <w:sz w:val="22"/>
-          <w:szCs w:val="22"/>
-        </w:rPr>
-        <w:t xml:space="preserve">Those nine are capabilities, not processes. A naive nine-agent chain costs about forty seconds, and a tool a fisherman uses at four in the morning cannot take forty seconds. I use a planner and four specialists, with every other capability implemented as ordinary typed Python in the tool belt. My measured end-to-end time for a Tamil question is about eight seconds.</w:t>
-      </w:r>
-    </w:p>
-    <w:p>
-      <w:pPr>
-        <w:spacing w:after="70" w:before="200"/>
-      </w:pPr>
-      <w:r>
-        <w:rPr>
-          <w:rFonts w:ascii="Calibri" w:cs="Calibri" w:eastAsia="Calibri" w:hAnsi="Calibri"/>
-          <w:b/>
-          <w:bCs/>
-          <w:color w:val="1F3864"/>
-          <w:sz w:val="23"/>
-          <w:szCs w:val="23"/>
-        </w:rPr>
-        <w:t xml:space="preserve">Q.  Will you finish it?</w:t>
-      </w:r>
-    </w:p>
-    <w:p>
-      <w:pPr>
-        <w:spacing w:after="110" w:line="288"/>
-        <w:ind w:left="290"/>
-      </w:pPr>
-      <w:r>
-        <w:rPr>
-          <w:rFonts w:ascii="Calibri" w:cs="Calibri" w:eastAsia="Calibri" w:hAnsi="Calibri"/>
-          <w:b w:val="false"/>
-          <w:bCs w:val="false"/>
-          <w:sz w:val="22"/>
-          <w:szCs w:val="22"/>
-        </w:rPr>
-        <w:t xml:space="preserve">Four of six phases are done and the system works end to end today. What remains is the official translation path, two optional features, and hardening. The honest risk is not the code — it is the three access blockers, which is why I am raising them now rather than at the end.</w:t>
+        <w:t xml:space="preserve">Four of six phases are done and it works end to end today. What remains is the official translation path, optional features and hardening. The real risk is the three access blockers, which is why I am raising them now.</w:t>
       </w:r>
     </w:p>
     <w:p>
@@ -3766,7 +3836,7 @@
                 <w:sz w:val="19"/>
                 <w:szCs w:val="19"/>
               </w:rPr>
-              <w:t xml:space="preserve">Needs a request letter on college letterhead. Unlocks lightning and cyclone — two of the seven safety checks are coded and tested but have no data. This is the one to push for.</w:t>
+              <w:t xml:space="preserve">A request letter on college letterhead. Unlocks lightning and cyclone — two of the seven safety checks are coded and tested but have no data.</w:t>
             </w:r>
           </w:p>
         </w:tc>
@@ -3849,7 +3919,7 @@
                 <w:sz w:val="19"/>
                 <w:szCs w:val="19"/>
               </w:rPr>
-              <w:t xml:space="preserve">The numeric thresholds behind the Boat Safety Index. Ask whether the department has an INCOIS contact, or write as a student project.</w:t>
+              <w:t xml:space="preserve">The numeric thresholds behind the Boat Safety Index. Ask whether the department has an INCOIS contact.</w:t>
             </w:r>
           </w:p>
         </w:tc>
@@ -4102,7 +4172,7 @@
                 <w:sz w:val="19"/>
                 <w:szCs w:val="19"/>
               </w:rPr>
-              <w:t xml:space="preserve">The whole argument in three paragraphs, ending on the 93.9 % result.</w:t>
+              <w:t xml:space="preserve">The argument in three paragraphs, ending on the 93.9 % result.</w:t>
             </w:r>
           </w:p>
         </w:tc>
@@ -4159,7 +4229,7 @@
                 <w:sz w:val="19"/>
                 <w:szCs w:val="19"/>
               </w:rPr>
-              <w:t xml:space="preserve">Who the user is, the boxed problem statement, and six numbered objectives. — 5 marks</w:t>
+              <w:t xml:space="preserve">Context, the boxed problem statement, six objectives. — 5 marks</w:t>
             </w:r>
           </w:p>
         </w:tc>
@@ -4216,7 +4286,7 @@
                 <w:sz w:val="19"/>
                 <w:szCs w:val="19"/>
               </w:rPr>
-              <w:t xml:space="preserve">Eleven subsections: what India publishes (2.1–2.3), the last-mile problem (2.4), ML weather models as the road not taken (2.5), tool-using agents and the two closest systems (2.6–2.7), hallucination (2.8), Indian-language NLP (2.9), verification method (2.10), and the comparison table (2.11). — 10 marks</w:t>
+              <w:t xml:space="preserve">Eleven subsections plus the comparison table (2.11). — 10 marks</w:t>
             </w:r>
           </w:p>
         </w:tc>
@@ -4273,7 +4343,7 @@
                 <w:sz w:val="19"/>
                 <w:szCs w:val="19"/>
               </w:rPr>
-              <w:t xml:space="preserve">One bold sentence, then six enumerated gaps G1–G6, each mapping to an objective. — 5 marks</w:t>
+              <w:t xml:space="preserve">One bold sentence, then gaps G1–G6, each mapped to an objective. — 5 marks</w:t>
             </w:r>
           </w:p>
         </w:tc>
@@ -4330,7 +4400,7 @@
                 <w:sz w:val="19"/>
                 <w:szCs w:val="19"/>
               </w:rPr>
-              <w:t xml:space="preserve">Architecture figure, the Observation schema, the threshold table, the data-source table, the tech stack, and the evaluation method. — 5 marks</w:t>
+              <w:t xml:space="preserve">Architecture, Observation schema, threshold table, data sources, tools, evaluation method. — 5 marks</w:t>
             </w:r>
           </w:p>
         </w:tc>
@@ -4361,7 +4431,7 @@
                 <w:sz w:val="22"/>
                 <w:szCs w:val="22"/>
               </w:rPr>
-              <w:t xml:space="preserve">§5  Progress and Preliminary Results</w:t>
+              <w:t xml:space="preserve">§5  Progress and Results</w:t>
             </w:r>
           </w:p>
         </w:tc>
@@ -4387,7 +4457,7 @@
                 <w:sz w:val="19"/>
                 <w:szCs w:val="19"/>
               </w:rPr>
-              <w:t xml:space="preserve">Four of six phases, 115 tests, the accuracy table, and the measured latency figure.</w:t>
+              <w:t xml:space="preserve">Four of six phases, 115 tests, the accuracy table, latency.</w:t>
             </w:r>
           </w:p>
         </w:tc>
@@ -4444,7 +4514,7 @@
                 <w:sz w:val="19"/>
                 <w:szCs w:val="19"/>
               </w:rPr>
-              <w:t xml:space="preserve">Phases 5 and 6 plus the three blockers, each marked Blocked with its reason.</w:t>
+              <w:t xml:space="preserve">Phases 5 and 6, plus three blockers with reasons.</w:t>
             </w:r>
           </w:p>
         </w:tc>
@@ -4501,7 +4571,7 @@
                 <w:sz w:val="19"/>
                 <w:szCs w:val="19"/>
               </w:rPr>
-              <w:t xml:space="preserve">Fifteen, every one checked against the publisher or repository record.</w:t>
+              <w:t xml:space="preserve">Fifteen, each checked against the publisher record.</w:t>
             </w:r>
           </w:p>
         </w:tc>
@@ -4733,7 +4803,7 @@
                 <w:sz w:val="21"/>
                 <w:szCs w:val="21"/>
               </w:rPr>
-              <w:t xml:space="preserve">Code size</w:t>
+              <w:t xml:space="preserve">Day-ahead hit rate (POD)</w:t>
             </w:r>
           </w:p>
         </w:tc>
@@ -4759,7 +4829,7 @@
                 <w:sz w:val="22"/>
                 <w:szCs w:val="22"/>
               </w:rPr>
-              <w:t xml:space="preserve">~4,700 lines Python, ~630 TypeScript</w:t>
+              <w:t xml:space="preserve">93.9 %</w:t>
             </w:r>
           </w:p>
         </w:tc>
@@ -4790,7 +4860,7 @@
                 <w:sz w:val="21"/>
                 <w:szCs w:val="21"/>
               </w:rPr>
-              <w:t xml:space="preserve">Day-ahead hit rate (POD)</w:t>
+              <w:t xml:space="preserve">Day-ahead false-alarm ratio (FAR)</w:t>
             </w:r>
           </w:p>
         </w:tc>
@@ -4816,7 +4886,7 @@
                 <w:sz w:val="22"/>
                 <w:szCs w:val="22"/>
               </w:rPr>
-              <w:t xml:space="preserve">93.9 %</w:t>
+              <w:t xml:space="preserve">3.1 %</w:t>
             </w:r>
           </w:p>
         </w:tc>
@@ -4847,7 +4917,7 @@
                 <w:sz w:val="21"/>
                 <w:szCs w:val="21"/>
               </w:rPr>
-              <w:t xml:space="preserve">Day-ahead false-alarm ratio (FAR)</w:t>
+              <w:t xml:space="preserve">Backtest sample</w:t>
             </w:r>
           </w:p>
         </w:tc>
@@ -4873,7 +4943,7 @@
                 <w:sz w:val="22"/>
                 <w:szCs w:val="22"/>
               </w:rPr>
-              <w:t xml:space="preserve">3.1 %</w:t>
+              <w:t xml:space="preserve">92 mornings × 5 harbours = 460</w:t>
             </w:r>
           </w:p>
         </w:tc>
@@ -4904,7 +4974,7 @@
                 <w:sz w:val="21"/>
                 <w:szCs w:val="21"/>
               </w:rPr>
-              <w:t xml:space="preserve">Backtest sample</w:t>
+              <w:t xml:space="preserve">Misses graded GO</w:t>
             </w:r>
           </w:p>
         </w:tc>
@@ -4930,7 +5000,7 @@
                 <w:sz w:val="22"/>
                 <w:szCs w:val="22"/>
               </w:rPr>
-              <w:t xml:space="preserve">92 mornings × 5 harbours = 460 harbour-mornings</w:t>
+              <w:t xml:space="preserve">Zero (both graded CAUTION)</w:t>
             </w:r>
           </w:p>
         </w:tc>
@@ -4961,7 +5031,7 @@
                 <w:sz w:val="21"/>
                 <w:szCs w:val="21"/>
               </w:rPr>
-              <w:t xml:space="preserve">Misses graded GO</w:t>
+              <w:t xml:space="preserve">Tamil question, end to end</w:t>
             </w:r>
           </w:p>
         </w:tc>
@@ -4987,7 +5057,7 @@
                 <w:sz w:val="22"/>
                 <w:szCs w:val="22"/>
               </w:rPr>
-              <w:t xml:space="preserve">Zero</w:t>
+              <w:t xml:space="preserve">~8 seconds</w:t>
             </w:r>
           </w:p>
         </w:tc>
@@ -5018,7 +5088,7 @@
                 <w:sz w:val="21"/>
                 <w:szCs w:val="21"/>
               </w:rPr>
-              <w:t xml:space="preserve">Tamil question, end to end</w:t>
+              <w:t xml:space="preserve">Safety decision time</w:t>
             </w:r>
           </w:p>
         </w:tc>
@@ -5044,7 +5114,7 @@
                 <w:sz w:val="22"/>
                 <w:szCs w:val="22"/>
               </w:rPr>
-              <w:t xml:space="preserve">~8 seconds</w:t>
+              <w:t xml:space="preserve">under 50 ms</w:t>
             </w:r>
           </w:p>
         </w:tc>
@@ -5075,7 +5145,7 @@
                 <w:sz w:val="21"/>
                 <w:szCs w:val="21"/>
               </w:rPr>
-              <w:t xml:space="preserve">Safety decision time</w:t>
+              <w:t xml:space="preserve">Numbers recorded per question</w:t>
             </w:r>
           </w:p>
         </w:tc>
@@ -5101,7 +5171,7 @@
                 <w:sz w:val="22"/>
                 <w:szCs w:val="22"/>
               </w:rPr>
-              <w:t xml:space="preserve">under 50 ms</w:t>
+              <w:t xml:space="preserve">~130</w:t>
             </w:r>
           </w:p>
         </w:tc>
@@ -5132,7 +5202,7 @@
                 <w:sz w:val="21"/>
                 <w:szCs w:val="21"/>
               </w:rPr>
-              <w:t xml:space="preserve">Numbers recorded per briefing</w:t>
+              <w:t xml:space="preserve">Named landing centres</w:t>
             </w:r>
           </w:p>
         </w:tc>
@@ -5158,7 +5228,7 @@
                 <w:sz w:val="22"/>
                 <w:szCs w:val="22"/>
               </w:rPr>
-              <w:t xml:space="preserve">~130</w:t>
+              <w:t xml:space="preserve">1,223</w:t>
             </w:r>
           </w:p>
         </w:tc>
@@ -5189,7 +5259,7 @@
                 <w:sz w:val="21"/>
                 <w:szCs w:val="21"/>
               </w:rPr>
-              <w:t xml:space="preserve">Named landing centres resolvable</w:t>
+              <w:t xml:space="preserve">PFZ sectors</w:t>
             </w:r>
           </w:p>
         </w:tc>
@@ -5215,7 +5285,7 @@
                 <w:sz w:val="22"/>
                 <w:szCs w:val="22"/>
               </w:rPr>
-              <w:t xml:space="preserve">1,223</w:t>
+              <w:t xml:space="preserve">14</w:t>
             </w:r>
           </w:p>
         </w:tc>
@@ -5246,7 +5316,7 @@
                 <w:sz w:val="21"/>
                 <w:szCs w:val="21"/>
               </w:rPr>
-              <w:t xml:space="preserve">References in the synopsis</w:t>
+              <w:t xml:space="preserve">References</w:t>
             </w:r>
           </w:p>
         </w:tc>
@@ -5755,23 +5825,5 @@
       <w:szCs w:val="30"/>
     </w:rPr>
   </w:style>
-  <w:style w:type="paragraph" w:styleId="Heading2">
-    <w:name w:val="Heading 2"/>
-    <w:basedOn w:val="Normal"/>
-    <w:next w:val="Normal"/>
-    <w:qFormat/>
-    <w:pPr>
-      <w:spacing w:after="110" w:before="240"/>
-      <w:outlineLvl w:val="1"/>
-    </w:pPr>
-    <w:rPr>
-      <w:rFonts w:ascii="Calibri" w:cs="Calibri" w:eastAsia="Calibri" w:hAnsi="Calibri"/>
-      <w:b/>
-      <w:bCs/>
-      <w:color w:val="2E5A96"/>
-      <w:sz w:val="24"/>
-      <w:szCs w:val="24"/>
-    </w:rPr>
-  </w:style>
 </w:styles>
 </file>
</xml_diff>

<commit_message>
docs: literature review rebuilt on eight recent, DOI-verified studies
Synopsis and deck remade around 8 of the 20 papers in a ChatGPT literature
review, chosen for relevance and recency (half from 2023 or later): Kurup
2024, Sarangi 2024, Saka 2021 (Thoondil), Anabel 2018 (Fisher Friend),
Vincent 2020, Lewis 2020 (RAG), Niu 2024 (RAGTruth), Gala 2023 (IndicTrans2).
INCOIS SVAS and Jolliffe & Stephenson retained as methodology references.

Every citation verified against Crossref; corrected volume/article numbers
and author lists where the source review was wrong or incomplete.

Synopsis: section 2 rewritten with a limitation per study, new comparison
matrix, gaps G1-G6 re-evidenced, gap claim softened to "we found no
published system". Deck: 10 slides, two four-study survey tables. Script
and brief re-synced. Rendered QA fixed a wrapped "93.9 %" and dead space on
the survey slides; brief measured at exactly two pages.

Co-Authored-By: Claude Opus 5.5 <noreply@anthropic.com>
</commit_message>
<xml_diff>
--- a/docs/Sagar_Setu_Presentation_Script.docx
+++ b/docs/Sagar_Setu_Presentation_Script.docx
@@ -30,7 +30,7 @@
           <w:sz w:val="23"/>
           <w:szCs w:val="23"/>
         </w:rPr>
-        <w:t xml:space="preserve">Mid-term review  ·  13 October 2026  ·  11 slides  ·  ≈ 13 minutes</w:t>
+        <w:t xml:space="preserve">Mid-term review  ·  13 October 2026  ·  10 slides  ·  ≈ 12 minutes</w:t>
       </w:r>
     </w:p>
     <w:p>
@@ -118,7 +118,7 @@
           <w:sz w:val="22"/>
           <w:szCs w:val="22"/>
         </w:rPr>
-        <w:t xml:space="preserve">Have the synopsis open at Section 2.11, the comparison table — the page she is most likely to ask about.</w:t>
+        <w:t xml:space="preserve">Have the synopsis open at Section 2.8, the comparison table — the page she is most likely to ask about.</w:t>
       </w:r>
     </w:p>
     <w:p>
@@ -138,7 +138,7 @@
           <w:sz w:val="22"/>
           <w:szCs w:val="22"/>
         </w:rPr>
-        <w:t xml:space="preserve">On the three literature slides, do not read the tables. Read the study name, one finding, then the red column. The red column is the point.</w:t>
+        <w:t xml:space="preserve">On the two literature slides, do not read the tables. Read the study name, one finding, then the red column. The red column is the point.</w:t>
       </w:r>
     </w:p>
     <w:p>
@@ -158,7 +158,7 @@
           <w:sz w:val="22"/>
           <w:szCs w:val="22"/>
         </w:rPr>
-        <w:t xml:space="preserve">Print this script. Read it twice tonight, then speak from the bold lines.</w:t>
+        <w:t xml:space="preserve">Print this script. Read it twice, then speak from the bold lines.</w:t>
       </w:r>
     </w:p>
     <w:p>
@@ -209,7 +209,7 @@
           <w:sz w:val="22"/>
           <w:szCs w:val="22"/>
         </w:rPr>
-        <w:t xml:space="preserve">The gap comes out of the literature: every survey row ends in a red “limitation for our problem”, and those limitations become G1–G6.</w:t>
+        <w:t xml:space="preserve">Eight recent, verified studies. Every survey row ends in a red “limitation for our problem”, and those limitations become G1–G6.</w:t>
       </w:r>
     </w:p>
     <w:p>
@@ -229,7 +229,7 @@
           <w:sz w:val="22"/>
           <w:szCs w:val="22"/>
         </w:rPr>
-        <w:t xml:space="preserve">The AI never decides safety. ClimSight's own finding — deterministic computation beats generation — supports that design.</w:t>
+        <w:t xml:space="preserve">The AI never decides safety. RAGTruth (ACL 2024) is why: even with the right data retrieved, models still produce unsupported content.</w:t>
       </w:r>
     </w:p>
     <w:p>
@@ -625,7 +625,7 @@
           <w:sz w:val="21"/>
           <w:szCs w:val="21"/>
         </w:rPr>
-        <w:t xml:space="preserve">“To see what already exists, I surveyed the literature in three groups.”</w:t>
+        <w:t xml:space="preserve">“To see what already exists, I reviewed eight studies, chosen from a wider survey of twenty for relevance and recency.”</w:t>
       </w:r>
     </w:p>
     <w:p>
@@ -642,7 +642,7 @@
           <w:sz w:val="23"/>
           <w:szCs w:val="23"/>
         </w:rPr>
-        <w:t xml:space="preserve">  SLIDE 3  —  Literature survey I — Indian marine information services</w:t>
+        <w:t xml:space="preserve">  SLIDE 3  —  Literature survey I — the fisherman's needs</w:t>
       </w:r>
       <w:r>
         <w:rPr>
@@ -653,7 +653,7 @@
           <w:sz w:val="22"/>
           <w:szCs w:val="22"/>
         </w:rPr>
-        <w:t xml:space="preserve">        1:45  </w:t>
+        <w:t xml:space="preserve">        2:00  </w:t>
       </w:r>
     </w:p>
     <w:p>
@@ -668,7 +668,7 @@
           <w:sz w:val="23"/>
           <w:szCs w:val="23"/>
         </w:rPr>
-        <w:t xml:space="preserve">The first group is India's own marine information services. Each row reads left to right — the study, what it did, its method and data, the finding, and in red, </w:t>
+        <w:t xml:space="preserve">The first four cover what the fisherman needs and the systems already built for him. Each row reads left to right — the study, what it did, its method and data, the finding, and in red, </w:t>
       </w:r>
       <w:r>
         <w:rPr>
@@ -703,17 +703,27 @@
           <w:sz w:val="23"/>
           <w:szCs w:val="23"/>
         </w:rPr>
-        <w:t xml:space="preserve">Nair et al., 2013, in Current Science</w:t>
-      </w:r>
-      <w:r>
-        <w:rPr>
-          <w:rFonts w:ascii="Calibri" w:cs="Calibri" w:eastAsia="Calibri" w:hAnsi="Calibri"/>
-          <w:b w:val="false"/>
-          <w:bCs w:val="false"/>
-          <w:sz w:val="23"/>
-          <w:szCs w:val="23"/>
-        </w:rPr>
-        <w:t xml:space="preserve">, validated INCOIS's Ocean State Forecast against wave-rider buoys, ship-borne meters and satellite altimeters — scatter index under fifteen percent. An excellent forecast. But it validates the forecast field, not any decision.</w:t>
+        <w:t xml:space="preserve">Kurup et al., 2024, in Weather</w:t>
+      </w:r>
+      <w:r>
+        <w:rPr>
+          <w:rFonts w:ascii="Calibri" w:cs="Calibri" w:eastAsia="Calibri" w:hAnsi="Calibri"/>
+          <w:b w:val="false"/>
+          <w:bCs w:val="false"/>
+          <w:sz w:val="23"/>
+          <w:szCs w:val="23"/>
+        </w:rPr>
+        <w:t xml:space="preserve">, built localised wind forecasts for small-boat fishers in Kerala — the WRF model downscaled to a 5 km grid. They showed local forecasts complement the official ones, which cover large ocean areas. But it is a better forecast of wind; </w:t>
+      </w:r>
+      <w:r>
+        <w:rPr>
+          <w:rFonts w:ascii="Calibri" w:cs="Calibri" w:eastAsia="Calibri" w:hAnsi="Calibri"/>
+          <w:b/>
+          <w:bCs/>
+          <w:sz w:val="23"/>
+          <w:szCs w:val="23"/>
+        </w:rPr>
+        <w:t xml:space="preserve">the go / no-go decision is still left to the fisherman.</w:t>
       </w:r>
     </w:p>
     <w:p>
@@ -728,17 +738,27 @@
           <w:sz w:val="23"/>
           <w:szCs w:val="23"/>
         </w:rPr>
-        <w:t xml:space="preserve">INCOIS's Small Vessel Advisory</w:t>
-      </w:r>
-      <w:r>
-        <w:rPr>
-          <w:rFonts w:ascii="Calibri" w:cs="Calibri" w:eastAsia="Calibri" w:hAnsi="Calibri"/>
-          <w:b w:val="false"/>
-          <w:bCs w:val="false"/>
-          <w:sz w:val="23"/>
-          <w:szCs w:val="23"/>
-        </w:rPr>
-        <w:t xml:space="preserve"> is the closest product to my safety work. It computes a Boat Safety Index from wave height, steepness, directional spread and wind-sea growth, per boat width. It independently confirms that steepness and vessel size matter. But it is a colour map, in English, its thresholds are not published, and it knows nothing about fishing zones or borders.</w:t>
+        <w:t xml:space="preserve">Sarangi et al., 2024</w:t>
+      </w:r>
+      <w:r>
+        <w:rPr>
+          <w:rFonts w:ascii="Calibri" w:cs="Calibri" w:eastAsia="Calibri" w:hAnsi="Calibri"/>
+          <w:b w:val="false"/>
+          <w:bCs w:val="false"/>
+          <w:sz w:val="23"/>
+          <w:szCs w:val="23"/>
+        </w:rPr>
+        <w:t xml:space="preserve">, generated fishing zones for the Bay of Bengal from six satellite parameters and validated them against Fishery Survey of India catch data. Chlorophyll mattered most. It produces a zone map — not linked to safety or the border. And it shows how much work a validated fishing-zone product takes, which is why </w:t>
+      </w:r>
+      <w:r>
+        <w:rPr>
+          <w:rFonts w:ascii="Calibri" w:cs="Calibri" w:eastAsia="Calibri" w:hAnsi="Calibri"/>
+          <w:b/>
+          <w:bCs/>
+          <w:sz w:val="23"/>
+          <w:szCs w:val="23"/>
+        </w:rPr>
+        <w:t xml:space="preserve">I use INCOIS's advisory rather than building my own.</w:t>
       </w:r>
     </w:p>
     <w:p>
@@ -748,22 +768,72 @@
       <w:r>
         <w:rPr>
           <w:rFonts w:ascii="Calibri" w:cs="Calibri" w:eastAsia="Calibri" w:hAnsi="Calibri"/>
-          <w:b/>
-          <w:bCs/>
-          <w:sz w:val="23"/>
-          <w:szCs w:val="23"/>
-        </w:rPr>
-        <w:t xml:space="preserve">Pillai and Nair, 2010</w:t>
-      </w:r>
-      <w:r>
-        <w:rPr>
-          <w:rFonts w:ascii="Calibri" w:cs="Calibri" w:eastAsia="Calibri" w:hAnsi="Calibri"/>
-          <w:b w:val="false"/>
-          <w:bCs w:val="false"/>
-          <w:sz w:val="23"/>
-          <w:szCs w:val="23"/>
-        </w:rPr>
-        <w:t xml:space="preserve">, validated the fishing-zone advisories on the Kerala coast from 2006 to 2010 — roughly two to six times the catch inside the zones. A real benefit. But it is a bulletin.</w:t>
+          <w:b w:val="false"/>
+          <w:bCs w:val="false"/>
+          <w:sz w:val="23"/>
+          <w:szCs w:val="23"/>
+        </w:rPr>
+        <w:t xml:space="preserve">The next two are the </w:t>
+      </w:r>
+      <w:r>
+        <w:rPr>
+          <w:rFonts w:ascii="Calibri" w:cs="Calibri" w:eastAsia="Calibri" w:hAnsi="Calibri"/>
+          <w:b/>
+          <w:bCs/>
+          <w:sz w:val="23"/>
+          <w:szCs w:val="23"/>
+        </w:rPr>
+        <w:t xml:space="preserve">closest existing systems</w:t>
+      </w:r>
+      <w:r>
+        <w:rPr>
+          <w:rFonts w:ascii="Calibri" w:cs="Calibri" w:eastAsia="Calibri" w:hAnsi="Calibri"/>
+          <w:b w:val="false"/>
+          <w:bCs w:val="false"/>
+          <w:sz w:val="23"/>
+          <w:szCs w:val="23"/>
+        </w:rPr>
+        <w:t xml:space="preserve">. </w:t>
+      </w:r>
+      <w:r>
+        <w:rPr>
+          <w:rFonts w:ascii="Calibri" w:cs="Calibri" w:eastAsia="Calibri" w:hAnsi="Calibri"/>
+          <w:b/>
+          <w:bCs/>
+          <w:sz w:val="23"/>
+          <w:szCs w:val="23"/>
+        </w:rPr>
+        <w:t xml:space="preserve">Thoondil</w:t>
+      </w:r>
+      <w:r>
+        <w:rPr>
+          <w:rFonts w:ascii="Calibri" w:cs="Calibri" w:eastAsia="Calibri" w:hAnsi="Calibri"/>
+          <w:b w:val="false"/>
+          <w:bCs w:val="false"/>
+          <w:sz w:val="23"/>
+          <w:szCs w:val="23"/>
+        </w:rPr>
+        <w:t xml:space="preserve">, Saka et al. 2021, is a safety app run by the Tamil Nadu Fisheries department — offline maps, weather, fishing zones, incident reporting, fifteen thousand downloads. </w:t>
+      </w:r>
+      <w:r>
+        <w:rPr>
+          <w:rFonts w:ascii="Calibri" w:cs="Calibri" w:eastAsia="Calibri" w:hAnsi="Calibri"/>
+          <w:b/>
+          <w:bCs/>
+          <w:sz w:val="23"/>
+          <w:szCs w:val="23"/>
+        </w:rPr>
+        <w:t xml:space="preserve">Fisher Friend</w:t>
+      </w:r>
+      <w:r>
+        <w:rPr>
+          <w:rFonts w:ascii="Calibri" w:cs="Calibri" w:eastAsia="Calibri" w:hAnsi="Calibri"/>
+          <w:b w:val="false"/>
+          <w:bCs w:val="false"/>
+          <w:sz w:val="23"/>
+          <w:szCs w:val="23"/>
+        </w:rPr>
+        <w:t xml:space="preserve">, Anabel et al. 2018, from the Swaminathan Foundation with INCOIS, combines fishing zones, ocean forecasts and alerts in several Indian languages.</w:t>
       </w:r>
     </w:p>
     <w:p>
@@ -778,42 +848,27 @@
           <w:sz w:val="23"/>
           <w:szCs w:val="23"/>
         </w:rPr>
-        <w:t xml:space="preserve">And dissemination — the </w:t>
-      </w:r>
-      <w:r>
-        <w:rPr>
-          <w:rFonts w:ascii="Calibri" w:cs="Calibri" w:eastAsia="Calibri" w:hAnsi="Calibri"/>
-          <w:b/>
-          <w:bCs/>
-          <w:sz w:val="23"/>
-          <w:szCs w:val="23"/>
-        </w:rPr>
-        <w:t xml:space="preserve">Fisher Friend app</w:t>
-      </w:r>
-      <w:r>
-        <w:rPr>
-          <w:rFonts w:ascii="Calibri" w:cs="Calibri" w:eastAsia="Calibri" w:hAnsi="Calibri"/>
-          <w:b w:val="false"/>
-          <w:bCs w:val="false"/>
-          <w:sz w:val="23"/>
-          <w:szCs w:val="23"/>
-        </w:rPr>
-        <w:t xml:space="preserve">, INCOIS's SMS and helplines — reaches nine languages, but it is broadcast. None of it accepts a question.</w:t>
-      </w:r>
-    </w:p>
-    <w:p>
-      <w:pPr>
-        <w:spacing w:after="140" w:line="300"/>
-      </w:pPr>
-      <w:r>
-        <w:rPr>
-          <w:rFonts w:ascii="Calibri" w:cs="Calibri" w:eastAsia="Calibri" w:hAnsi="Calibri"/>
-          <w:b/>
-          <w:bCs/>
-          <w:sz w:val="23"/>
-          <w:szCs w:val="23"/>
-        </w:rPr>
-        <w:t xml:space="preserve">So India's marine data is validated and excellent. What no product does is reason across all three and answer a question.</w:t>
+        <w:t xml:space="preserve">Both prove the delivery works. But both are menu screens — </w:t>
+      </w:r>
+      <w:r>
+        <w:rPr>
+          <w:rFonts w:ascii="Calibri" w:cs="Calibri" w:eastAsia="Calibri" w:hAnsi="Calibri"/>
+          <w:b/>
+          <w:bCs/>
+          <w:sz w:val="23"/>
+          <w:szCs w:val="23"/>
+        </w:rPr>
+        <w:t xml:space="preserve">the fisherman still reads each screen and combines them himself.</w:t>
+      </w:r>
+      <w:r>
+        <w:rPr>
+          <w:rFonts w:ascii="Calibri" w:cs="Calibri" w:eastAsia="Calibri" w:hAnsi="Calibri"/>
+          <w:b w:val="false"/>
+          <w:bCs w:val="false"/>
+          <w:sz w:val="23"/>
+          <w:szCs w:val="23"/>
+        </w:rPr>
+        <w:t xml:space="preserve"> Neither takes a question, neither gives a verdict.</w:t>
       </w:r>
     </w:p>
     <w:p>
@@ -833,7 +888,7 @@
           <w:sz w:val="20"/>
           <w:szCs w:val="20"/>
         </w:rPr>
-        <w:t xml:space="preserve">Do not read every cell. For each row: bold study name, one finding, then point at the red column. The Small Vessel Advisory row deserves the most time — it is the strongest item in the review.</w:t>
+        <w:t xml:space="preserve">This slide carries the most marks. Do not read every cell: study name, one finding, then point at the red column. Slow down on Thoondil and Fisher Friend — she may know them.</w:t>
       </w:r>
     </w:p>
     <w:p>
@@ -860,7 +915,7 @@
           <w:sz w:val="21"/>
           <w:szCs w:val="21"/>
         </w:rPr>
-        <w:t xml:space="preserve">“The second group is the techniques I could build with.”</w:t>
+        <w:t xml:space="preserve">“The second four cover the border and the AI techniques.”</w:t>
       </w:r>
     </w:p>
     <w:p>
@@ -877,7 +932,7 @@
           <w:sz w:val="23"/>
           <w:szCs w:val="23"/>
         </w:rPr>
-        <w:t xml:space="preserve">  SLIDE 4  —  Literature survey II — forecasting and AI reasoning techniques</w:t>
+        <w:t xml:space="preserve">  SLIDE 4  —  Literature survey II — the border and the AI</w:t>
       </w:r>
       <w:r>
         <w:rPr>
@@ -888,7 +943,7 @@
           <w:sz w:val="22"/>
           <w:szCs w:val="22"/>
         </w:rPr>
-        <w:t xml:space="preserve">        1:15  </w:t>
+        <w:t xml:space="preserve">        1:45  </w:t>
       </w:r>
     </w:p>
     <w:p>
@@ -898,52 +953,22 @@
       <w:r>
         <w:rPr>
           <w:rFonts w:ascii="Calibri" w:cs="Calibri" w:eastAsia="Calibri" w:hAnsi="Calibri"/>
-          <w:b w:val="false"/>
-          <w:bCs w:val="false"/>
-          <w:sz w:val="23"/>
-          <w:szCs w:val="23"/>
-        </w:rPr>
-        <w:t xml:space="preserve">Two halves. </w:t>
-      </w:r>
-      <w:r>
-        <w:rPr>
-          <w:rFonts w:ascii="Calibri" w:cs="Calibri" w:eastAsia="Calibri" w:hAnsi="Calibri"/>
-          <w:b/>
-          <w:bCs/>
-          <w:sz w:val="23"/>
-          <w:szCs w:val="23"/>
-        </w:rPr>
-        <w:t xml:space="preserve">GraphCast and Pangu-Weather</w:t>
-      </w:r>
-      <w:r>
-        <w:rPr>
-          <w:rFonts w:ascii="Calibri" w:cs="Calibri" w:eastAsia="Calibri" w:hAnsi="Calibri"/>
-          <w:b w:val="false"/>
-          <w:bCs w:val="false"/>
-          <w:sz w:val="23"/>
-          <w:szCs w:val="23"/>
-        </w:rPr>
-        <w:t xml:space="preserve"> — Science and Nature, 2023 — are machine-learned forecasting models that now rival operational prediction. They are in my review as </w:t>
-      </w:r>
-      <w:r>
-        <w:rPr>
-          <w:rFonts w:ascii="Calibri" w:cs="Calibri" w:eastAsia="Calibri" w:hAnsi="Calibri"/>
-          <w:b/>
-          <w:bCs/>
-          <w:sz w:val="23"/>
-          <w:szCs w:val="23"/>
-        </w:rPr>
-        <w:t xml:space="preserve">the road not taken</w:t>
-      </w:r>
-      <w:r>
-        <w:rPr>
-          <w:rFonts w:ascii="Calibri" w:cs="Calibri" w:eastAsia="Calibri" w:hAnsi="Calibri"/>
-          <w:b w:val="false"/>
-          <w:bCs w:val="false"/>
-          <w:sz w:val="23"/>
-          <w:szCs w:val="23"/>
-        </w:rPr>
-        <w:t xml:space="preserve">: they need decades of reanalysis and heavy compute, and they would replace a forecast INCOIS already provides, validated and free.</w:t>
+          <w:b/>
+          <w:bCs/>
+          <w:sz w:val="23"/>
+          <w:szCs w:val="23"/>
+        </w:rPr>
+        <w:t xml:space="preserve">Vincent, 2020, in Maritime Affairs</w:t>
+      </w:r>
+      <w:r>
+        <w:rPr>
+          <w:rFonts w:ascii="Calibri" w:cs="Calibri" w:eastAsia="Calibri" w:hAnsi="Calibri"/>
+          <w:b w:val="false"/>
+          <w:bCs w:val="false"/>
+          <w:sz w:val="23"/>
+          <w:szCs w:val="23"/>
+        </w:rPr>
+        <w:t xml:space="preserve">, analyses the Palk Bay fishing conflict and argues it needs joint India–Sri Lanka governance. It establishes that the border problem is recurring and structural. I do not try to solve the politics — only the fisherman's need to know where the line is.</w:t>
       </w:r>
     </w:p>
     <w:p>
@@ -953,72 +978,22 @@
       <w:r>
         <w:rPr>
           <w:rFonts w:ascii="Calibri" w:cs="Calibri" w:eastAsia="Calibri" w:hAnsi="Calibri"/>
-          <w:b w:val="false"/>
-          <w:bCs w:val="false"/>
-          <w:sz w:val="23"/>
-          <w:szCs w:val="23"/>
-        </w:rPr>
-        <w:t xml:space="preserve">The other three make my system possible. </w:t>
-      </w:r>
-      <w:r>
-        <w:rPr>
-          <w:rFonts w:ascii="Calibri" w:cs="Calibri" w:eastAsia="Calibri" w:hAnsi="Calibri"/>
-          <w:b/>
-          <w:bCs/>
-          <w:sz w:val="23"/>
-          <w:szCs w:val="23"/>
-        </w:rPr>
-        <w:t xml:space="preserve">Retrieval-augmented generation</w:t>
-      </w:r>
-      <w:r>
-        <w:rPr>
-          <w:rFonts w:ascii="Calibri" w:cs="Calibri" w:eastAsia="Calibri" w:hAnsi="Calibri"/>
-          <w:b w:val="false"/>
-          <w:bCs w:val="false"/>
-          <w:sz w:val="23"/>
-          <w:szCs w:val="23"/>
-        </w:rPr>
-        <w:t xml:space="preserve"> grounds answers in retrieved evidence. </w:t>
-      </w:r>
-      <w:r>
-        <w:rPr>
-          <w:rFonts w:ascii="Calibri" w:cs="Calibri" w:eastAsia="Calibri" w:hAnsi="Calibri"/>
-          <w:b/>
-          <w:bCs/>
-          <w:sz w:val="23"/>
-          <w:szCs w:val="23"/>
-        </w:rPr>
-        <w:t xml:space="preserve">ReAct</w:t>
-      </w:r>
-      <w:r>
-        <w:rPr>
-          <w:rFonts w:ascii="Calibri" w:cs="Calibri" w:eastAsia="Calibri" w:hAnsi="Calibri"/>
-          <w:b w:val="false"/>
-          <w:bCs w:val="false"/>
-          <w:sz w:val="23"/>
-          <w:szCs w:val="23"/>
-        </w:rPr>
-        <w:t xml:space="preserve"> interleaves reasoning with tool calls. </w:t>
-      </w:r>
-      <w:r>
-        <w:rPr>
-          <w:rFonts w:ascii="Calibri" w:cs="Calibri" w:eastAsia="Calibri" w:hAnsi="Calibri"/>
-          <w:b/>
-          <w:bCs/>
-          <w:sz w:val="23"/>
-          <w:szCs w:val="23"/>
-        </w:rPr>
-        <w:t xml:space="preserve">Toolformer</w:t>
-      </w:r>
-      <w:r>
-        <w:rPr>
-          <w:rFonts w:ascii="Calibri" w:cs="Calibri" w:eastAsia="Calibri" w:hAnsi="Calibri"/>
-          <w:b w:val="false"/>
-          <w:bCs w:val="false"/>
-          <w:sz w:val="23"/>
-          <w:szCs w:val="23"/>
-        </w:rPr>
-        <w:t xml:space="preserve"> shows models learning when to call an API.</w:t>
+          <w:b/>
+          <w:bCs/>
+          <w:sz w:val="23"/>
+          <w:szCs w:val="23"/>
+        </w:rPr>
+        <w:t xml:space="preserve">Lewis et al., 2020</w:t>
+      </w:r>
+      <w:r>
+        <w:rPr>
+          <w:rFonts w:ascii="Calibri" w:cs="Calibri" w:eastAsia="Calibri" w:hAnsi="Calibri"/>
+          <w:b w:val="false"/>
+          <w:bCs w:val="false"/>
+          <w:sz w:val="23"/>
+          <w:szCs w:val="23"/>
+        </w:rPr>
+        <w:t xml:space="preserve"> — retrieval-augmented generation — is the principle my system rests on: tomorrow's wave height cannot come from a model's memory, it has to be fetched when the question is asked.</w:t>
       </w:r>
     </w:p>
     <w:p>
@@ -1028,22 +1003,92 @@
       <w:r>
         <w:rPr>
           <w:rFonts w:ascii="Calibri" w:cs="Calibri" w:eastAsia="Calibri" w:hAnsi="Calibri"/>
-          <w:b w:val="false"/>
-          <w:bCs w:val="false"/>
-          <w:sz w:val="23"/>
-          <w:szCs w:val="23"/>
-        </w:rPr>
-        <w:t xml:space="preserve">Their shared limitation, in red: </w:t>
-      </w:r>
-      <w:r>
-        <w:rPr>
-          <w:rFonts w:ascii="Calibri" w:cs="Calibri" w:eastAsia="Calibri" w:hAnsi="Calibri"/>
-          <w:b/>
-          <w:bCs/>
-          <w:sz w:val="23"/>
-          <w:szCs w:val="23"/>
-        </w:rPr>
-        <w:t xml:space="preserve">grounding is encouraged, not enforced. The model still writes the answer and decides what to trust.</w:t>
+          <w:b/>
+          <w:bCs/>
+          <w:sz w:val="23"/>
+          <w:szCs w:val="23"/>
+        </w:rPr>
+        <w:t xml:space="preserve">Niu et al., ACL 2024 — RAGTruth — is the key paper.</w:t>
+      </w:r>
+      <w:r>
+        <w:rPr>
+          <w:rFonts w:ascii="Calibri" w:cs="Calibri" w:eastAsia="Calibri" w:hAnsi="Calibri"/>
+          <w:b w:val="false"/>
+          <w:bCs w:val="false"/>
+          <w:sz w:val="23"/>
+          <w:szCs w:val="23"/>
+        </w:rPr>
+        <w:t xml:space="preserve"> Eighteen thousand answers from many language models, annotated word by word. It shows that </w:t>
+      </w:r>
+      <w:r>
+        <w:rPr>
+          <w:rFonts w:ascii="Calibri" w:cs="Calibri" w:eastAsia="Calibri" w:hAnsi="Calibri"/>
+          <w:b/>
+          <w:bCs/>
+          <w:sz w:val="23"/>
+          <w:szCs w:val="23"/>
+        </w:rPr>
+        <w:t xml:space="preserve">even when the right evidence is retrieved, models still produce unsupported content.</w:t>
+      </w:r>
+    </w:p>
+    <w:p>
+      <w:pPr>
+        <w:spacing w:after="140" w:line="300"/>
+      </w:pPr>
+      <w:r>
+        <w:rPr>
+          <w:rFonts w:ascii="Calibri" w:cs="Calibri" w:eastAsia="Calibri" w:hAnsi="Calibri"/>
+          <w:b w:val="false"/>
+          <w:bCs w:val="false"/>
+          <w:sz w:val="23"/>
+          <w:szCs w:val="23"/>
+        </w:rPr>
+        <w:t xml:space="preserve">That is why, in my design, </w:t>
+      </w:r>
+      <w:r>
+        <w:rPr>
+          <w:rFonts w:ascii="Calibri" w:cs="Calibri" w:eastAsia="Calibri" w:hAnsi="Calibri"/>
+          <w:b/>
+          <w:bCs/>
+          <w:sz w:val="23"/>
+          <w:szCs w:val="23"/>
+        </w:rPr>
+        <w:t xml:space="preserve">the model never makes the safety call, and every number it writes is checked mechanically.</w:t>
+      </w:r>
+    </w:p>
+    <w:p>
+      <w:pPr>
+        <w:spacing w:after="140" w:line="300"/>
+      </w:pPr>
+      <w:r>
+        <w:rPr>
+          <w:rFonts w:ascii="Calibri" w:cs="Calibri" w:eastAsia="Calibri" w:hAnsi="Calibri"/>
+          <w:b w:val="false"/>
+          <w:bCs w:val="false"/>
+          <w:sz w:val="23"/>
+          <w:szCs w:val="23"/>
+        </w:rPr>
+        <w:t xml:space="preserve">And </w:t>
+      </w:r>
+      <w:r>
+        <w:rPr>
+          <w:rFonts w:ascii="Calibri" w:cs="Calibri" w:eastAsia="Calibri" w:hAnsi="Calibri"/>
+          <w:b/>
+          <w:bCs/>
+          <w:sz w:val="23"/>
+          <w:szCs w:val="23"/>
+        </w:rPr>
+        <w:t xml:space="preserve">Gala et al., 2023 — IndicTrans2</w:t>
+      </w:r>
+      <w:r>
+        <w:rPr>
+          <w:rFonts w:ascii="Calibri" w:cs="Calibri" w:eastAsia="Calibri" w:hAnsi="Calibri"/>
+          <w:b w:val="false"/>
+          <w:bCs w:val="false"/>
+          <w:sz w:val="23"/>
+          <w:szCs w:val="23"/>
+        </w:rPr>
+        <w:t xml:space="preserve"> — covers all 22 scheduled languages. Translation is solved; nobody has attached it to a conversational system for fishermen.</w:t>
       </w:r>
     </w:p>
     <w:p>
@@ -1063,7 +1108,7 @@
           <w:sz w:val="20"/>
           <w:szCs w:val="20"/>
         </w:rPr>
-        <w:t xml:space="preserve">Move briskly. The one idea to land is the red column of the last three rows.</w:t>
+        <w:t xml:space="preserve">Pause on RAGTruth. It is the single strongest piece of external support for the whole architecture.</w:t>
       </w:r>
     </w:p>
     <w:p>
@@ -1090,7 +1135,7 @@
           <w:sz w:val="21"/>
           <w:szCs w:val="21"/>
         </w:rPr>
-        <w:t xml:space="preserve">“The third group is the closest systems to mine — and why that limitation matters.”</w:t>
+        <w:t xml:space="preserve">“Putting the eight side by side gives the research gap.”</w:t>
       </w:r>
     </w:p>
     <w:p>
@@ -1107,7 +1152,7 @@
           <w:sz w:val="23"/>
           <w:szCs w:val="23"/>
         </w:rPr>
-        <w:t xml:space="preserve">  SLIDE 5  —  Literature survey III — LLM decision support, reliability, evaluation</w:t>
+        <w:t xml:space="preserve">  SLIDE 5  —  Research gap — comparative analysis</w:t>
       </w:r>
       <w:r>
         <w:rPr>
@@ -1118,7 +1163,7 @@
           <w:sz w:val="22"/>
           <w:szCs w:val="22"/>
         </w:rPr>
-        <w:t xml:space="preserve">        1:30  </w:t>
+        <w:t xml:space="preserve">        1:45  </w:t>
       </w:r>
     </w:p>
     <w:p>
@@ -1128,42 +1173,12 @@
       <w:r>
         <w:rPr>
           <w:rFonts w:ascii="Calibri" w:cs="Calibri" w:eastAsia="Calibri" w:hAnsi="Calibri"/>
-          <w:b/>
-          <w:bCs/>
-          <w:sz w:val="23"/>
-          <w:szCs w:val="23"/>
-        </w:rPr>
-        <w:t xml:space="preserve">ClimSight</w:t>
-      </w:r>
-      <w:r>
-        <w:rPr>
-          <w:rFonts w:ascii="Calibri" w:cs="Calibri" w:eastAsia="Calibri" w:hAnsi="Calibri"/>
-          <w:b w:val="false"/>
-          <w:bCs w:val="false"/>
-          <w:sz w:val="23"/>
-          <w:szCs w:val="23"/>
-        </w:rPr>
-        <w:t xml:space="preserve">, in npj Climate Action 2025, and </w:t>
-      </w:r>
-      <w:r>
-        <w:rPr>
-          <w:rFonts w:ascii="Calibri" w:cs="Calibri" w:eastAsia="Calibri" w:hAnsi="Calibri"/>
-          <w:b/>
-          <w:bCs/>
-          <w:sz w:val="23"/>
-          <w:szCs w:val="23"/>
-        </w:rPr>
-        <w:t xml:space="preserve">WildfireGPT</w:t>
-      </w:r>
-      <w:r>
-        <w:rPr>
-          <w:rFonts w:ascii="Calibri" w:cs="Calibri" w:eastAsia="Calibri" w:hAnsi="Calibri"/>
-          <w:b w:val="false"/>
-          <w:bCs w:val="false"/>
-          <w:sz w:val="23"/>
-          <w:szCs w:val="23"/>
-        </w:rPr>
-        <w:t xml:space="preserve">, 2025, are the closest relatives: multi-agent LLM systems for climate and wildfire decision support, grounded by retrieval. But they answer analytical questions for planners, ground in documents, and still let the model write the conclusion.</w:t>
+          <w:b w:val="false"/>
+          <w:bCs w:val="false"/>
+          <w:sz w:val="23"/>
+          <w:szCs w:val="23"/>
+        </w:rPr>
+        <w:t xml:space="preserve">Every row is a study from the survey. Across the top, what my problem needs.</w:t>
       </w:r>
     </w:p>
     <w:p>
@@ -1178,27 +1193,47 @@
           <w:sz w:val="23"/>
           <w:szCs w:val="23"/>
         </w:rPr>
-        <w:t xml:space="preserve">One finding matters a lot to me. ClimSight's extension, XCLIM-AI, reports its </w:t>
-      </w:r>
-      <w:r>
-        <w:rPr>
-          <w:rFonts w:ascii="Calibri" w:cs="Calibri" w:eastAsia="Calibri" w:hAnsi="Calibri"/>
-          <w:b/>
-          <w:bCs/>
-          <w:sz w:val="23"/>
-          <w:szCs w:val="23"/>
-        </w:rPr>
-        <w:t xml:space="preserve">largest gains when indicators are computed deterministically rather than generated.</w:t>
-      </w:r>
-      <w:r>
-        <w:rPr>
-          <w:rFonts w:ascii="Calibri" w:cs="Calibri" w:eastAsia="Calibri" w:hAnsi="Calibri"/>
-          <w:b w:val="false"/>
-          <w:bCs w:val="false"/>
-          <w:sz w:val="23"/>
-          <w:szCs w:val="23"/>
-        </w:rPr>
-        <w:t xml:space="preserve"> That is independent support for my design.</w:t>
+        <w:t xml:space="preserve">Each study covers one or two columns. </w:t>
+      </w:r>
+      <w:r>
+        <w:rPr>
+          <w:rFonts w:ascii="Calibri" w:cs="Calibri" w:eastAsia="Calibri" w:hAnsi="Calibri"/>
+          <w:b/>
+          <w:bCs/>
+          <w:sz w:val="23"/>
+          <w:szCs w:val="23"/>
+        </w:rPr>
+        <w:t xml:space="preserve">Thoondil and Fisher Friend come closest</w:t>
+      </w:r>
+      <w:r>
+        <w:rPr>
+          <w:rFonts w:ascii="Calibri" w:cs="Calibri" w:eastAsia="Calibri" w:hAnsi="Calibri"/>
+          <w:b w:val="false"/>
+          <w:bCs w:val="false"/>
+          <w:sz w:val="23"/>
+          <w:szCs w:val="23"/>
+        </w:rPr>
+        <w:t xml:space="preserve"> — safety information, fishing zones, local language. But neither answers a question, neither issues a verdict from fixed rules, and neither verifies its numbers. </w:t>
+      </w:r>
+      <w:r>
+        <w:rPr>
+          <w:rFonts w:ascii="Calibri" w:cs="Calibri" w:eastAsia="Calibri" w:hAnsi="Calibri"/>
+          <w:b/>
+          <w:bCs/>
+          <w:sz w:val="23"/>
+          <w:szCs w:val="23"/>
+        </w:rPr>
+        <w:t xml:space="preserve">RAG systems</w:t>
+      </w:r>
+      <w:r>
+        <w:rPr>
+          <w:rFonts w:ascii="Calibri" w:cs="Calibri" w:eastAsia="Calibri" w:hAnsi="Calibri"/>
+          <w:b w:val="false"/>
+          <w:bCs w:val="false"/>
+          <w:sz w:val="23"/>
+          <w:szCs w:val="23"/>
+        </w:rPr>
+        <w:t xml:space="preserve"> answer questions — but RAGTruth shows they cannot be trusted with the numbers.</w:t>
       </w:r>
     </w:p>
     <w:p>
@@ -1208,22 +1243,12 @@
       <w:r>
         <w:rPr>
           <w:rFonts w:ascii="Calibri" w:cs="Calibri" w:eastAsia="Calibri" w:hAnsi="Calibri"/>
-          <w:b/>
-          <w:bCs/>
-          <w:sz w:val="23"/>
-          <w:szCs w:val="23"/>
-        </w:rPr>
-        <w:t xml:space="preserve">Lin et al., 2025</w:t>
-      </w:r>
-      <w:r>
-        <w:rPr>
-          <w:rFonts w:ascii="Calibri" w:cs="Calibri" w:eastAsia="Calibri" w:hAnsi="Calibri"/>
-          <w:b w:val="false"/>
-          <w:bCs w:val="false"/>
-          <w:sz w:val="23"/>
-          <w:szCs w:val="23"/>
-        </w:rPr>
-        <w:t xml:space="preserve">, surveyed hallucination in AI agents — five workflow stages, eighteen causes — and warn that errors can be physically consequential. That is why my verification is mechanical, not a prompt instruction.</w:t>
+          <w:b w:val="false"/>
+          <w:bCs w:val="false"/>
+          <w:sz w:val="23"/>
+          <w:szCs w:val="23"/>
+        </w:rPr>
+        <w:t xml:space="preserve">Nobody has the bottom row.</w:t>
       </w:r>
     </w:p>
     <w:p>
@@ -1233,42 +1258,22 @@
       <w:r>
         <w:rPr>
           <w:rFonts w:ascii="Calibri" w:cs="Calibri" w:eastAsia="Calibri" w:hAnsi="Calibri"/>
-          <w:b/>
-          <w:bCs/>
-          <w:sz w:val="23"/>
-          <w:szCs w:val="23"/>
-        </w:rPr>
-        <w:t xml:space="preserve">IndicTrans2</w:t>
-      </w:r>
-      <w:r>
-        <w:rPr>
-          <w:rFonts w:ascii="Calibri" w:cs="Calibri" w:eastAsia="Calibri" w:hAnsi="Calibri"/>
-          <w:b w:val="false"/>
-          <w:bCs w:val="false"/>
-          <w:sz w:val="23"/>
-          <w:szCs w:val="23"/>
-        </w:rPr>
-        <w:t xml:space="preserve"> covers all 22 scheduled languages — translation is solved, but nobody has attached it to a marine system. And </w:t>
-      </w:r>
-      <w:r>
-        <w:rPr>
-          <w:rFonts w:ascii="Calibri" w:cs="Calibri" w:eastAsia="Calibri" w:hAnsi="Calibri"/>
-          <w:b/>
-          <w:bCs/>
-          <w:sz w:val="23"/>
-          <w:szCs w:val="23"/>
-        </w:rPr>
-        <w:t xml:space="preserve">Jolliffe and Stephenson</w:t>
-      </w:r>
-      <w:r>
-        <w:rPr>
-          <w:rFonts w:ascii="Calibri" w:cs="Calibri" w:eastAsia="Calibri" w:hAnsi="Calibri"/>
-          <w:b w:val="false"/>
-          <w:bCs w:val="false"/>
-          <w:sz w:val="23"/>
-          <w:szCs w:val="23"/>
-        </w:rPr>
-        <w:t xml:space="preserve"> give the standard way to score warnings, POD and FAR — which nobody in this domain has applied to the verdict itself.</w:t>
+          <w:b w:val="false"/>
+          <w:bCs w:val="false"/>
+          <w:sz w:val="23"/>
+          <w:szCs w:val="23"/>
+        </w:rPr>
+        <w:t xml:space="preserve">So the gap: </w:t>
+      </w:r>
+      <w:r>
+        <w:rPr>
+          <w:rFonts w:ascii="Calibri" w:cs="Calibri" w:eastAsia="Calibri" w:hAnsi="Calibri"/>
+          <w:b/>
+          <w:bCs/>
+          <w:sz w:val="23"/>
+          <w:szCs w:val="23"/>
+        </w:rPr>
+        <w:t xml:space="preserve">we found no published system that lets a fisherman ask one question in his own language and receive a single operational decision — safety, fishing and border together — derived verifiably from official data rather than generated by a model.</w:t>
       </w:r>
     </w:p>
     <w:p>
@@ -1288,7 +1293,7 @@
           <w:sz w:val="20"/>
           <w:szCs w:val="20"/>
         </w:rPr>
-        <w:t xml:space="preserve">Pause on the ClimSight finding. It is the single strongest piece of external support for the whole architecture.</w:t>
+        <w:t xml:space="preserve">Walk the table row by row with your hand. Pause after “Nobody has the bottom row.” Note the wording: “we found no system”, not “we are the first” — it is easier to defend.</w:t>
       </w:r>
     </w:p>
     <w:p>
@@ -1315,7 +1320,7 @@
           <w:sz w:val="21"/>
           <w:szCs w:val="21"/>
         </w:rPr>
-        <w:t xml:space="preserve">“Putting the three groups side by side gives the research gap.”</w:t>
+        <w:t xml:space="preserve">“That breaks down into six specific gaps, and each one becomes an objective.”</w:t>
       </w:r>
     </w:p>
     <w:p>
@@ -1332,7 +1337,7 @@
           <w:sz w:val="23"/>
           <w:szCs w:val="23"/>
         </w:rPr>
-        <w:t xml:space="preserve">  SLIDE 6  —  Research gap — comparative analysis</w:t>
+        <w:t xml:space="preserve">  SLIDE 6  —  Research gaps and objectives</w:t>
       </w:r>
       <w:r>
         <w:rPr>
@@ -1343,7 +1348,7 @@
           <w:sz w:val="22"/>
           <w:szCs w:val="22"/>
         </w:rPr>
-        <w:t xml:space="preserve">        1:45  </w:t>
+        <w:t xml:space="preserve">        1:15  </w:t>
       </w:r>
     </w:p>
     <w:p>
@@ -1358,7 +1363,7 @@
           <w:sz w:val="23"/>
           <w:szCs w:val="23"/>
         </w:rPr>
-        <w:t xml:space="preserve">Every row here is a study from the survey. Across the top, the properties my problem needs.</w:t>
+        <w:t xml:space="preserve">On the left, each gap with its evidence from the survey. On the right, the objective that answers it.</w:t>
       </w:r>
     </w:p>
     <w:p>
@@ -1373,47 +1378,67 @@
           <w:sz w:val="23"/>
           <w:szCs w:val="23"/>
         </w:rPr>
-        <w:t xml:space="preserve">The </w:t>
-      </w:r>
-      <w:r>
-        <w:rPr>
-          <w:rFonts w:ascii="Calibri" w:cs="Calibri" w:eastAsia="Calibri" w:hAnsi="Calibri"/>
-          <w:b/>
-          <w:bCs/>
-          <w:sz w:val="23"/>
-          <w:szCs w:val="23"/>
-        </w:rPr>
-        <w:t xml:space="preserve">Small Vessel Advisory</w:t>
-      </w:r>
-      <w:r>
-        <w:rPr>
-          <w:rFonts w:ascii="Calibri" w:cs="Calibri" w:eastAsia="Calibri" w:hAnsi="Calibri"/>
-          <w:b w:val="false"/>
-          <w:bCs w:val="false"/>
-          <w:sz w:val="23"/>
-          <w:szCs w:val="23"/>
-        </w:rPr>
-        <w:t xml:space="preserve"> is the only one with a deterministic safety verdict — and it fails every other column. The fishing-zone advisories and Fisher Friend reach many languages, but they are broadcast. </w:t>
-      </w:r>
-      <w:r>
-        <w:rPr>
-          <w:rFonts w:ascii="Calibri" w:cs="Calibri" w:eastAsia="Calibri" w:hAnsi="Calibri"/>
-          <w:b/>
-          <w:bCs/>
-          <w:sz w:val="23"/>
-          <w:szCs w:val="23"/>
-        </w:rPr>
-        <w:t xml:space="preserve">ClimSight and WildfireGPT</w:t>
-      </w:r>
-      <w:r>
-        <w:rPr>
-          <w:rFonts w:ascii="Calibri" w:cs="Calibri" w:eastAsia="Calibri" w:hAnsi="Calibri"/>
-          <w:b w:val="false"/>
-          <w:bCs w:val="false"/>
-          <w:sz w:val="23"/>
-          <w:szCs w:val="23"/>
-        </w:rPr>
-        <w:t xml:space="preserve"> are conversational, but they ground in documents and let the model conclude.</w:t>
+        <w:t xml:space="preserve">Fragmentation and menu-driven apps, </w:t>
+      </w:r>
+      <w:r>
+        <w:rPr>
+          <w:rFonts w:ascii="Calibri" w:cs="Calibri" w:eastAsia="Calibri" w:hAnsi="Calibri"/>
+          <w:b/>
+          <w:bCs/>
+          <w:sz w:val="23"/>
+          <w:szCs w:val="23"/>
+        </w:rPr>
+        <w:t xml:space="preserve">G1 and G2</w:t>
+      </w:r>
+      <w:r>
+        <w:rPr>
+          <w:rFonts w:ascii="Calibri" w:cs="Calibri" w:eastAsia="Calibri" w:hAnsi="Calibri"/>
+          <w:b w:val="false"/>
+          <w:bCs w:val="false"/>
+          <w:sz w:val="23"/>
+          <w:szCs w:val="23"/>
+        </w:rPr>
+        <w:t xml:space="preserve">, become </w:t>
+      </w:r>
+      <w:r>
+        <w:rPr>
+          <w:rFonts w:ascii="Calibri" w:cs="Calibri" w:eastAsia="Calibri" w:hAnsi="Calibri"/>
+          <w:b/>
+          <w:bCs/>
+          <w:sz w:val="23"/>
+          <w:szCs w:val="23"/>
+        </w:rPr>
+        <w:t xml:space="preserve">O1</w:t>
+      </w:r>
+      <w:r>
+        <w:rPr>
+          <w:rFonts w:ascii="Calibri" w:cs="Calibri" w:eastAsia="Calibri" w:hAnsi="Calibri"/>
+          <w:b w:val="false"/>
+          <w:bCs w:val="false"/>
+          <w:sz w:val="23"/>
+          <w:szCs w:val="23"/>
+        </w:rPr>
+        <w:t xml:space="preserve">: one conversational interface across all three needs. Language becomes </w:t>
+      </w:r>
+      <w:r>
+        <w:rPr>
+          <w:rFonts w:ascii="Calibri" w:cs="Calibri" w:eastAsia="Calibri" w:hAnsi="Calibri"/>
+          <w:b/>
+          <w:bCs/>
+          <w:sz w:val="23"/>
+          <w:szCs w:val="23"/>
+        </w:rPr>
+        <w:t xml:space="preserve">O4</w:t>
+      </w:r>
+      <w:r>
+        <w:rPr>
+          <w:rFonts w:ascii="Calibri" w:cs="Calibri" w:eastAsia="Calibri" w:hAnsi="Calibri"/>
+          <w:b w:val="false"/>
+          <w:bCs w:val="false"/>
+          <w:sz w:val="23"/>
+          <w:szCs w:val="23"/>
+        </w:rPr>
+        <w:t xml:space="preserve">.</w:t>
       </w:r>
     </w:p>
     <w:p>
@@ -1423,12 +1448,62 @@
       <w:r>
         <w:rPr>
           <w:rFonts w:ascii="Calibri" w:cs="Calibri" w:eastAsia="Calibri" w:hAnsi="Calibri"/>
-          <w:b w:val="false"/>
-          <w:bCs w:val="false"/>
-          <w:sz w:val="23"/>
-          <w:szCs w:val="23"/>
-        </w:rPr>
-        <w:t xml:space="preserve">Nobody has the bottom row.</w:t>
+          <w:b/>
+          <w:bCs/>
+          <w:sz w:val="23"/>
+          <w:szCs w:val="23"/>
+        </w:rPr>
+        <w:t xml:space="preserve">G4 and G5 come straight from RAGTruth.</w:t>
+      </w:r>
+      <w:r>
+        <w:rPr>
+          <w:rFonts w:ascii="Calibri" w:cs="Calibri" w:eastAsia="Calibri" w:hAnsi="Calibri"/>
+          <w:b w:val="false"/>
+          <w:bCs w:val="false"/>
+          <w:sz w:val="23"/>
+          <w:szCs w:val="23"/>
+        </w:rPr>
+        <w:t xml:space="preserve"> If retrieval cannot guarantee the numbers, then </w:t>
+      </w:r>
+      <w:r>
+        <w:rPr>
+          <w:rFonts w:ascii="Calibri" w:cs="Calibri" w:eastAsia="Calibri" w:hAnsi="Calibri"/>
+          <w:b/>
+          <w:bCs/>
+          <w:sz w:val="23"/>
+          <w:szCs w:val="23"/>
+        </w:rPr>
+        <w:t xml:space="preserve">O3</w:t>
+      </w:r>
+      <w:r>
+        <w:rPr>
+          <w:rFonts w:ascii="Calibri" w:cs="Calibri" w:eastAsia="Calibri" w:hAnsi="Calibri"/>
+          <w:b w:val="false"/>
+          <w:bCs w:val="false"/>
+          <w:sz w:val="23"/>
+          <w:szCs w:val="23"/>
+        </w:rPr>
+        <w:t xml:space="preserve">: an evidence ledger and a verifier that deletes any unsupported number. And </w:t>
+      </w:r>
+      <w:r>
+        <w:rPr>
+          <w:rFonts w:ascii="Calibri" w:cs="Calibri" w:eastAsia="Calibri" w:hAnsi="Calibri"/>
+          <w:b/>
+          <w:bCs/>
+          <w:sz w:val="23"/>
+          <w:szCs w:val="23"/>
+        </w:rPr>
+        <w:t xml:space="preserve">O2</w:t>
+      </w:r>
+      <w:r>
+        <w:rPr>
+          <w:rFonts w:ascii="Calibri" w:cs="Calibri" w:eastAsia="Calibri" w:hAnsi="Calibri"/>
+          <w:b w:val="false"/>
+          <w:bCs w:val="false"/>
+          <w:sz w:val="23"/>
+          <w:szCs w:val="23"/>
+        </w:rPr>
+        <w:t xml:space="preserve">: a deterministic, tested safety verdict that sits outside the model.</w:t>
       </w:r>
     </w:p>
     <w:p>
@@ -1438,22 +1513,77 @@
       <w:r>
         <w:rPr>
           <w:rFonts w:ascii="Calibri" w:cs="Calibri" w:eastAsia="Calibri" w:hAnsi="Calibri"/>
-          <w:b w:val="false"/>
-          <w:bCs w:val="false"/>
-          <w:sz w:val="23"/>
-          <w:szCs w:val="23"/>
-        </w:rPr>
-        <w:t xml:space="preserve">So the gap: </w:t>
-      </w:r>
-      <w:r>
-        <w:rPr>
-          <w:rFonts w:ascii="Calibri" w:cs="Calibri" w:eastAsia="Calibri" w:hAnsi="Calibri"/>
-          <w:b/>
-          <w:bCs/>
-          <w:sz w:val="23"/>
-          <w:szCs w:val="23"/>
-        </w:rPr>
-        <w:t xml:space="preserve">no published system lets a fisherman ask one question in his own language and receive a single operational decision — safety, fishing and border together — that is provably derived from official products rather than generated by a model.</w:t>
+          <w:b/>
+          <w:bCs/>
+          <w:sz w:val="23"/>
+          <w:szCs w:val="23"/>
+        </w:rPr>
+        <w:t xml:space="preserve">G6</w:t>
+      </w:r>
+      <w:r>
+        <w:rPr>
+          <w:rFonts w:ascii="Calibri" w:cs="Calibri" w:eastAsia="Calibri" w:hAnsi="Calibri"/>
+          <w:b w:val="false"/>
+          <w:bCs w:val="false"/>
+          <w:sz w:val="23"/>
+          <w:szCs w:val="23"/>
+        </w:rPr>
+        <w:t xml:space="preserve"> — the studies validate forecasts and zones, never the decision — becomes </w:t>
+      </w:r>
+      <w:r>
+        <w:rPr>
+          <w:rFonts w:ascii="Calibri" w:cs="Calibri" w:eastAsia="Calibri" w:hAnsi="Calibri"/>
+          <w:b/>
+          <w:bCs/>
+          <w:sz w:val="23"/>
+          <w:szCs w:val="23"/>
+        </w:rPr>
+        <w:t xml:space="preserve">O6</w:t>
+      </w:r>
+      <w:r>
+        <w:rPr>
+          <w:rFonts w:ascii="Calibri" w:cs="Calibri" w:eastAsia="Calibri" w:hAnsi="Calibri"/>
+          <w:b w:val="false"/>
+          <w:bCs w:val="false"/>
+          <w:sz w:val="23"/>
+          <w:szCs w:val="23"/>
+        </w:rPr>
+        <w:t xml:space="preserve">: evaluate the verdict itself. And because connectivity at sea is unreliable — Thoondil ships offline maps for exactly this reason — </w:t>
+      </w:r>
+      <w:r>
+        <w:rPr>
+          <w:rFonts w:ascii="Calibri" w:cs="Calibri" w:eastAsia="Calibri" w:hAnsi="Calibri"/>
+          <w:b/>
+          <w:bCs/>
+          <w:sz w:val="23"/>
+          <w:szCs w:val="23"/>
+        </w:rPr>
+        <w:t xml:space="preserve">O5</w:t>
+      </w:r>
+      <w:r>
+        <w:rPr>
+          <w:rFonts w:ascii="Calibri" w:cs="Calibri" w:eastAsia="Calibri" w:hAnsi="Calibri"/>
+          <w:b w:val="false"/>
+          <w:bCs w:val="false"/>
+          <w:sz w:val="23"/>
+          <w:szCs w:val="23"/>
+        </w:rPr>
+        <w:t xml:space="preserve">: always answer, and say when the answer is degraded.</w:t>
+      </w:r>
+    </w:p>
+    <w:p>
+      <w:pPr>
+        <w:spacing w:after="140" w:line="300"/>
+      </w:pPr>
+      <w:r>
+        <w:rPr>
+          <w:rFonts w:ascii="Calibri" w:cs="Calibri" w:eastAsia="Calibri" w:hAnsi="Calibri"/>
+          <w:b/>
+          <w:bCs/>
+          <w:sz w:val="23"/>
+          <w:szCs w:val="23"/>
+        </w:rPr>
+        <w:t xml:space="preserve">O2 and O3 are my research contribution.</w:t>
       </w:r>
     </w:p>
     <w:p>
@@ -1473,7 +1603,7 @@
           <w:sz w:val="20"/>
           <w:szCs w:val="20"/>
         </w:rPr>
-        <w:t xml:space="preserve">Walk the table row by row with your hand. Pause after “Nobody has the bottom row.” This is the 5-mark research-gap slide.</w:t>
+        <w:t xml:space="preserve">Trace one or two rows across the table with your hand so the gap → evidence → objective link is visible.</w:t>
       </w:r>
     </w:p>
     <w:p>
@@ -1500,7 +1630,7 @@
           <w:sz w:val="21"/>
           <w:szCs w:val="21"/>
         </w:rPr>
-        <w:t xml:space="preserve">“That breaks down into six specific gaps, and each one becomes an objective.”</w:t>
+        <w:t xml:space="preserve">“Here is how the methodology delivers them.”</w:t>
       </w:r>
     </w:p>
     <w:p>
@@ -1517,7 +1647,7 @@
           <w:sz w:val="23"/>
           <w:szCs w:val="23"/>
         </w:rPr>
-        <w:t xml:space="preserve">  SLIDE 7  —  Research gaps and objectives</w:t>
+        <w:t xml:space="preserve">  SLIDE 7  —  Methodology I — architecture and techniques</w:t>
       </w:r>
       <w:r>
         <w:rPr>
@@ -1543,7 +1673,17 @@
           <w:sz w:val="23"/>
           <w:szCs w:val="23"/>
         </w:rPr>
-        <w:t xml:space="preserve">On the left, each gap with its evidence from the survey. On the right, the objective that answers it.</w:t>
+        <w:t xml:space="preserve">Five steps. The diagram on the right is the same pipeline — </w:t>
+      </w:r>
+      <w:r>
+        <w:rPr>
+          <w:rFonts w:ascii="Calibri" w:cs="Calibri" w:eastAsia="Calibri" w:hAnsi="Calibri"/>
+          <w:b/>
+          <w:bCs/>
+          <w:sz w:val="23"/>
+          <w:szCs w:val="23"/>
+        </w:rPr>
+        <w:t xml:space="preserve">blue is AI, red is no AI.</w:t>
       </w:r>
     </w:p>
     <w:p>
@@ -1558,67 +1698,7 @@
           <w:sz w:val="23"/>
           <w:szCs w:val="23"/>
         </w:rPr>
-        <w:t xml:space="preserve">Fragmentation and broadcast-only, </w:t>
-      </w:r>
-      <w:r>
-        <w:rPr>
-          <w:rFonts w:ascii="Calibri" w:cs="Calibri" w:eastAsia="Calibri" w:hAnsi="Calibri"/>
-          <w:b/>
-          <w:bCs/>
-          <w:sz w:val="23"/>
-          <w:szCs w:val="23"/>
-        </w:rPr>
-        <w:t xml:space="preserve">G1 and G2</w:t>
-      </w:r>
-      <w:r>
-        <w:rPr>
-          <w:rFonts w:ascii="Calibri" w:cs="Calibri" w:eastAsia="Calibri" w:hAnsi="Calibri"/>
-          <w:b w:val="false"/>
-          <w:bCs w:val="false"/>
-          <w:sz w:val="23"/>
-          <w:szCs w:val="23"/>
-        </w:rPr>
-        <w:t xml:space="preserve">, become </w:t>
-      </w:r>
-      <w:r>
-        <w:rPr>
-          <w:rFonts w:ascii="Calibri" w:cs="Calibri" w:eastAsia="Calibri" w:hAnsi="Calibri"/>
-          <w:b/>
-          <w:bCs/>
-          <w:sz w:val="23"/>
-          <w:szCs w:val="23"/>
-        </w:rPr>
-        <w:t xml:space="preserve">O1</w:t>
-      </w:r>
-      <w:r>
-        <w:rPr>
-          <w:rFonts w:ascii="Calibri" w:cs="Calibri" w:eastAsia="Calibri" w:hAnsi="Calibri"/>
-          <w:b w:val="false"/>
-          <w:bCs w:val="false"/>
-          <w:sz w:val="23"/>
-          <w:szCs w:val="23"/>
-        </w:rPr>
-        <w:t xml:space="preserve">: one conversational interface across all three products. Language depth becomes </w:t>
-      </w:r>
-      <w:r>
-        <w:rPr>
-          <w:rFonts w:ascii="Calibri" w:cs="Calibri" w:eastAsia="Calibri" w:hAnsi="Calibri"/>
-          <w:b/>
-          <w:bCs/>
-          <w:sz w:val="23"/>
-          <w:szCs w:val="23"/>
-        </w:rPr>
-        <w:t xml:space="preserve">O4</w:t>
-      </w:r>
-      <w:r>
-        <w:rPr>
-          <w:rFonts w:ascii="Calibri" w:cs="Calibri" w:eastAsia="Calibri" w:hAnsi="Calibri"/>
-          <w:b w:val="false"/>
-          <w:bCs w:val="false"/>
-          <w:sz w:val="23"/>
-          <w:szCs w:val="23"/>
-        </w:rPr>
-        <w:t xml:space="preserve">.</w:t>
+        <w:t xml:space="preserve">Step one, an LLM planner turns the question into a typed task graph, validated against a schema. Step two, three specialists fetch data in parallel through LangGraph, with a cache, live, stale, snapshot fallback chain.</w:t>
       </w:r>
     </w:p>
     <w:p>
@@ -1633,57 +1713,17 @@
           <w:sz w:val="23"/>
           <w:szCs w:val="23"/>
         </w:rPr>
-        <w:t xml:space="preserve">G4 and G5 are the important ones.</w:t>
-      </w:r>
-      <w:r>
-        <w:rPr>
-          <w:rFonts w:ascii="Calibri" w:cs="Calibri" w:eastAsia="Calibri" w:hAnsi="Calibri"/>
-          <w:b w:val="false"/>
-          <w:bCs w:val="false"/>
-          <w:sz w:val="23"/>
-          <w:szCs w:val="23"/>
-        </w:rPr>
-        <w:t xml:space="preserve"> Grounding is only at document level and hallucination is unsolved — so </w:t>
-      </w:r>
-      <w:r>
-        <w:rPr>
-          <w:rFonts w:ascii="Calibri" w:cs="Calibri" w:eastAsia="Calibri" w:hAnsi="Calibri"/>
-          <w:b/>
-          <w:bCs/>
-          <w:sz w:val="23"/>
-          <w:szCs w:val="23"/>
-        </w:rPr>
-        <w:t xml:space="preserve">O3</w:t>
-      </w:r>
-      <w:r>
-        <w:rPr>
-          <w:rFonts w:ascii="Calibri" w:cs="Calibri" w:eastAsia="Calibri" w:hAnsi="Calibri"/>
-          <w:b w:val="false"/>
-          <w:bCs w:val="false"/>
-          <w:sz w:val="23"/>
-          <w:szCs w:val="23"/>
-        </w:rPr>
-        <w:t xml:space="preserve">, an evidence ledger and a verifier that deletes any unsupported number. And no architecture keeps safety out of the model — so </w:t>
-      </w:r>
-      <w:r>
-        <w:rPr>
-          <w:rFonts w:ascii="Calibri" w:cs="Calibri" w:eastAsia="Calibri" w:hAnsi="Calibri"/>
-          <w:b/>
-          <w:bCs/>
-          <w:sz w:val="23"/>
-          <w:szCs w:val="23"/>
-        </w:rPr>
-        <w:t xml:space="preserve">O2</w:t>
-      </w:r>
-      <w:r>
-        <w:rPr>
-          <w:rFonts w:ascii="Calibri" w:cs="Calibri" w:eastAsia="Calibri" w:hAnsi="Calibri"/>
-          <w:b w:val="false"/>
-          <w:bCs w:val="false"/>
-          <w:sz w:val="23"/>
-          <w:szCs w:val="23"/>
-        </w:rPr>
-        <w:t xml:space="preserve">, a deterministic, tested safety verdict that sits structurally outside it.</w:t>
+        <w:t xml:space="preserve">Below the red line there is no model.</w:t>
+      </w:r>
+      <w:r>
+        <w:rPr>
+          <w:rFonts w:ascii="Calibri" w:cs="Calibri" w:eastAsia="Calibri" w:hAnsi="Calibri"/>
+          <w:b w:val="false"/>
+          <w:bCs w:val="false"/>
+          <w:sz w:val="23"/>
+          <w:szCs w:val="23"/>
+        </w:rPr>
+        <w:t xml:space="preserve"> Step three is the decision: seven parameters, three vessel classes, the worst parameter wins — never an average. Under fifty milliseconds, 115 unit tests.</w:t>
       </w:r>
     </w:p>
     <w:p>
@@ -1693,62 +1733,32 @@
       <w:r>
         <w:rPr>
           <w:rFonts w:ascii="Calibri" w:cs="Calibri" w:eastAsia="Calibri" w:hAnsi="Calibri"/>
-          <w:b/>
-          <w:bCs/>
-          <w:sz w:val="23"/>
-          <w:szCs w:val="23"/>
-        </w:rPr>
-        <w:t xml:space="preserve">G6</w:t>
-      </w:r>
-      <w:r>
-        <w:rPr>
-          <w:rFonts w:ascii="Calibri" w:cs="Calibri" w:eastAsia="Calibri" w:hAnsi="Calibri"/>
-          <w:b w:val="false"/>
-          <w:bCs w:val="false"/>
-          <w:sz w:val="23"/>
-          <w:szCs w:val="23"/>
-        </w:rPr>
-        <w:t xml:space="preserve">, evaluation that stops at RMSE, becomes </w:t>
-      </w:r>
-      <w:r>
-        <w:rPr>
-          <w:rFonts w:ascii="Calibri" w:cs="Calibri" w:eastAsia="Calibri" w:hAnsi="Calibri"/>
-          <w:b/>
-          <w:bCs/>
-          <w:sz w:val="23"/>
-          <w:szCs w:val="23"/>
-        </w:rPr>
-        <w:t xml:space="preserve">O6</w:t>
-      </w:r>
-      <w:r>
-        <w:rPr>
-          <w:rFonts w:ascii="Calibri" w:cs="Calibri" w:eastAsia="Calibri" w:hAnsi="Calibri"/>
-          <w:b w:val="false"/>
-          <w:bCs w:val="false"/>
-          <w:sz w:val="23"/>
-          <w:szCs w:val="23"/>
-        </w:rPr>
-        <w:t xml:space="preserve">: evaluate the verdict. And because connectivity at sea is unreliable, </w:t>
-      </w:r>
-      <w:r>
-        <w:rPr>
-          <w:rFonts w:ascii="Calibri" w:cs="Calibri" w:eastAsia="Calibri" w:hAnsi="Calibri"/>
-          <w:b/>
-          <w:bCs/>
-          <w:sz w:val="23"/>
-          <w:szCs w:val="23"/>
-        </w:rPr>
-        <w:t xml:space="preserve">O5</w:t>
-      </w:r>
-      <w:r>
-        <w:rPr>
-          <w:rFonts w:ascii="Calibri" w:cs="Calibri" w:eastAsia="Calibri" w:hAnsi="Calibri"/>
-          <w:b w:val="false"/>
-          <w:bCs w:val="false"/>
-          <w:sz w:val="23"/>
-          <w:szCs w:val="23"/>
-        </w:rPr>
-        <w:t xml:space="preserve">: always answer, and say when the answer is degraded.</w:t>
+          <w:b w:val="false"/>
+          <w:bCs w:val="false"/>
+          <w:sz w:val="23"/>
+          <w:szCs w:val="23"/>
+        </w:rPr>
+        <w:t xml:space="preserve">Step four, the model explains the verdict in the user's language. Step five, every number in that answer, in Latin or Indic digits, is matched against the </w:t>
+      </w:r>
+      <w:r>
+        <w:rPr>
+          <w:rFonts w:ascii="Calibri" w:cs="Calibri" w:eastAsia="Calibri" w:hAnsi="Calibri"/>
+          <w:b/>
+          <w:bCs/>
+          <w:sz w:val="23"/>
+          <w:szCs w:val="23"/>
+        </w:rPr>
+        <w:t xml:space="preserve">evidence ledger</w:t>
+      </w:r>
+      <w:r>
+        <w:rPr>
+          <w:rFonts w:ascii="Calibri" w:cs="Calibri" w:eastAsia="Calibri" w:hAnsi="Calibri"/>
+          <w:b w:val="false"/>
+          <w:bCs w:val="false"/>
+          <w:sz w:val="23"/>
+          <w:szCs w:val="23"/>
+        </w:rPr>
+        <w:t xml:space="preserve">; anything unsupported is stripped and the answer regenerated.</w:t>
       </w:r>
     </w:p>
     <w:p>
@@ -1758,12 +1768,32 @@
       <w:r>
         <w:rPr>
           <w:rFonts w:ascii="Calibri" w:cs="Calibri" w:eastAsia="Calibri" w:hAnsi="Calibri"/>
-          <w:b/>
-          <w:bCs/>
-          <w:sz w:val="23"/>
-          <w:szCs w:val="23"/>
-        </w:rPr>
-        <w:t xml:space="preserve">O2 and O3 are my research contribution.</w:t>
+          <w:b w:val="false"/>
+          <w:bCs w:val="false"/>
+          <w:sz w:val="23"/>
+          <w:szCs w:val="23"/>
+        </w:rPr>
+        <w:t xml:space="preserve">The ledger is what makes that possible: </w:t>
+      </w:r>
+      <w:r>
+        <w:rPr>
+          <w:rFonts w:ascii="Calibri" w:cs="Calibri" w:eastAsia="Calibri" w:hAnsi="Calibri"/>
+          <w:b/>
+          <w:bCs/>
+          <w:sz w:val="23"/>
+          <w:szCs w:val="23"/>
+        </w:rPr>
+        <w:t xml:space="preserve">no tool returns a bare number</w:t>
+      </w:r>
+      <w:r>
+        <w:rPr>
+          <w:rFonts w:ascii="Calibri" w:cs="Calibri" w:eastAsia="Calibri" w:hAnsi="Calibri"/>
+          <w:b w:val="false"/>
+          <w:bCs w:val="false"/>
+          <w:sz w:val="23"/>
+          <w:szCs w:val="23"/>
+        </w:rPr>
+        <w:t xml:space="preserve"> — every value carries its source, time, distance and confidence.</w:t>
       </w:r>
     </w:p>
     <w:p>
@@ -1783,7 +1813,7 @@
           <w:sz w:val="20"/>
           <w:szCs w:val="20"/>
         </w:rPr>
-        <w:t xml:space="preserve">Trace one or two rows across the table with your hand so the gap → evidence → objective link is visible.</w:t>
+        <w:t xml:space="preserve">Tap the red dashed line in the diagram when you say “below the red line there is no model.”</w:t>
       </w:r>
     </w:p>
     <w:p>
@@ -1810,7 +1840,7 @@
           <w:sz w:val="21"/>
           <w:szCs w:val="21"/>
         </w:rPr>
-        <w:t xml:space="preserve">“Here is how the methodology delivers them.”</w:t>
+        <w:t xml:space="preserve">“And the dataset behind it.”</w:t>
       </w:r>
     </w:p>
     <w:p>
@@ -1827,7 +1857,7 @@
           <w:sz w:val="23"/>
           <w:szCs w:val="23"/>
         </w:rPr>
-        <w:t xml:space="preserve">  SLIDE 8  —  Proposed methodology I — architecture and techniques</w:t>
+        <w:t xml:space="preserve">  SLIDE 8  —  Methodology II — dataset and tools</w:t>
       </w:r>
       <w:r>
         <w:rPr>
@@ -1838,7 +1868,7 @@
           <w:sz w:val="22"/>
           <w:szCs w:val="22"/>
         </w:rPr>
-        <w:t xml:space="preserve">        1:15  </w:t>
+        <w:t xml:space="preserve">        1:30  </w:t>
       </w:r>
     </w:p>
     <w:p>
@@ -1848,22 +1878,12 @@
       <w:r>
         <w:rPr>
           <w:rFonts w:ascii="Calibri" w:cs="Calibri" w:eastAsia="Calibri" w:hAnsi="Calibri"/>
-          <w:b w:val="false"/>
-          <w:bCs w:val="false"/>
-          <w:sz w:val="23"/>
-          <w:szCs w:val="23"/>
-        </w:rPr>
-        <w:t xml:space="preserve">Five steps. The diagram on the right is the same pipeline — </w:t>
-      </w:r>
-      <w:r>
-        <w:rPr>
-          <w:rFonts w:ascii="Calibri" w:cs="Calibri" w:eastAsia="Calibri" w:hAnsi="Calibri"/>
-          <w:b/>
-          <w:bCs/>
-          <w:sz w:val="23"/>
-          <w:szCs w:val="23"/>
-        </w:rPr>
-        <w:t xml:space="preserve">blue is AI, red is no AI.</w:t>
+          <w:b/>
+          <w:bCs/>
+          <w:sz w:val="23"/>
+          <w:szCs w:val="23"/>
+        </w:rPr>
+        <w:t xml:space="preserve">Every source here was tested live before I wrote any code against it.</w:t>
       </w:r>
     </w:p>
     <w:p>
@@ -1873,12 +1893,102 @@
       <w:r>
         <w:rPr>
           <w:rFonts w:ascii="Calibri" w:cs="Calibri" w:eastAsia="Calibri" w:hAnsi="Calibri"/>
-          <w:b w:val="false"/>
-          <w:bCs w:val="false"/>
-          <w:sz w:val="23"/>
-          <w:szCs w:val="23"/>
-        </w:rPr>
-        <w:t xml:space="preserve">Step one, an LLM planner turns the question into a typed task graph, validated against a schema. Step two, three specialists fetch data in parallel through LangGraph, with a cache, live, stale, snapshot fallback chain.</w:t>
+          <w:b/>
+          <w:bCs/>
+          <w:sz w:val="23"/>
+          <w:szCs w:val="23"/>
+        </w:rPr>
+        <w:t xml:space="preserve">Open-Meteo</w:t>
+      </w:r>
+      <w:r>
+        <w:rPr>
+          <w:rFonts w:ascii="Calibri" w:cs="Calibri" w:eastAsia="Calibri" w:hAnsi="Calibri"/>
+          <w:b w:val="false"/>
+          <w:bCs w:val="false"/>
+          <w:sz w:val="23"/>
+          <w:szCs w:val="23"/>
+        </w:rPr>
+        <w:t xml:space="preserve"> marine and weather is the primary source for waves, wind and visibility — hourly, free, no key. </w:t>
+      </w:r>
+      <w:r>
+        <w:rPr>
+          <w:rFonts w:ascii="Calibri" w:cs="Calibri" w:eastAsia="Calibri" w:hAnsi="Calibri"/>
+          <w:b/>
+          <w:bCs/>
+          <w:sz w:val="23"/>
+          <w:szCs w:val="23"/>
+        </w:rPr>
+        <w:t xml:space="preserve">INCOIS</w:t>
+      </w:r>
+      <w:r>
+        <w:rPr>
+          <w:rFonts w:ascii="Calibri" w:cs="Calibri" w:eastAsia="Calibri" w:hAnsi="Calibri"/>
+          <w:b w:val="false"/>
+          <w:bCs w:val="false"/>
+          <w:sz w:val="23"/>
+          <w:szCs w:val="23"/>
+        </w:rPr>
+        <w:t xml:space="preserve"> provides the daily fishing-zone advisories, plus 14 sectors and 1,223 named landing centres. </w:t>
+      </w:r>
+      <w:r>
+        <w:rPr>
+          <w:rFonts w:ascii="Calibri" w:cs="Calibri" w:eastAsia="Calibri" w:hAnsi="Calibri"/>
+          <w:b/>
+          <w:bCs/>
+          <w:sz w:val="23"/>
+          <w:szCs w:val="23"/>
+        </w:rPr>
+        <w:t xml:space="preserve">Marine Regions</w:t>
+      </w:r>
+      <w:r>
+        <w:rPr>
+          <w:rFonts w:ascii="Calibri" w:cs="Calibri" w:eastAsia="Calibri" w:hAnsi="Calibri"/>
+          <w:b w:val="false"/>
+          <w:bCs w:val="false"/>
+          <w:sz w:val="23"/>
+          <w:szCs w:val="23"/>
+        </w:rPr>
+        <w:t xml:space="preserve"> provides India's EEZ and the IMBL. Chlorophyll comes from </w:t>
+      </w:r>
+      <w:r>
+        <w:rPr>
+          <w:rFonts w:ascii="Calibri" w:cs="Calibri" w:eastAsia="Calibri" w:hAnsi="Calibri"/>
+          <w:b/>
+          <w:bCs/>
+          <w:sz w:val="23"/>
+          <w:szCs w:val="23"/>
+        </w:rPr>
+        <w:t xml:space="preserve">NOAA</w:t>
+      </w:r>
+      <w:r>
+        <w:rPr>
+          <w:rFonts w:ascii="Calibri" w:cs="Calibri" w:eastAsia="Calibri" w:hAnsi="Calibri"/>
+          <w:b w:val="false"/>
+          <w:bCs w:val="false"/>
+          <w:sz w:val="23"/>
+          <w:szCs w:val="23"/>
+        </w:rPr>
+        <w:t xml:space="preserve"> and </w:t>
+      </w:r>
+      <w:r>
+        <w:rPr>
+          <w:rFonts w:ascii="Calibri" w:cs="Calibri" w:eastAsia="Calibri" w:hAnsi="Calibri"/>
+          <w:b/>
+          <w:bCs/>
+          <w:sz w:val="23"/>
+          <w:szCs w:val="23"/>
+        </w:rPr>
+        <w:t xml:space="preserve">Copernicus</w:t>
+      </w:r>
+      <w:r>
+        <w:rPr>
+          <w:rFonts w:ascii="Calibri" w:cs="Calibri" w:eastAsia="Calibri" w:hAnsi="Calibri"/>
+          <w:b w:val="false"/>
+          <w:bCs w:val="false"/>
+          <w:sz w:val="23"/>
+          <w:szCs w:val="23"/>
+        </w:rPr>
+        <w:t xml:space="preserve">, where I have an account.</w:t>
       </w:r>
     </w:p>
     <w:p>
@@ -1888,22 +1998,52 @@
       <w:r>
         <w:rPr>
           <w:rFonts w:ascii="Calibri" w:cs="Calibri" w:eastAsia="Calibri" w:hAnsi="Calibri"/>
-          <w:b/>
-          <w:bCs/>
-          <w:sz w:val="23"/>
-          <w:szCs w:val="23"/>
-        </w:rPr>
-        <w:t xml:space="preserve">Below the red line there is no model.</w:t>
-      </w:r>
-      <w:r>
-        <w:rPr>
-          <w:rFonts w:ascii="Calibri" w:cs="Calibri" w:eastAsia="Calibri" w:hAnsi="Calibri"/>
-          <w:b w:val="false"/>
-          <w:bCs w:val="false"/>
-          <w:sz w:val="23"/>
-          <w:szCs w:val="23"/>
-        </w:rPr>
-        <w:t xml:space="preserve"> Step three is the decision: seven parameters, three vessel classes, the worst parameter wins — never an average. Under fifty milliseconds, 115 unit tests.</w:t>
+          <w:b w:val="false"/>
+          <w:bCs w:val="false"/>
+          <w:sz w:val="23"/>
+          <w:szCs w:val="23"/>
+        </w:rPr>
+        <w:t xml:space="preserve">Two red rows, honestly. </w:t>
+      </w:r>
+      <w:r>
+        <w:rPr>
+          <w:rFonts w:ascii="Calibri" w:cs="Calibri" w:eastAsia="Calibri" w:hAnsi="Calibri"/>
+          <w:b/>
+          <w:bCs/>
+          <w:sz w:val="23"/>
+          <w:szCs w:val="23"/>
+        </w:rPr>
+        <w:t xml:space="preserve">IMD</w:t>
+      </w:r>
+      <w:r>
+        <w:rPr>
+          <w:rFonts w:ascii="Calibri" w:cs="Calibri" w:eastAsia="Calibri" w:hAnsi="Calibri"/>
+          <w:b w:val="false"/>
+          <w:bCs w:val="false"/>
+          <w:sz w:val="23"/>
+          <w:szCs w:val="23"/>
+        </w:rPr>
+        <w:t xml:space="preserve"> — cyclone and lightning — needs an API key; without it, two of the seven safety checks have no data. And </w:t>
+      </w:r>
+      <w:r>
+        <w:rPr>
+          <w:rFonts w:ascii="Calibri" w:cs="Calibri" w:eastAsia="Calibri" w:hAnsi="Calibri"/>
+          <w:b/>
+          <w:bCs/>
+          <w:sz w:val="23"/>
+          <w:szCs w:val="23"/>
+        </w:rPr>
+        <w:t xml:space="preserve">INCOIS's open ERDDAP archive is stale</w:t>
+      </w:r>
+      <w:r>
+        <w:rPr>
+          <w:rFonts w:ascii="Calibri" w:cs="Calibri" w:eastAsia="Calibri" w:hAnsi="Calibri"/>
+          <w:b w:val="false"/>
+          <w:bCs w:val="false"/>
+          <w:sz w:val="23"/>
+          <w:szCs w:val="23"/>
+        </w:rPr>
+        <w:t xml:space="preserve"> — its sea temperature series stops in 2011 — so it is not used.</w:t>
       </w:r>
     </w:p>
     <w:p>
@@ -1918,62 +2058,17 @@
           <w:sz w:val="23"/>
           <w:szCs w:val="23"/>
         </w:rPr>
-        <w:t xml:space="preserve">Step four, the model explains the verdict in the user's language. Step five, every number in that answer, in Latin or Indic digits, is matched against the </w:t>
-      </w:r>
-      <w:r>
-        <w:rPr>
-          <w:rFonts w:ascii="Calibri" w:cs="Calibri" w:eastAsia="Calibri" w:hAnsi="Calibri"/>
-          <w:b/>
-          <w:bCs/>
-          <w:sz w:val="23"/>
-          <w:szCs w:val="23"/>
-        </w:rPr>
-        <w:t xml:space="preserve">evidence ledger</w:t>
-      </w:r>
-      <w:r>
-        <w:rPr>
-          <w:rFonts w:ascii="Calibri" w:cs="Calibri" w:eastAsia="Calibri" w:hAnsi="Calibri"/>
-          <w:b w:val="false"/>
-          <w:bCs w:val="false"/>
-          <w:sz w:val="23"/>
-          <w:szCs w:val="23"/>
-        </w:rPr>
-        <w:t xml:space="preserve">; anything unsupported is stripped and the answer regenerated.</w:t>
-      </w:r>
-    </w:p>
-    <w:p>
-      <w:pPr>
-        <w:spacing w:after="140" w:line="300"/>
-      </w:pPr>
-      <w:r>
-        <w:rPr>
-          <w:rFonts w:ascii="Calibri" w:cs="Calibri" w:eastAsia="Calibri" w:hAnsi="Calibri"/>
-          <w:b w:val="false"/>
-          <w:bCs w:val="false"/>
-          <w:sz w:val="23"/>
-          <w:szCs w:val="23"/>
-        </w:rPr>
-        <w:t xml:space="preserve">The ledger is what makes that possible: </w:t>
-      </w:r>
-      <w:r>
-        <w:rPr>
-          <w:rFonts w:ascii="Calibri" w:cs="Calibri" w:eastAsia="Calibri" w:hAnsi="Calibri"/>
-          <w:b/>
-          <w:bCs/>
-          <w:sz w:val="23"/>
-          <w:szCs w:val="23"/>
-        </w:rPr>
-        <w:t xml:space="preserve">no tool returns a bare number</w:t>
-      </w:r>
-      <w:r>
-        <w:rPr>
-          <w:rFonts w:ascii="Calibri" w:cs="Calibri" w:eastAsia="Calibri" w:hAnsi="Calibri"/>
-          <w:b w:val="false"/>
-          <w:bCs w:val="false"/>
-          <w:sz w:val="23"/>
-          <w:szCs w:val="23"/>
-        </w:rPr>
-        <w:t xml:space="preserve"> — every value carries its source, time, distance and confidence.</w:t>
+        <w:t xml:space="preserve">Two derived datasets: a frozen seven-day snapshot for five harbours and the Gulf of Mannar, so it runs offline; and a 92-day evaluation set. Tools are along the bottom. </w:t>
+      </w:r>
+      <w:r>
+        <w:rPr>
+          <w:rFonts w:ascii="Calibri" w:cs="Calibri" w:eastAsia="Calibri" w:hAnsi="Calibri"/>
+          <w:b/>
+          <w:bCs/>
+          <w:sz w:val="23"/>
+          <w:szCs w:val="23"/>
+        </w:rPr>
+        <w:t xml:space="preserve">Total data cost: zero.</w:t>
       </w:r>
     </w:p>
     <w:p>
@@ -1993,7 +2088,7 @@
           <w:sz w:val="20"/>
           <w:szCs w:val="20"/>
         </w:rPr>
-        <w:t xml:space="preserve">Tap the red dashed line in the diagram when you say “below the red line there is no model.”</w:t>
+        <w:t xml:space="preserve">She cares most about datasets — slow down here. Raise the two red rows yourself before she asks.</w:t>
       </w:r>
     </w:p>
     <w:p>
@@ -2020,7 +2115,7 @@
           <w:sz w:val="21"/>
           <w:szCs w:val="21"/>
         </w:rPr>
-        <w:t xml:space="preserve">“And the dataset behind it.”</w:t>
+        <w:t xml:space="preserve">“Finally, how well it works so far.”</w:t>
       </w:r>
     </w:p>
     <w:p>
@@ -2037,282 +2132,7 @@
           <w:sz w:val="23"/>
           <w:szCs w:val="23"/>
         </w:rPr>
-        <w:t xml:space="preserve">  SLIDE 9  —  Proposed methodology II — dataset and tools</w:t>
-      </w:r>
-      <w:r>
-        <w:rPr>
-          <w:rFonts w:ascii="Calibri" w:cs="Calibri" w:eastAsia="Calibri" w:hAnsi="Calibri"/>
-          <w:b/>
-          <w:bCs/>
-          <w:color w:val="BDD2E2"/>
-          <w:sz w:val="22"/>
-          <w:szCs w:val="22"/>
-        </w:rPr>
-        <w:t xml:space="preserve">        1:30  </w:t>
-      </w:r>
-    </w:p>
-    <w:p>
-      <w:pPr>
-        <w:spacing w:after="140" w:line="300"/>
-      </w:pPr>
-      <w:r>
-        <w:rPr>
-          <w:rFonts w:ascii="Calibri" w:cs="Calibri" w:eastAsia="Calibri" w:hAnsi="Calibri"/>
-          <w:b/>
-          <w:bCs/>
-          <w:sz w:val="23"/>
-          <w:szCs w:val="23"/>
-        </w:rPr>
-        <w:t xml:space="preserve">Every source here was tested live before I wrote any code against it.</w:t>
-      </w:r>
-    </w:p>
-    <w:p>
-      <w:pPr>
-        <w:spacing w:after="140" w:line="300"/>
-      </w:pPr>
-      <w:r>
-        <w:rPr>
-          <w:rFonts w:ascii="Calibri" w:cs="Calibri" w:eastAsia="Calibri" w:hAnsi="Calibri"/>
-          <w:b/>
-          <w:bCs/>
-          <w:sz w:val="23"/>
-          <w:szCs w:val="23"/>
-        </w:rPr>
-        <w:t xml:space="preserve">Open-Meteo</w:t>
-      </w:r>
-      <w:r>
-        <w:rPr>
-          <w:rFonts w:ascii="Calibri" w:cs="Calibri" w:eastAsia="Calibri" w:hAnsi="Calibri"/>
-          <w:b w:val="false"/>
-          <w:bCs w:val="false"/>
-          <w:sz w:val="23"/>
-          <w:szCs w:val="23"/>
-        </w:rPr>
-        <w:t xml:space="preserve"> marine and weather is the primary source for waves, wind and visibility — hourly, free, no key. </w:t>
-      </w:r>
-      <w:r>
-        <w:rPr>
-          <w:rFonts w:ascii="Calibri" w:cs="Calibri" w:eastAsia="Calibri" w:hAnsi="Calibri"/>
-          <w:b/>
-          <w:bCs/>
-          <w:sz w:val="23"/>
-          <w:szCs w:val="23"/>
-        </w:rPr>
-        <w:t xml:space="preserve">INCOIS</w:t>
-      </w:r>
-      <w:r>
-        <w:rPr>
-          <w:rFonts w:ascii="Calibri" w:cs="Calibri" w:eastAsia="Calibri" w:hAnsi="Calibri"/>
-          <w:b w:val="false"/>
-          <w:bCs w:val="false"/>
-          <w:sz w:val="23"/>
-          <w:szCs w:val="23"/>
-        </w:rPr>
-        <w:t xml:space="preserve"> provides the daily fishing-zone advisories, plus 14 sectors and 1,223 named landing centres. </w:t>
-      </w:r>
-      <w:r>
-        <w:rPr>
-          <w:rFonts w:ascii="Calibri" w:cs="Calibri" w:eastAsia="Calibri" w:hAnsi="Calibri"/>
-          <w:b/>
-          <w:bCs/>
-          <w:sz w:val="23"/>
-          <w:szCs w:val="23"/>
-        </w:rPr>
-        <w:t xml:space="preserve">Marine Regions</w:t>
-      </w:r>
-      <w:r>
-        <w:rPr>
-          <w:rFonts w:ascii="Calibri" w:cs="Calibri" w:eastAsia="Calibri" w:hAnsi="Calibri"/>
-          <w:b w:val="false"/>
-          <w:bCs w:val="false"/>
-          <w:sz w:val="23"/>
-          <w:szCs w:val="23"/>
-        </w:rPr>
-        <w:t xml:space="preserve"> provides India's EEZ and the IMBL. Chlorophyll comes from </w:t>
-      </w:r>
-      <w:r>
-        <w:rPr>
-          <w:rFonts w:ascii="Calibri" w:cs="Calibri" w:eastAsia="Calibri" w:hAnsi="Calibri"/>
-          <w:b/>
-          <w:bCs/>
-          <w:sz w:val="23"/>
-          <w:szCs w:val="23"/>
-        </w:rPr>
-        <w:t xml:space="preserve">NOAA</w:t>
-      </w:r>
-      <w:r>
-        <w:rPr>
-          <w:rFonts w:ascii="Calibri" w:cs="Calibri" w:eastAsia="Calibri" w:hAnsi="Calibri"/>
-          <w:b w:val="false"/>
-          <w:bCs w:val="false"/>
-          <w:sz w:val="23"/>
-          <w:szCs w:val="23"/>
-        </w:rPr>
-        <w:t xml:space="preserve"> and </w:t>
-      </w:r>
-      <w:r>
-        <w:rPr>
-          <w:rFonts w:ascii="Calibri" w:cs="Calibri" w:eastAsia="Calibri" w:hAnsi="Calibri"/>
-          <w:b/>
-          <w:bCs/>
-          <w:sz w:val="23"/>
-          <w:szCs w:val="23"/>
-        </w:rPr>
-        <w:t xml:space="preserve">Copernicus</w:t>
-      </w:r>
-      <w:r>
-        <w:rPr>
-          <w:rFonts w:ascii="Calibri" w:cs="Calibri" w:eastAsia="Calibri" w:hAnsi="Calibri"/>
-          <w:b w:val="false"/>
-          <w:bCs w:val="false"/>
-          <w:sz w:val="23"/>
-          <w:szCs w:val="23"/>
-        </w:rPr>
-        <w:t xml:space="preserve">, where I have an account.</w:t>
-      </w:r>
-    </w:p>
-    <w:p>
-      <w:pPr>
-        <w:spacing w:after="140" w:line="300"/>
-      </w:pPr>
-      <w:r>
-        <w:rPr>
-          <w:rFonts w:ascii="Calibri" w:cs="Calibri" w:eastAsia="Calibri" w:hAnsi="Calibri"/>
-          <w:b w:val="false"/>
-          <w:bCs w:val="false"/>
-          <w:sz w:val="23"/>
-          <w:szCs w:val="23"/>
-        </w:rPr>
-        <w:t xml:space="preserve">Two red rows, honestly. </w:t>
-      </w:r>
-      <w:r>
-        <w:rPr>
-          <w:rFonts w:ascii="Calibri" w:cs="Calibri" w:eastAsia="Calibri" w:hAnsi="Calibri"/>
-          <w:b/>
-          <w:bCs/>
-          <w:sz w:val="23"/>
-          <w:szCs w:val="23"/>
-        </w:rPr>
-        <w:t xml:space="preserve">IMD</w:t>
-      </w:r>
-      <w:r>
-        <w:rPr>
-          <w:rFonts w:ascii="Calibri" w:cs="Calibri" w:eastAsia="Calibri" w:hAnsi="Calibri"/>
-          <w:b w:val="false"/>
-          <w:bCs w:val="false"/>
-          <w:sz w:val="23"/>
-          <w:szCs w:val="23"/>
-        </w:rPr>
-        <w:t xml:space="preserve"> — cyclone and lightning — needs an API key; without it, two of the seven safety checks have no data. And </w:t>
-      </w:r>
-      <w:r>
-        <w:rPr>
-          <w:rFonts w:ascii="Calibri" w:cs="Calibri" w:eastAsia="Calibri" w:hAnsi="Calibri"/>
-          <w:b/>
-          <w:bCs/>
-          <w:sz w:val="23"/>
-          <w:szCs w:val="23"/>
-        </w:rPr>
-        <w:t xml:space="preserve">INCOIS's open ERDDAP archive is stale</w:t>
-      </w:r>
-      <w:r>
-        <w:rPr>
-          <w:rFonts w:ascii="Calibri" w:cs="Calibri" w:eastAsia="Calibri" w:hAnsi="Calibri"/>
-          <w:b w:val="false"/>
-          <w:bCs w:val="false"/>
-          <w:sz w:val="23"/>
-          <w:szCs w:val="23"/>
-        </w:rPr>
-        <w:t xml:space="preserve"> — its sea temperature series stops in 2011 — so it is not used.</w:t>
-      </w:r>
-    </w:p>
-    <w:p>
-      <w:pPr>
-        <w:spacing w:after="140" w:line="300"/>
-      </w:pPr>
-      <w:r>
-        <w:rPr>
-          <w:rFonts w:ascii="Calibri" w:cs="Calibri" w:eastAsia="Calibri" w:hAnsi="Calibri"/>
-          <w:b w:val="false"/>
-          <w:bCs w:val="false"/>
-          <w:sz w:val="23"/>
-          <w:szCs w:val="23"/>
-        </w:rPr>
-        <w:t xml:space="preserve">Two derived datasets: a frozen seven-day snapshot for five harbours and the Gulf of Mannar, so it runs offline; and a 92-day evaluation set. Tools are along the bottom. </w:t>
-      </w:r>
-      <w:r>
-        <w:rPr>
-          <w:rFonts w:ascii="Calibri" w:cs="Calibri" w:eastAsia="Calibri" w:hAnsi="Calibri"/>
-          <w:b/>
-          <w:bCs/>
-          <w:sz w:val="23"/>
-          <w:szCs w:val="23"/>
-        </w:rPr>
-        <w:t xml:space="preserve">Total data cost: zero.</w:t>
-      </w:r>
-    </w:p>
-    <w:p>
-      <w:pPr>
-        <w:pBdr>
-          <w:left w:val="single" w:color="C0A000" w:sz="16" w:space="12"/>
-        </w:pBdr>
-        <w:spacing w:after="170" w:before="140" w:line="276"/>
-        <w:ind w:left="340" w:right="240"/>
-      </w:pPr>
-      <w:r>
-        <w:rPr>
-          <w:rFonts w:ascii="Calibri" w:cs="Calibri" w:eastAsia="Calibri" w:hAnsi="Calibri"/>
-          <w:i/>
-          <w:iCs/>
-          <w:color w:val="6B5A00"/>
-          <w:sz w:val="20"/>
-          <w:szCs w:val="20"/>
-        </w:rPr>
-        <w:t xml:space="preserve">She cares most about datasets — slow down here. Raise the two red rows yourself before she asks.</w:t>
-      </w:r>
-    </w:p>
-    <w:p>
-      <w:pPr>
-        <w:spacing w:after="160"/>
-      </w:pPr>
-      <w:r>
-        <w:rPr>
-          <w:rFonts w:ascii="Calibri" w:cs="Calibri" w:eastAsia="Calibri" w:hAnsi="Calibri"/>
-          <w:b/>
-          <w:bCs/>
-          <w:color w:val="2E5A96"/>
-          <w:sz w:val="20"/>
-          <w:szCs w:val="20"/>
-        </w:rPr>
-        <w:t xml:space="preserve">Bridge to slide 10:  </w:t>
-      </w:r>
-      <w:r>
-        <w:rPr>
-          <w:rFonts w:ascii="Calibri" w:cs="Calibri" w:eastAsia="Calibri" w:hAnsi="Calibri"/>
-          <w:i/>
-          <w:iCs/>
-          <w:color w:val="2E5A96"/>
-          <w:sz w:val="21"/>
-          <w:szCs w:val="21"/>
-        </w:rPr>
-        <w:t xml:space="preserve">“Finally, how well it works so far.”</w:t>
-      </w:r>
-    </w:p>
-    <w:p>
-      <w:pPr>
-        <w:shd w:fill="1F3864" w:color="auto" w:val="clear"/>
-        <w:spacing w:after="60" w:before="300"/>
-      </w:pPr>
-      <w:r>
-        <w:rPr>
-          <w:rFonts w:ascii="Calibri" w:cs="Calibri" w:eastAsia="Calibri" w:hAnsi="Calibri"/>
-          <w:b/>
-          <w:bCs/>
-          <w:color w:val="FFFFFF"/>
-          <w:sz w:val="23"/>
-          <w:szCs w:val="23"/>
-        </w:rPr>
-        <w:t xml:space="preserve">  SLIDE 10  —  Evaluation method and preliminary results</w:t>
+        <w:t xml:space="preserve">  SLIDE 9  —  Evaluation method and preliminary results</w:t>
       </w:r>
       <w:r>
         <w:rPr>
@@ -2769,7 +2589,7 @@
                 <w:sz w:val="19"/>
                 <w:szCs w:val="19"/>
               </w:rPr>
-              <w:t xml:space="preserve">3 – 5</w:t>
+              <w:t xml:space="preserve">3 – 4</w:t>
             </w:r>
           </w:p>
         </w:tc>
@@ -2795,7 +2615,7 @@
                 <w:sz w:val="19"/>
                 <w:szCs w:val="19"/>
               </w:rPr>
-              <w:t xml:space="preserve">Literature survey (three slides)</w:t>
+              <w:t xml:space="preserve">Literature survey (eight studies, two slides)</w:t>
             </w:r>
           </w:p>
         </w:tc>
@@ -2821,7 +2641,7 @@
                 <w:sz w:val="19"/>
                 <w:szCs w:val="19"/>
               </w:rPr>
-              <w:t xml:space="preserve">4:30</w:t>
+              <w:t xml:space="preserve">3:45</w:t>
             </w:r>
           </w:p>
         </w:tc>
@@ -2852,7 +2672,7 @@
                 <w:sz w:val="19"/>
                 <w:szCs w:val="19"/>
               </w:rPr>
-              <w:t xml:space="preserve">6 – 7</w:t>
+              <w:t xml:space="preserve">5 – 6</w:t>
             </w:r>
           </w:p>
         </w:tc>
@@ -2935,7 +2755,7 @@
                 <w:sz w:val="19"/>
                 <w:szCs w:val="19"/>
               </w:rPr>
-              <w:t xml:space="preserve">8 – 9</w:t>
+              <w:t xml:space="preserve">7 – 8</w:t>
             </w:r>
           </w:p>
         </w:tc>
@@ -3018,7 +2838,7 @@
                 <w:sz w:val="19"/>
                 <w:szCs w:val="19"/>
               </w:rPr>
-              <w:t xml:space="preserve">10</w:t>
+              <w:t xml:space="preserve">9</w:t>
             </w:r>
           </w:p>
         </w:tc>
@@ -3101,7 +2921,7 @@
                 <w:sz w:val="19"/>
                 <w:szCs w:val="19"/>
               </w:rPr>
-              <w:t xml:space="preserve">11</w:t>
+              <w:t xml:space="preserve">10</w:t>
             </w:r>
           </w:p>
         </w:tc>
@@ -3236,7 +3056,7 @@
                 <w:sz w:val="22"/>
                 <w:szCs w:val="22"/>
               </w:rPr>
-              <w:t xml:space="preserve">≈ 13:15</w:t>
+              <w:t xml:space="preserve">≈ 12:30</w:t>
             </w:r>
           </w:p>
         </w:tc>
@@ -3254,7 +3074,7 @@
           <w:sz w:val="22"/>
           <w:szCs w:val="22"/>
         </w:rPr>
-        <w:t xml:space="preserve">If you are told to cut to eight minutes: on slide 4 say only the red-column line; on slide 7 cover only G4/G5 → O2/O3; on slide 9 cover only the two red rows. Never cut slides 3, 5 or 6 — they carry the 15 literature-and-gap marks.</w:t>
+        <w:t xml:space="preserve">If you are told to cut to eight minutes: on slide 3 give one line per study plus the red column; on slide 6 cover only G4/G5 → O2/O3; on slide 8 cover only the two red rows. Never cut slides 3, 4 or 5 — they carry the 15 literature-and-gap marks.</w:t>
       </w:r>
     </w:p>
     <w:p>
@@ -3297,7 +3117,7 @@
           <w:sz w:val="22"/>
           <w:szCs w:val="22"/>
         </w:rPr>
-        <w:t xml:space="preserve">Three groups, matching the three parts of the problem. First, the domain: India's own marine information services, because that is what a fisherman uses today. Second, the techniques I could build with: machine-learned forecasting as the alternative I rejected, and tool-using language models as the approach I took. Third, the closest systems to mine, plus reliability and evaluation. Every reference was checked against its publisher or repository record.</w:t>
+        <w:t xml:space="preserve">I surveyed about twenty papers and selected the eight most relevant and recent, one or two for each part of the system: small-boat weather (Kurup 2024), fishing zones (Sarangi 2024), the border (Vincent 2020), the two closest existing apps (Thoondil and Fisher Friend), and the AI foundations — retrieval (Lewis), its failure mode (RAGTruth, ACL 2024) and Indian-language translation (IndicTrans2). Half are from 2023 or later, and every citation was checked against its DOI record.</w:t>
       </w:r>
     </w:p>
     <w:p>
@@ -3313,7 +3133,7 @@
           <w:sz w:val="23"/>
           <w:szCs w:val="23"/>
         </w:rPr>
-        <w:t xml:space="preserve">Q.  Why not just let the AI decide? The models are very good now.</w:t>
+        <w:t xml:space="preserve">Q.  How is this different from Thoondil or Fisher Friend?</w:t>
       </w:r>
     </w:p>
     <w:p>
@@ -3329,7 +3149,7 @@
           <w:sz w:val="22"/>
           <w:szCs w:val="22"/>
         </w:rPr>
-        <w:t xml:space="preserve">Three reasons. I cannot test it — a rule table can be unit-tested and audited by anyone; a model's judgement cannot. There is no training data for it — no dataset of boats that did and did not come back. And Lin et al. show agent errors can be physically consequential. If someone drowns, “the model decided” is not an acceptable answer. The model is very good at language, so I use it for language.</w:t>
+        <w:t xml:space="preserve">They are the closest existing systems and I build on them, not against them. Both deliver weather and fishing zones to fishermen in local languages, and Thoondil is operational under the Tamil Nadu government. But both are menu screens: the fisherman reads each one and decides himself. Sagar Setu accepts a free-form question about his boat, place and time; gives one verdict from tested rules; combines safety, fishing zones and the border; and shows the source of every number. Thoondil could even be a delivery channel for it.</w:t>
       </w:r>
     </w:p>
     <w:p>
@@ -3345,7 +3165,7 @@
           <w:sz w:val="23"/>
           <w:szCs w:val="23"/>
         </w:rPr>
-        <w:t xml:space="preserve">Q.  Isn't this just a wrapper around some APIs? Where is the novelty?</w:t>
+        <w:t xml:space="preserve">Q.  Why not just let the AI decide? The models are very good now.</w:t>
       </w:r>
     </w:p>
     <w:p>
@@ -3361,7 +3181,7 @@
           <w:sz w:val="22"/>
           <w:szCs w:val="22"/>
         </w:rPr>
-        <w:t xml:space="preserve">The fetching is ordinary engineering. The contribution is O2 and O3: an architecture where the safety verdict is structurally outside the model, not just prompted to be; and an evidence ledger with a verifier that mechanically deletes any number the model produced that is not in it. ClimSight and WildfireGPT ground in documents and still let the model write the conclusion.</w:t>
+        <w:t xml:space="preserve">Because RAGTruth shows that even when the right data is retrieved, language models still produce unsupported content. A rule table can be unit-tested and audited by anyone; a model's judgement cannot. There is also no training data for it — no dataset of boats that did and did not come back. If someone drowns, “the model decided” is not an acceptable answer. The model is very good at language, so I use it for language.</w:t>
       </w:r>
     </w:p>
     <w:p>
@@ -3377,7 +3197,7 @@
           <w:sz w:val="23"/>
           <w:szCs w:val="23"/>
         </w:rPr>
-        <w:t xml:space="preserve">Q.  How is your work different from INCOIS's Small Vessel Advisory?</w:t>
+        <w:t xml:space="preserve">Q.  Isn't this just a wrapper around some APIs? Where is the novelty?</w:t>
       </w:r>
     </w:p>
     <w:p>
@@ -3393,7 +3213,7 @@
           <w:sz w:val="22"/>
           <w:szCs w:val="22"/>
         </w:rPr>
-        <w:t xml:space="preserve">SVAS is the closest existing product and I build on it rather than compete with it. It gives a boat safety index as a colour map, in English, with unpublished thresholds, and separately from fishing zones and borders. My system takes a question in the user's language, combines safety, fishing zones and boundary warnings for one boat, place and time, and shows the source of every number. SVAS is also my calibration target — it independently uses steepness and vessel size, as I do.</w:t>
+        <w:t xml:space="preserve">The fetching is ordinary engineering. The contribution is O2 and O3: an architecture where the safety verdict is structurally outside the model, not just prompted to be; and an evidence ledger with a verifier that mechanically deletes any number the model produced that is not in it. That combination answers exactly the failure RAGTruth documents.</w:t>
       </w:r>
     </w:p>
     <w:p>
@@ -3409,7 +3229,7 @@
           <w:sz w:val="23"/>
           <w:szCs w:val="23"/>
         </w:rPr>
-        <w:t xml:space="preserve">Q.  Where does 93.9 % come from? Is that a real measurement?</w:t>
+        <w:t xml:space="preserve">Q.  How is your work different from INCOIS's Small Vessel Advisory?</w:t>
       </w:r>
     </w:p>
     <w:p>
@@ -3425,7 +3245,7 @@
           <w:sz w:val="22"/>
           <w:szCs w:val="22"/>
         </w:rPr>
-        <w:t xml:space="preserve">It is a backtest over 92 mornings at five harbours through this monsoon — 460 harbour-mornings. For each, I take the forecast available the evening before, run it through my safety engine, and compare that verdict with the verdict from the same model's final analysis. That is standard warning verification from Jolliffe and Stephenson. It regenerates with one command.</w:t>
+        <w:t xml:space="preserve">SVAS gives a boat safety index as a colour map, in English, with unpublished thresholds, separately from fishing zones and borders. I cite it as my calibration target — it independently uses wave steepness and vessel size, as I do — but my system answers a question in the user's language and combines all three needs for one boat, place and time.</w:t>
       </w:r>
     </w:p>
     <w:p>
@@ -3441,7 +3261,7 @@
           <w:sz w:val="23"/>
           <w:szCs w:val="23"/>
         </w:rPr>
-        <w:t xml:space="preserve">Q.  But you have no buoy data. So how do you know you are right?</w:t>
+        <w:t xml:space="preserve">Q.  Where does 93.9 % come from? Is that a real measurement?</w:t>
       </w:r>
     </w:p>
     <w:p>
@@ -3457,7 +3277,7 @@
           <w:sz w:val="22"/>
           <w:szCs w:val="22"/>
         </w:rPr>
-        <w:t xml:space="preserve">I do not, fully, and the synopsis says so. My truth is the model's analysis, not a physical measurement, so my figures are an upper bound. The harness is written so that with buoy observations I change the truth source and rerun. That is one of my three asks.</w:t>
+        <w:t xml:space="preserve">It is a backtest over 92 mornings at five harbours through this monsoon — 460 harbour-mornings. For each, I take the forecast available the evening before, run it through my safety engine, and compare that verdict with the verdict from the same model's final analysis. That is standard warning verification from Jolliffe and Stephenson. It regenerates with one command.</w:t>
       </w:r>
     </w:p>
     <w:p>
@@ -3473,7 +3293,7 @@
           <w:sz w:val="23"/>
           <w:szCs w:val="23"/>
         </w:rPr>
-        <w:t xml:space="preserve">Q.  This is an ISRO/INCOIS problem statement, but your primary source is Open-Meteo. Why?</w:t>
+        <w:t xml:space="preserve">Q.  But you have no buoy data. So how do you know you are right?</w:t>
       </w:r>
     </w:p>
     <w:p>
@@ -3489,7 +3309,7 @@
           <w:sz w:val="22"/>
           <w:szCs w:val="22"/>
         </w:rPr>
-        <w:t xml:space="preserve">Because INCOIS's own open data archive is largely stale — their public sea-temperature series stops in 2011 and chlorophyll in 2006. I tested all of it before writing any code. I use INCOIS for what is live and excellent: fishing-zone advisories, sector and landing-centre layers, boundary lines. Open-Meteo is the reliability floor for waves and wind. With IMD and deeper INCOIS access, Indian sources move up the fallback chain — it is built for that substitution.</w:t>
+        <w:t xml:space="preserve">I do not, fully, and the synopsis says so. My truth is the model's analysis, not a physical measurement, so my figures are an upper bound. With buoy observations I change the truth source and rerun. That is one of my three asks.</w:t>
       </w:r>
     </w:p>
     <w:p>
@@ -3505,7 +3325,7 @@
           <w:sz w:val="23"/>
           <w:szCs w:val="23"/>
         </w:rPr>
-        <w:t xml:space="preserve">Q.  Did you train a model?</w:t>
+        <w:t xml:space="preserve">Q.  This is an ISRO/INCOIS problem statement, but your primary source is Open-Meteo. Why?</w:t>
       </w:r>
     </w:p>
     <w:p>
@@ -3521,7 +3341,7 @@
           <w:sz w:val="22"/>
           <w:szCs w:val="22"/>
         </w:rPr>
-        <w:t xml:space="preserve">No, deliberately. GraphCast and Pangu-Weather are in my survey as the road not taken: training a competitive forecaster needs decades of reanalysis and compute, and would replace a product INCOIS already provides, validated and free. My contribution is reasoning over official forecasts, not replacing them.</w:t>
+        <w:t xml:space="preserve">Because INCOIS's own open data archive is largely stale — their public sea-temperature series stops in 2011. I tested all of it before writing any code. I use INCOIS for what is live and excellent: fishing-zone advisories, sector and landing-centre layers, boundary lines. Open-Meteo is the reliability floor for waves and wind. With IMD and deeper INCOIS access, Indian sources move up the fallback chain — it is built for that substitution.</w:t>
       </w:r>
     </w:p>
     <w:p>
@@ -3537,7 +3357,7 @@
           <w:sz w:val="23"/>
           <w:szCs w:val="23"/>
         </w:rPr>
-        <w:t xml:space="preserve">Q.  What if the translation is wrong in Tamil?</w:t>
+        <w:t xml:space="preserve">Q.  Did you train a model?</w:t>
       </w:r>
     </w:p>
     <w:p>
@@ -3553,7 +3373,7 @@
           <w:sz w:val="22"/>
           <w:szCs w:val="22"/>
         </w:rPr>
-        <w:t xml:space="preserve">The verdict is computed before any translation, so translation cannot change it. And the verifier checks numbers in both Latin and Indic digits, so a fabricated figure is caught in Tamil too. The remaining risk is tone, which is why the target path is Bhashini, the government service — Phase 5, waiting on keys.</w:t>
+        <w:t xml:space="preserve">No, deliberately. Sarangi et al. show what producing a validated fishing-zone product takes — six satellite parameters and years of catch validation. INCOIS already does that and publishes it free; the same is true of its forecasts. My contribution is reasoning over official products, not replacing them. And a model trained on question-answer pairs would memorise answers that go stale, because the sea changes every day.</w:t>
       </w:r>
     </w:p>
     <w:p>
@@ -3569,7 +3389,7 @@
           <w:sz w:val="23"/>
           <w:szCs w:val="23"/>
         </w:rPr>
-        <w:t xml:space="preserve">Q.  Have you validated your safety thresholds?</w:t>
+        <w:t xml:space="preserve">Q.  What if the translation is wrong in Tamil?</w:t>
       </w:r>
     </w:p>
     <w:p>
@@ -3585,7 +3405,7 @@
           <w:sz w:val="22"/>
           <w:szCs w:val="22"/>
         </w:rPr>
-        <w:t xml:space="preserve">Not yet, and I say so in the report and in the code. They are sensible starting values. INCOIS's Boat Safety Index is the right calibration target, but its numeric criteria are not published. Getting them is one of my asks.</w:t>
+        <w:t xml:space="preserve">The verdict is computed before any translation, so translation cannot change it. And the verifier checks numbers in both Latin and Indic digits, so a fabricated figure is caught in Tamil too. The remaining risk is tone, which is why the target path is Bhashini, the government service, with IndicTrans2 as backup — Phase 5, waiting on keys.</w:t>
       </w:r>
     </w:p>
     <w:p>
@@ -3601,7 +3421,7 @@
           <w:sz w:val="23"/>
           <w:szCs w:val="23"/>
         </w:rPr>
-        <w:t xml:space="preserve">Q.  What happens when there is no internet at sea?</w:t>
+        <w:t xml:space="preserve">Q.  Have you validated your safety thresholds?</w:t>
       </w:r>
     </w:p>
     <w:p>
@@ -3617,7 +3437,7 @@
           <w:sz w:val="22"/>
           <w:szCs w:val="22"/>
         </w:rPr>
-        <w:t xml:space="preserve">Four-step fallback: fresh cache, live fetch with a two-second budget, stale cache, then a frozen snapshot committed in the repository. It always gives a complete answer, always says which source answered, and lowers its stated confidence.</w:t>
+        <w:t xml:space="preserve">Not yet, and I say so in the report and in the code. They are sensible starting values. INCOIS's Boat Safety Index is the right calibration target, but its numeric criteria are not published. Getting them is one of my asks.</w:t>
       </w:r>
     </w:p>
     <w:p>
@@ -3633,7 +3453,7 @@
           <w:sz w:val="23"/>
           <w:szCs w:val="23"/>
         </w:rPr>
-        <w:t xml:space="preserve">Q.  Will you finish it?</w:t>
+        <w:t xml:space="preserve">Q.  What happens when there is no internet at sea?</w:t>
       </w:r>
     </w:p>
     <w:p>
@@ -3649,7 +3469,7 @@
           <w:sz w:val="22"/>
           <w:szCs w:val="22"/>
         </w:rPr>
-        <w:t xml:space="preserve">Four of six phases are done and it works end to end today. What remains is the official translation path, optional features and hardening. The real risk is the three access blockers, which is why I am raising them now.</w:t>
+        <w:t xml:space="preserve">Four-step fallback: fresh cache, live fetch with a two-second budget, stale cache, then a frozen snapshot committed in the repository. It always gives a complete answer, always says which source answered, and lowers its stated confidence. Thoondil's offline maps show the same constraint is real.</w:t>
       </w:r>
     </w:p>
     <w:p>
@@ -3678,7 +3498,7 @@
           <w:sz w:val="22"/>
           <w:szCs w:val="22"/>
         </w:rPr>
-        <w:t xml:space="preserve">Raise these at the end of slide 10, in this order. The first is the one that matters.</w:t>
+        <w:t xml:space="preserve">Raise these at the end of slide 9, in this order. The first is the one that matters.</w:t>
       </w:r>
     </w:p>
     <w:tbl>
@@ -4286,7 +4106,7 @@
                 <w:sz w:val="19"/>
                 <w:szCs w:val="19"/>
               </w:rPr>
-              <w:t xml:space="preserve">Eleven subsections plus the comparison table (2.11). — 10 marks</w:t>
+              <w:t xml:space="preserve">Eight studies in seven subsections, each ending in its limitation for this problem; comparison table in 2.8. — 10 marks</w:t>
             </w:r>
           </w:p>
         </w:tc>
@@ -4343,7 +4163,7 @@
                 <w:sz w:val="19"/>
                 <w:szCs w:val="19"/>
               </w:rPr>
-              <w:t xml:space="preserve">One bold sentence, then gaps G1–G6, each mapped to an objective. — 5 marks</w:t>
+              <w:t xml:space="preserve">One bold sentence, then gaps G1–G6 with evidence, mapped to objectives. — 5 marks</w:t>
             </w:r>
           </w:p>
         </w:tc>
@@ -4571,7 +4391,7 @@
                 <w:sz w:val="19"/>
                 <w:szCs w:val="19"/>
               </w:rPr>
-              <w:t xml:space="preserve">Fifteen, each checked against the publisher record.</w:t>
+              <w:t xml:space="preserve">Eight reviewed studies plus two methodology references, each checked against its DOI record.</w:t>
             </w:r>
           </w:p>
         </w:tc>
@@ -5259,7 +5079,7 @@
                 <w:sz w:val="21"/>
                 <w:szCs w:val="21"/>
               </w:rPr>
-              <w:t xml:space="preserve">PFZ sectors</w:t>
+              <w:t xml:space="preserve">Studies reviewed</w:t>
             </w:r>
           </w:p>
         </w:tc>
@@ -5285,7 +5105,7 @@
                 <w:sz w:val="22"/>
                 <w:szCs w:val="22"/>
               </w:rPr>
-              <w:t xml:space="preserve">14</w:t>
+              <w:t xml:space="preserve">8 (of ~20 surveyed), half from 2023 or later</w:t>
             </w:r>
           </w:p>
         </w:tc>
@@ -5342,7 +5162,7 @@
                 <w:sz w:val="22"/>
                 <w:szCs w:val="22"/>
               </w:rPr>
-              <w:t xml:space="preserve">15, all verified</w:t>
+              <w:t xml:space="preserve">10 (8 literature + 2 methodology), all DOI-checked</w:t>
             </w:r>
           </w:p>
         </w:tc>

</xml_diff>

<commit_message>
docs: show counts and intervals behind the non-monotonic hit rate
Hit rates of 93.9 / 97.0 / 90.9 % at 1/2/3-day leads are 31, 32 and 30 of
only 33 dangerous mornings; Wilson 95% intervals overlap almost entirely.
The 2-day "rise" is one morning, bought with 6 extra false alarms. CSI
falls monotonically (91.2 -> 80.0 -> 65.2 %).

Numbers unchanged. Synopsis section 5 and slide 9 now show warned-of-33,
false-alarm counts and intervals beside the percentages, with a short
explanation; the script adds a slide 9 line and a prepared Q&A answer.

Co-Authored-By: Claude Opus 5.5 <noreply@anthropic.com>
</commit_message>
<xml_diff>
--- a/docs/Sagar_Setu_Presentation_Script.docx
+++ b/docs/Sagar_Setu_Presentation_Script.docx
@@ -2254,6 +2254,51 @@
           <w:szCs w:val="23"/>
         </w:rPr>
         <w:t xml:space="preserve"> It fails toward safety.</w:t>
+      </w:r>
+    </w:p>
+    <w:p>
+      <w:pPr>
+        <w:spacing w:after="140" w:line="300"/>
+      </w:pPr>
+      <w:r>
+        <w:rPr>
+          <w:rFonts w:ascii="Calibri" w:cs="Calibri" w:eastAsia="Calibri" w:hAnsi="Calibri"/>
+          <w:b w:val="false"/>
+          <w:bCs w:val="false"/>
+          <w:sz w:val="23"/>
+          <w:szCs w:val="23"/>
+        </w:rPr>
+        <w:t xml:space="preserve">In the table below, the hit rate looks like it rises at two days and falls at three. </w:t>
+      </w:r>
+      <w:r>
+        <w:rPr>
+          <w:rFonts w:ascii="Calibri" w:cs="Calibri" w:eastAsia="Calibri" w:hAnsi="Calibri"/>
+          <w:b/>
+          <w:bCs/>
+          <w:sz w:val="23"/>
+          <w:szCs w:val="23"/>
+        </w:rPr>
+        <w:t xml:space="preserve">It doesn't really move: there were only 33 dangerous mornings, so one morning is about three points.</w:t>
+      </w:r>
+      <w:r>
+        <w:rPr>
+          <w:rFonts w:ascii="Calibri" w:cs="Calibri" w:eastAsia="Calibri" w:hAnsi="Calibri"/>
+          <w:b w:val="false"/>
+          <w:bCs w:val="false"/>
+          <w:sz w:val="23"/>
+          <w:szCs w:val="23"/>
+        </w:rPr>
+        <w:t xml:space="preserve"> The two-day forecast caught one extra morning because it warned more often — seven false alarms instead of one. </w:t>
+      </w:r>
+      <w:r>
+        <w:rPr>
+          <w:rFonts w:ascii="Calibri" w:cs="Calibri" w:eastAsia="Calibri" w:hAnsi="Calibri"/>
+          <w:b/>
+          <w:bCs/>
+          <w:sz w:val="23"/>
+          <w:szCs w:val="23"/>
+        </w:rPr>
+        <w:t xml:space="preserve">The real trend is CSI: 91, then 80, then 65 percent.</w:t>
       </w:r>
     </w:p>
     <w:p>
@@ -3278,6 +3323,38 @@
           <w:szCs w:val="22"/>
         </w:rPr>
         <w:t xml:space="preserve">It is a backtest over 92 mornings at five harbours through this monsoon — 460 harbour-mornings. For each, I take the forecast available the evening before, run it through my safety engine, and compare that verdict with the verdict from the same model's final analysis. That is standard warning verification from Jolliffe and Stephenson. It regenerates with one command.</w:t>
+      </w:r>
+    </w:p>
+    <w:p>
+      <w:pPr>
+        <w:spacing w:after="70" w:before="200"/>
+      </w:pPr>
+      <w:r>
+        <w:rPr>
+          <w:rFonts w:ascii="Calibri" w:cs="Calibri" w:eastAsia="Calibri" w:hAnsi="Calibri"/>
+          <w:b/>
+          <w:bCs/>
+          <w:color w:val="1F3864"/>
+          <w:sz w:val="23"/>
+          <w:szCs w:val="23"/>
+        </w:rPr>
+        <w:t xml:space="preserve">Q.  Why does the hit rate go up at two days and then down at three? Shouldn't it fall steadily?</w:t>
+      </w:r>
+    </w:p>
+    <w:p>
+      <w:pPr>
+        <w:spacing w:after="110" w:line="288"/>
+        <w:ind w:left="290"/>
+      </w:pPr>
+      <w:r>
+        <w:rPr>
+          <w:rFonts w:ascii="Calibri" w:cs="Calibri" w:eastAsia="Calibri" w:hAnsi="Calibri"/>
+          <w:b w:val="false"/>
+          <w:bCs w:val="false"/>
+          <w:sz w:val="22"/>
+          <w:szCs w:val="22"/>
+        </w:rPr>
+        <w:t xml:space="preserve">It looks odd, but it is the sample size. Only 33 of the 460 mornings were dangerous, so the hit rates are 31, 32 and 30 out of 33 — the 2-day “rise” is one morning. The 95 % confidence intervals are roughly 80–98, 85–99 and 76–97 percent, so they overlap almost completely; statistically the hit rate is flat. The 2-day forecast caught that one extra morning by warning more often: 39 warnings instead of 32, and false alarms went from 1 to 7. Hit rate on its own rewards over-warning — if we said “do not sail” every day we would score 100 %. That is why warning systems are scored with FAR and CSI as well. CSI, which counts both misses and false alarms, falls steadily: 91, 80, 65 percent — exactly what you expect as forecast error grows with lead time. A full-year backtest would give more dangerous mornings and narrower intervals; that is planned.</w:t>
       </w:r>
     </w:p>
     <w:p>

</xml_diff>